<commit_message>
Donnovan Joel Creano Rodriguez Aport/Part
Creano´s aport to the third team work
</commit_message>
<xml_diff>
--- a/Compuertas_ThirdTeam.docx
+++ b/Compuertas_ThirdTeam.docx
@@ -1,6 +1,6 @@
 
 <file path=word/document.xml><?xml version="1.0" encoding="utf-8"?>
-<w:document xmlns:wpc="http://schemas.microsoft.com/office/word/2010/wordprocessingCanvas" xmlns:cx="http://schemas.microsoft.com/office/drawing/2014/chartex" xmlns:cx1="http://schemas.microsoft.com/office/drawing/2015/9/8/chartex" xmlns:cx2="http://schemas.microsoft.com/office/drawing/2015/10/21/chartex" xmlns:cx3="http://schemas.microsoft.com/office/drawing/2016/5/9/chartex" xmlns:cx4="http://schemas.microsoft.com/office/drawing/2016/5/10/chartex" xmlns:cx5="http://schemas.microsoft.com/office/drawing/2016/5/11/chartex" xmlns:cx6="http://schemas.microsoft.com/office/drawing/2016/5/12/chartex" xmlns:cx7="http://schemas.microsoft.com/office/drawing/2016/5/13/chartex" xmlns:cx8="http://schemas.microsoft.com/office/drawing/2016/5/14/chartex" xmlns:mc="http://schemas.openxmlformats.org/markup-compatibility/2006" xmlns:aink="http://schemas.microsoft.com/office/drawing/2016/ink" xmlns:am3d="http://schemas.microsoft.com/office/drawing/2017/model3d" xmlns:o="urn:schemas-microsoft-com:office:office" xmlns:oel="http://schemas.microsoft.com/office/2019/extlst" xmlns:r="http://schemas.openxmlformats.org/officeDocument/2006/relationships" xmlns:m="http://schemas.openxmlformats.org/officeDocument/2006/math" xmlns:v="urn:schemas-microsoft-com:vml" xmlns:wp14="http://schemas.microsoft.com/office/word/2010/wordprocessingDrawing" xmlns:wp="http://schemas.openxmlformats.org/drawingml/2006/wordprocessingDrawing" xmlns:w10="urn:schemas-microsoft-com:office:word" xmlns:w="http://schemas.openxmlformats.org/wordprocessingml/2006/main" xmlns:w14="http://schemas.microsoft.com/office/word/2010/wordml" xmlns:w15="http://schemas.microsoft.com/office/word/2012/wordml" xmlns:w16cex="http://schemas.microsoft.com/office/word/2018/wordml/cex" xmlns:w16cid="http://schemas.microsoft.com/office/word/2016/wordml/cid" xmlns:w16="http://schemas.microsoft.com/office/word/2018/wordml" xmlns:w16du="http://schemas.microsoft.com/office/word/2023/wordml/word16du" xmlns:w16sdtdh="http://schemas.microsoft.com/office/word/2020/wordml/sdtdatahash" xmlns:w16se="http://schemas.microsoft.com/office/word/2015/wordml/symex" xmlns:wpg="http://schemas.microsoft.com/office/word/2010/wordprocessingGroup" xmlns:wpi="http://schemas.microsoft.com/office/word/2010/wordprocessingInk" xmlns:wne="http://schemas.microsoft.com/office/word/2006/wordml" xmlns:wps="http://schemas.microsoft.com/office/word/2010/wordprocessingShape" mc:Ignorable="w14 w15 w16se w16cid w16 w16cex w16sdtdh w16du wp14">
+<w:document xmlns:wpc="http://schemas.microsoft.com/office/word/2010/wordprocessingCanvas" xmlns:cx="http://schemas.microsoft.com/office/drawing/2014/chartex" xmlns:cx1="http://schemas.microsoft.com/office/drawing/2015/9/8/chartex" xmlns:cx2="http://schemas.microsoft.com/office/drawing/2015/10/21/chartex" xmlns:cx3="http://schemas.microsoft.com/office/drawing/2016/5/9/chartex" xmlns:cx4="http://schemas.microsoft.com/office/drawing/2016/5/10/chartex" xmlns:cx5="http://schemas.microsoft.com/office/drawing/2016/5/11/chartex" xmlns:cx6="http://schemas.microsoft.com/office/drawing/2016/5/12/chartex" xmlns:cx7="http://schemas.microsoft.com/office/drawing/2016/5/13/chartex" xmlns:cx8="http://schemas.microsoft.com/office/drawing/2016/5/14/chartex" xmlns:mc="http://schemas.openxmlformats.org/markup-compatibility/2006" xmlns:aink="http://schemas.microsoft.com/office/drawing/2016/ink" xmlns:am3d="http://schemas.microsoft.com/office/drawing/2017/model3d" xmlns:o="urn:schemas-microsoft-com:office:office" xmlns:r="http://schemas.openxmlformats.org/officeDocument/2006/relationships" xmlns:m="http://schemas.openxmlformats.org/officeDocument/2006/math" xmlns:v="urn:schemas-microsoft-com:vml" xmlns:wp14="http://schemas.microsoft.com/office/word/2010/wordprocessingDrawing" xmlns:wp="http://schemas.openxmlformats.org/drawingml/2006/wordprocessingDrawing" xmlns:w10="urn:schemas-microsoft-com:office:word" xmlns:w="http://schemas.openxmlformats.org/wordprocessingml/2006/main" xmlns:w14="http://schemas.microsoft.com/office/word/2010/wordml" xmlns:w15="http://schemas.microsoft.com/office/word/2012/wordml" xmlns:w16cex="http://schemas.microsoft.com/office/word/2018/wordml/cex" xmlns:w16cid="http://schemas.microsoft.com/office/word/2016/wordml/cid" xmlns:w16="http://schemas.microsoft.com/office/word/2018/wordml" xmlns:w16sdtdh="http://schemas.microsoft.com/office/word/2020/wordml/sdtdatahash" xmlns:w16se="http://schemas.microsoft.com/office/word/2015/wordml/symex" xmlns:wpg="http://schemas.microsoft.com/office/word/2010/wordprocessingGroup" xmlns:wpi="http://schemas.microsoft.com/office/word/2010/wordprocessingInk" xmlns:wne="http://schemas.microsoft.com/office/word/2006/wordml" xmlns:wps="http://schemas.microsoft.com/office/word/2010/wordprocessingShape" mc:Ignorable="w14 w15 w16se w16cid w16 w16cex w16sdtdh wp14">
   <w:body>
     <w:p>
       <w:pPr>
@@ -83,20 +83,8 @@
           <w:sz w:val="27"/>
           <w:szCs w:val="27"/>
         </w:rPr>
-        <w:t>September 19th</w:t>
-      </w:r>
-      <w:proofErr w:type="gramStart"/>
-      <w:r>
-        <w:rPr>
-          <w:b/>
-          <w:i/>
-          <w:color w:val="585858"/>
-          <w:sz w:val="27"/>
-          <w:szCs w:val="27"/>
-        </w:rPr>
-        <w:t xml:space="preserve"> 2025</w:t>
-      </w:r>
-      <w:proofErr w:type="gramEnd"/>
+        <w:t>September 19th 2025</w:t>
+      </w:r>
     </w:p>
     <w:p>
       <w:pPr>
@@ -594,6 +582,7 @@
           <w:lang w:val="es-MX"/>
         </w:rPr>
         <w:tab/>
+        <w:t xml:space="preserve">Creano </w:t>
       </w:r>
       <w:proofErr w:type="spellStart"/>
       <w:r>
@@ -603,7 +592,7 @@
           <w:szCs w:val="24"/>
           <w:lang w:val="es-MX"/>
         </w:rPr>
-        <w:t>Creano</w:t>
+        <w:t>Rodriguez</w:t>
       </w:r>
       <w:proofErr w:type="spellEnd"/>
       <w:r>
@@ -623,7 +612,7 @@
           <w:szCs w:val="24"/>
           <w:lang w:val="es-MX"/>
         </w:rPr>
-        <w:t>Rodriguez</w:t>
+        <w:t>Donnovan</w:t>
       </w:r>
       <w:proofErr w:type="spellEnd"/>
       <w:r>
@@ -633,19 +622,20 @@
           <w:szCs w:val="24"/>
           <w:lang w:val="es-MX"/>
         </w:rPr>
-        <w:t xml:space="preserve"> </w:t>
-      </w:r>
-      <w:proofErr w:type="spellStart"/>
-      <w:r>
+        <w:t xml:space="preserve"> Joel</w:t>
+      </w:r>
+    </w:p>
+    <w:p>
+      <w:pPr>
+        <w:pStyle w:val="normal1"/>
+        <w:spacing w:before="188"/>
         <w:rPr>
           <w:b/>
           <w:sz w:val="24"/>
           <w:szCs w:val="24"/>
           <w:lang w:val="es-MX"/>
         </w:rPr>
-        <w:t>Donnovan</w:t>
-      </w:r>
-      <w:proofErr w:type="spellEnd"/>
+      </w:pPr>
       <w:r>
         <w:rPr>
           <w:b/>
@@ -653,20 +643,17 @@
           <w:szCs w:val="24"/>
           <w:lang w:val="es-MX"/>
         </w:rPr>
-        <w:t xml:space="preserve"> Joel</w:t>
-      </w:r>
-    </w:p>
-    <w:p>
-      <w:pPr>
-        <w:pStyle w:val="normal1"/>
-        <w:spacing w:before="188"/>
+        <w:tab/>
+      </w:r>
+      <w:r>
         <w:rPr>
           <w:b/>
           <w:sz w:val="24"/>
           <w:szCs w:val="24"/>
           <w:lang w:val="es-MX"/>
         </w:rPr>
-      </w:pPr>
+        <w:tab/>
+      </w:r>
       <w:r>
         <w:rPr>
           <w:b/>
@@ -675,6 +662,7 @@
           <w:lang w:val="es-MX"/>
         </w:rPr>
         <w:tab/>
+        <w:t xml:space="preserve">Duran Tapia Diego </w:t>
       </w:r>
       <w:r>
         <w:rPr>
@@ -683,17 +671,7 @@
           <w:szCs w:val="24"/>
           <w:lang w:val="es-MX"/>
         </w:rPr>
-        <w:tab/>
-      </w:r>
-      <w:r>
-        <w:rPr>
-          <w:b/>
-          <w:sz w:val="24"/>
-          <w:szCs w:val="24"/>
-          <w:lang w:val="es-MX"/>
-        </w:rPr>
-        <w:tab/>
-        <w:t>Duran Tapia Diego Alejandro</w:t>
+        <w:t>Alejandro</w:t>
       </w:r>
     </w:p>
     <w:p>
@@ -909,7 +887,14 @@
           <w:sz w:val="24"/>
           <w:szCs w:val="24"/>
         </w:rPr>
-        <w:t>Our team did a practice where we used programming logic to solve a problem where we need to create an algorithm that allows the user to enter two numeric values and display the truth table or logic gate. This code is only intended to only insert 0 and 1.</w:t>
+        <w:t xml:space="preserve">Our team did a practice where we used programming logic to solve a problem where we need to create an </w:t>
+      </w:r>
+      <w:r>
+        <w:rPr>
+          <w:sz w:val="24"/>
+          <w:szCs w:val="24"/>
+        </w:rPr>
+        <w:t>algorithm that allows the user to enter two numeric values and display the truth table or logic gate. This code is only intended to only insert 0 and 1.</w:t>
       </w:r>
     </w:p>
     <w:p>
@@ -1070,23 +1055,14 @@
           <w:sz w:val="24"/>
           <w:szCs w:val="24"/>
         </w:rPr>
-        <w:t xml:space="preserve">For this part of the </w:t>
-      </w:r>
-      <w:proofErr w:type="gramStart"/>
-      <w:r>
-        <w:rPr>
-          <w:sz w:val="24"/>
-          <w:szCs w:val="24"/>
-        </w:rPr>
-        <w:t>development</w:t>
-      </w:r>
-      <w:proofErr w:type="gramEnd"/>
-      <w:r>
-        <w:rPr>
-          <w:sz w:val="24"/>
-          <w:szCs w:val="24"/>
-        </w:rPr>
-        <w:t xml:space="preserve"> we create an algorithm that allows the user insert two numeric values and shows its logic gate, this depends on the users decision, if the option is 1, will shows the OR logic gate, if is 2, will shows the AND logic gate, and if it is 3, will shows the XOR logic gate.</w:t>
+        <w:t>For this part of the development we create an algorithm that allows the user insert two numeric values and shows its logic gate, this depends on the users decision, if the option is 1, will shows the OR logic gate, if is 2, will shows the AND logic gate, a</w:t>
+      </w:r>
+      <w:r>
+        <w:rPr>
+          <w:sz w:val="24"/>
+          <w:szCs w:val="24"/>
+        </w:rPr>
+        <w:t>nd if it is 3, will shows the XOR logic gate.</w:t>
       </w:r>
     </w:p>
     <w:p>
@@ -1457,17 +1433,8 @@
           <w:sz w:val="24"/>
           <w:szCs w:val="24"/>
         </w:rPr>
-        <w:t xml:space="preserve">In the terminal of the IDE, we can see the result, where shows the logic gate of the users </w:t>
-      </w:r>
-      <w:proofErr w:type="gramStart"/>
-      <w:r>
-        <w:rPr>
-          <w:sz w:val="24"/>
-          <w:szCs w:val="24"/>
-        </w:rPr>
-        <w:t>option</w:t>
-      </w:r>
-      <w:proofErr w:type="gramEnd"/>
+        <w:t>In the terminal of the IDE, we can see the result, where shows the logic gate of the users option</w:t>
+      </w:r>
     </w:p>
     <w:p>
       <w:pPr>
@@ -2264,23 +2231,14 @@
           <w:sz w:val="24"/>
           <w:szCs w:val="24"/>
         </w:rPr>
-        <w:t xml:space="preserve">In this </w:t>
-      </w:r>
-      <w:proofErr w:type="gramStart"/>
-      <w:r>
-        <w:rPr>
-          <w:sz w:val="24"/>
-          <w:szCs w:val="24"/>
-        </w:rPr>
-        <w:t>team work</w:t>
-      </w:r>
-      <w:proofErr w:type="gramEnd"/>
-      <w:r>
-        <w:rPr>
-          <w:sz w:val="24"/>
-          <w:szCs w:val="24"/>
-        </w:rPr>
-        <w:t>, we didn't have any problem with the development, we helped each other with the logic and we finished the program so fast.</w:t>
+        <w:t xml:space="preserve">In this team work, we didn't have any problem with the development, we </w:t>
+      </w:r>
+      <w:r>
+        <w:rPr>
+          <w:sz w:val="24"/>
+          <w:szCs w:val="24"/>
+        </w:rPr>
+        <w:t>helped each other with the logic and we finished the program so fast.</w:t>
       </w:r>
     </w:p>
     <w:p>
@@ -2337,6 +2295,125 @@
         </w:rPr>
         <w:t xml:space="preserve">Donnovan´s Conclusion: </w:t>
       </w:r>
+      <w:r>
+        <w:rPr>
+          <w:sz w:val="24"/>
+          <w:szCs w:val="24"/>
+        </w:rPr>
+        <w:t xml:space="preserve">This </w:t>
+      </w:r>
+      <w:proofErr w:type="spellStart"/>
+      <w:r>
+        <w:rPr>
+          <w:sz w:val="24"/>
+          <w:szCs w:val="24"/>
+        </w:rPr>
+        <w:t>activity,in</w:t>
+      </w:r>
+      <w:proofErr w:type="spellEnd"/>
+      <w:r>
+        <w:rPr>
+          <w:sz w:val="24"/>
+          <w:szCs w:val="24"/>
+        </w:rPr>
+        <w:t xml:space="preserve"> the first part was so confusing, but so interesting at the same time, </w:t>
+      </w:r>
+      <w:proofErr w:type="spellStart"/>
+      <w:r>
+        <w:rPr>
+          <w:sz w:val="24"/>
+          <w:szCs w:val="24"/>
+        </w:rPr>
+        <w:t>i</w:t>
+      </w:r>
+      <w:proofErr w:type="spellEnd"/>
+      <w:r>
+        <w:rPr>
+          <w:sz w:val="24"/>
+          <w:szCs w:val="24"/>
+        </w:rPr>
+        <w:t xml:space="preserve"> already used to use the C programming </w:t>
+      </w:r>
+      <w:proofErr w:type="spellStart"/>
+      <w:r>
+        <w:rPr>
+          <w:sz w:val="24"/>
+          <w:szCs w:val="24"/>
+        </w:rPr>
+        <w:t>lenguaje</w:t>
+      </w:r>
+      <w:proofErr w:type="spellEnd"/>
+      <w:r>
+        <w:rPr>
+          <w:sz w:val="24"/>
+          <w:szCs w:val="24"/>
+        </w:rPr>
+        <w:t xml:space="preserve">, in this teamwork </w:t>
+      </w:r>
+      <w:proofErr w:type="spellStart"/>
+      <w:r>
+        <w:rPr>
+          <w:sz w:val="24"/>
+          <w:szCs w:val="24"/>
+        </w:rPr>
+        <w:t>i</w:t>
+      </w:r>
+      <w:proofErr w:type="spellEnd"/>
+      <w:r>
+        <w:rPr>
+          <w:sz w:val="24"/>
+          <w:szCs w:val="24"/>
+        </w:rPr>
+        <w:t xml:space="preserve"> felt lost but with my effort </w:t>
+      </w:r>
+      <w:proofErr w:type="spellStart"/>
+      <w:r>
+        <w:rPr>
+          <w:sz w:val="24"/>
+          <w:szCs w:val="24"/>
+        </w:rPr>
+        <w:t>i</w:t>
+      </w:r>
+      <w:proofErr w:type="spellEnd"/>
+      <w:r>
+        <w:rPr>
+          <w:sz w:val="24"/>
+          <w:szCs w:val="24"/>
+        </w:rPr>
+        <w:t xml:space="preserve"> did the best to understand this code but </w:t>
+      </w:r>
+      <w:proofErr w:type="spellStart"/>
+      <w:r>
+        <w:rPr>
+          <w:sz w:val="24"/>
+          <w:szCs w:val="24"/>
+        </w:rPr>
+        <w:t>throghthout</w:t>
+      </w:r>
+      <w:proofErr w:type="spellEnd"/>
+      <w:r>
+        <w:rPr>
+          <w:sz w:val="24"/>
+          <w:szCs w:val="24"/>
+        </w:rPr>
+        <w:t xml:space="preserve"> the time </w:t>
+      </w:r>
+      <w:proofErr w:type="spellStart"/>
+      <w:r>
+        <w:rPr>
+          <w:sz w:val="24"/>
+          <w:szCs w:val="24"/>
+        </w:rPr>
+        <w:t>i</w:t>
+      </w:r>
+      <w:proofErr w:type="spellEnd"/>
+      <w:r>
+        <w:rPr>
+          <w:sz w:val="24"/>
+          <w:szCs w:val="24"/>
+        </w:rPr>
+        <w:t xml:space="preserve"> Will be fastest than now.</w:t>
+      </w:r>
     </w:p>
     <w:p>
       <w:pPr>
@@ -2427,7 +2504,15 @@
           <w:sz w:val="24"/>
           <w:szCs w:val="24"/>
         </w:rPr>
-        <w:t xml:space="preserve">Angel´s Conclusion: </w:t>
+        <w:lastRenderedPageBreak/>
+        <w:t>Angel´s Conclusion</w:t>
+      </w:r>
+      <w:r>
+        <w:rPr>
+          <w:sz w:val="24"/>
+          <w:szCs w:val="24"/>
+        </w:rPr>
+        <w:t xml:space="preserve">: </w:t>
       </w:r>
       <w:bookmarkStart w:id="0" w:name="docs-internal-guid-5b4097fd-7fff-2fc9-aa"/>
       <w:bookmarkEnd w:id="0"/>
@@ -2498,9 +2583,9 @@
           <w:sz w:val="24"/>
           <w:szCs w:val="24"/>
         </w:rPr>
-        <w:t xml:space="preserve"> </w:t>
-      </w:r>
-      <w:proofErr w:type="gramStart"/>
+        <w:t xml:space="preserve"> can to learn about </w:t>
+      </w:r>
+      <w:proofErr w:type="spellStart"/>
       <w:r>
         <w:rPr>
           <w:rFonts w:ascii="Calibri;sans-serif" w:hAnsi="Calibri;sans-serif"/>
@@ -2508,9 +2593,9 @@
           <w:sz w:val="24"/>
           <w:szCs w:val="24"/>
         </w:rPr>
-        <w:t>can to</w:t>
-      </w:r>
-      <w:proofErr w:type="gramEnd"/>
+        <w:t>arduino</w:t>
+      </w:r>
+      <w:proofErr w:type="spellEnd"/>
       <w:r>
         <w:rPr>
           <w:rFonts w:ascii="Calibri;sans-serif" w:hAnsi="Calibri;sans-serif"/>
@@ -2518,7 +2603,7 @@
           <w:sz w:val="24"/>
           <w:szCs w:val="24"/>
         </w:rPr>
-        <w:t xml:space="preserve"> learn about </w:t>
+        <w:t xml:space="preserve"> programming, </w:t>
       </w:r>
       <w:proofErr w:type="spellStart"/>
       <w:r>
@@ -2528,7 +2613,7 @@
           <w:sz w:val="24"/>
           <w:szCs w:val="24"/>
         </w:rPr>
-        <w:t>arduino</w:t>
+        <w:t>i</w:t>
       </w:r>
       <w:proofErr w:type="spellEnd"/>
       <w:r>
@@ -2538,37 +2623,7 @@
           <w:sz w:val="24"/>
           <w:szCs w:val="24"/>
         </w:rPr>
-        <w:t xml:space="preserve"> programming, </w:t>
-      </w:r>
-      <w:proofErr w:type="spellStart"/>
-      <w:r>
-        <w:rPr>
-          <w:rFonts w:ascii="Calibri;sans-serif" w:hAnsi="Calibri;sans-serif"/>
-          <w:color w:val="000000"/>
-          <w:sz w:val="24"/>
-          <w:szCs w:val="24"/>
-        </w:rPr>
-        <w:t>i</w:t>
-      </w:r>
-      <w:proofErr w:type="spellEnd"/>
-      <w:r>
-        <w:rPr>
-          <w:rFonts w:ascii="Calibri;sans-serif" w:hAnsi="Calibri;sans-serif"/>
-          <w:color w:val="000000"/>
-          <w:sz w:val="24"/>
-          <w:szCs w:val="24"/>
-        </w:rPr>
-        <w:t xml:space="preserve"> hope so, but the </w:t>
-      </w:r>
-      <w:r>
-        <w:rPr>
-          <w:rFonts w:ascii="Calibri;sans-serif" w:hAnsi="Calibri;sans-serif"/>
-          <w:color w:val="000000"/>
-          <w:sz w:val="24"/>
-          <w:szCs w:val="24"/>
-        </w:rPr>
-        <w:lastRenderedPageBreak/>
-        <w:t xml:space="preserve">experience was good, </w:t>
+        <w:t xml:space="preserve"> hope so, but the experience was good, </w:t>
       </w:r>
       <w:proofErr w:type="spellStart"/>
       <w:r>
@@ -2851,7 +2906,7 @@
 </file>
 
 <file path=word/endnotes.xml><?xml version="1.0" encoding="utf-8"?>
-<w:endnotes xmlns:wpc="http://schemas.microsoft.com/office/word/2010/wordprocessingCanvas" xmlns:cx="http://schemas.microsoft.com/office/drawing/2014/chartex" xmlns:cx1="http://schemas.microsoft.com/office/drawing/2015/9/8/chartex" xmlns:cx2="http://schemas.microsoft.com/office/drawing/2015/10/21/chartex" xmlns:cx3="http://schemas.microsoft.com/office/drawing/2016/5/9/chartex" xmlns:cx4="http://schemas.microsoft.com/office/drawing/2016/5/10/chartex" xmlns:cx5="http://schemas.microsoft.com/office/drawing/2016/5/11/chartex" xmlns:cx6="http://schemas.microsoft.com/office/drawing/2016/5/12/chartex" xmlns:cx7="http://schemas.microsoft.com/office/drawing/2016/5/13/chartex" xmlns:cx8="http://schemas.microsoft.com/office/drawing/2016/5/14/chartex" xmlns:mc="http://schemas.openxmlformats.org/markup-compatibility/2006" xmlns:aink="http://schemas.microsoft.com/office/drawing/2016/ink" xmlns:am3d="http://schemas.microsoft.com/office/drawing/2017/model3d" xmlns:o="urn:schemas-microsoft-com:office:office" xmlns:oel="http://schemas.microsoft.com/office/2019/extlst" xmlns:r="http://schemas.openxmlformats.org/officeDocument/2006/relationships" xmlns:m="http://schemas.openxmlformats.org/officeDocument/2006/math" xmlns:v="urn:schemas-microsoft-com:vml" xmlns:wp14="http://schemas.microsoft.com/office/word/2010/wordprocessingDrawing" xmlns:wp="http://schemas.openxmlformats.org/drawingml/2006/wordprocessingDrawing" xmlns:w10="urn:schemas-microsoft-com:office:word" xmlns:w="http://schemas.openxmlformats.org/wordprocessingml/2006/main" xmlns:w14="http://schemas.microsoft.com/office/word/2010/wordml" xmlns:w15="http://schemas.microsoft.com/office/word/2012/wordml" xmlns:w16cex="http://schemas.microsoft.com/office/word/2018/wordml/cex" xmlns:w16cid="http://schemas.microsoft.com/office/word/2016/wordml/cid" xmlns:w16="http://schemas.microsoft.com/office/word/2018/wordml" xmlns:w16du="http://schemas.microsoft.com/office/word/2023/wordml/word16du" xmlns:w16sdtdh="http://schemas.microsoft.com/office/word/2020/wordml/sdtdatahash" xmlns:w16se="http://schemas.microsoft.com/office/word/2015/wordml/symex" xmlns:wpg="http://schemas.microsoft.com/office/word/2010/wordprocessingGroup" xmlns:wpi="http://schemas.microsoft.com/office/word/2010/wordprocessingInk" xmlns:wne="http://schemas.microsoft.com/office/word/2006/wordml" xmlns:wps="http://schemas.microsoft.com/office/word/2010/wordprocessingShape" mc:Ignorable="w14 w15 w16se w16cid w16 w16cex w16sdtdh w16du wp14">
+<w:endnotes xmlns:wpc="http://schemas.microsoft.com/office/word/2010/wordprocessingCanvas" xmlns:cx="http://schemas.microsoft.com/office/drawing/2014/chartex" xmlns:cx1="http://schemas.microsoft.com/office/drawing/2015/9/8/chartex" xmlns:cx2="http://schemas.microsoft.com/office/drawing/2015/10/21/chartex" xmlns:cx3="http://schemas.microsoft.com/office/drawing/2016/5/9/chartex" xmlns:cx4="http://schemas.microsoft.com/office/drawing/2016/5/10/chartex" xmlns:cx5="http://schemas.microsoft.com/office/drawing/2016/5/11/chartex" xmlns:cx6="http://schemas.microsoft.com/office/drawing/2016/5/12/chartex" xmlns:cx7="http://schemas.microsoft.com/office/drawing/2016/5/13/chartex" xmlns:cx8="http://schemas.microsoft.com/office/drawing/2016/5/14/chartex" xmlns:mc="http://schemas.openxmlformats.org/markup-compatibility/2006" xmlns:aink="http://schemas.microsoft.com/office/drawing/2016/ink" xmlns:am3d="http://schemas.microsoft.com/office/drawing/2017/model3d" xmlns:o="urn:schemas-microsoft-com:office:office" xmlns:r="http://schemas.openxmlformats.org/officeDocument/2006/relationships" xmlns:m="http://schemas.openxmlformats.org/officeDocument/2006/math" xmlns:v="urn:schemas-microsoft-com:vml" xmlns:wp14="http://schemas.microsoft.com/office/word/2010/wordprocessingDrawing" xmlns:wp="http://schemas.openxmlformats.org/drawingml/2006/wordprocessingDrawing" xmlns:w10="urn:schemas-microsoft-com:office:word" xmlns:w="http://schemas.openxmlformats.org/wordprocessingml/2006/main" xmlns:w14="http://schemas.microsoft.com/office/word/2010/wordml" xmlns:w15="http://schemas.microsoft.com/office/word/2012/wordml" xmlns:w16cex="http://schemas.microsoft.com/office/word/2018/wordml/cex" xmlns:w16cid="http://schemas.microsoft.com/office/word/2016/wordml/cid" xmlns:w16="http://schemas.microsoft.com/office/word/2018/wordml" xmlns:w16sdtdh="http://schemas.microsoft.com/office/word/2020/wordml/sdtdatahash" xmlns:w16se="http://schemas.microsoft.com/office/word/2015/wordml/symex" xmlns:wpg="http://schemas.microsoft.com/office/word/2010/wordprocessingGroup" xmlns:wpi="http://schemas.microsoft.com/office/word/2010/wordprocessingInk" xmlns:wne="http://schemas.microsoft.com/office/word/2006/wordml" xmlns:wps="http://schemas.microsoft.com/office/word/2010/wordprocessingShape" mc:Ignorable="w14 w15 w16se w16cid w16 w16cex w16sdtdh wp14">
   <w:endnote w:type="separator" w:id="-1">
     <w:p>
       <w:r>
@@ -2870,7 +2925,7 @@
 </file>
 
 <file path=word/footer1.xml><?xml version="1.0" encoding="utf-8"?>
-<w:ftr xmlns:wpc="http://schemas.microsoft.com/office/word/2010/wordprocessingCanvas" xmlns:cx="http://schemas.microsoft.com/office/drawing/2014/chartex" xmlns:cx1="http://schemas.microsoft.com/office/drawing/2015/9/8/chartex" xmlns:cx2="http://schemas.microsoft.com/office/drawing/2015/10/21/chartex" xmlns:cx3="http://schemas.microsoft.com/office/drawing/2016/5/9/chartex" xmlns:cx4="http://schemas.microsoft.com/office/drawing/2016/5/10/chartex" xmlns:cx5="http://schemas.microsoft.com/office/drawing/2016/5/11/chartex" xmlns:cx6="http://schemas.microsoft.com/office/drawing/2016/5/12/chartex" xmlns:cx7="http://schemas.microsoft.com/office/drawing/2016/5/13/chartex" xmlns:cx8="http://schemas.microsoft.com/office/drawing/2016/5/14/chartex" xmlns:mc="http://schemas.openxmlformats.org/markup-compatibility/2006" xmlns:aink="http://schemas.microsoft.com/office/drawing/2016/ink" xmlns:am3d="http://schemas.microsoft.com/office/drawing/2017/model3d" xmlns:o="urn:schemas-microsoft-com:office:office" xmlns:oel="http://schemas.microsoft.com/office/2019/extlst" xmlns:r="http://schemas.openxmlformats.org/officeDocument/2006/relationships" xmlns:m="http://schemas.openxmlformats.org/officeDocument/2006/math" xmlns:v="urn:schemas-microsoft-com:vml" xmlns:wp14="http://schemas.microsoft.com/office/word/2010/wordprocessingDrawing" xmlns:wp="http://schemas.openxmlformats.org/drawingml/2006/wordprocessingDrawing" xmlns:w10="urn:schemas-microsoft-com:office:word" xmlns:w="http://schemas.openxmlformats.org/wordprocessingml/2006/main" xmlns:w14="http://schemas.microsoft.com/office/word/2010/wordml" xmlns:w15="http://schemas.microsoft.com/office/word/2012/wordml" xmlns:w16cex="http://schemas.microsoft.com/office/word/2018/wordml/cex" xmlns:w16cid="http://schemas.microsoft.com/office/word/2016/wordml/cid" xmlns:w16="http://schemas.microsoft.com/office/word/2018/wordml" xmlns:w16du="http://schemas.microsoft.com/office/word/2023/wordml/word16du" xmlns:w16sdtdh="http://schemas.microsoft.com/office/word/2020/wordml/sdtdatahash" xmlns:w16se="http://schemas.microsoft.com/office/word/2015/wordml/symex" xmlns:wpg="http://schemas.microsoft.com/office/word/2010/wordprocessingGroup" xmlns:wpi="http://schemas.microsoft.com/office/word/2010/wordprocessingInk" xmlns:wne="http://schemas.microsoft.com/office/word/2006/wordml" xmlns:wps="http://schemas.microsoft.com/office/word/2010/wordprocessingShape" mc:Ignorable="w14 w15 w16se w16cid w16 w16cex w16sdtdh w16du wp14">
+<w:ftr xmlns:wpc="http://schemas.microsoft.com/office/word/2010/wordprocessingCanvas" xmlns:cx="http://schemas.microsoft.com/office/drawing/2014/chartex" xmlns:cx1="http://schemas.microsoft.com/office/drawing/2015/9/8/chartex" xmlns:cx2="http://schemas.microsoft.com/office/drawing/2015/10/21/chartex" xmlns:cx3="http://schemas.microsoft.com/office/drawing/2016/5/9/chartex" xmlns:cx4="http://schemas.microsoft.com/office/drawing/2016/5/10/chartex" xmlns:cx5="http://schemas.microsoft.com/office/drawing/2016/5/11/chartex" xmlns:cx6="http://schemas.microsoft.com/office/drawing/2016/5/12/chartex" xmlns:cx7="http://schemas.microsoft.com/office/drawing/2016/5/13/chartex" xmlns:cx8="http://schemas.microsoft.com/office/drawing/2016/5/14/chartex" xmlns:mc="http://schemas.openxmlformats.org/markup-compatibility/2006" xmlns:aink="http://schemas.microsoft.com/office/drawing/2016/ink" xmlns:am3d="http://schemas.microsoft.com/office/drawing/2017/model3d" xmlns:o="urn:schemas-microsoft-com:office:office" xmlns:r="http://schemas.openxmlformats.org/officeDocument/2006/relationships" xmlns:m="http://schemas.openxmlformats.org/officeDocument/2006/math" xmlns:v="urn:schemas-microsoft-com:vml" xmlns:wp14="http://schemas.microsoft.com/office/word/2010/wordprocessingDrawing" xmlns:wp="http://schemas.openxmlformats.org/drawingml/2006/wordprocessingDrawing" xmlns:w10="urn:schemas-microsoft-com:office:word" xmlns:w="http://schemas.openxmlformats.org/wordprocessingml/2006/main" xmlns:w14="http://schemas.microsoft.com/office/word/2010/wordml" xmlns:w15="http://schemas.microsoft.com/office/word/2012/wordml" xmlns:w16cex="http://schemas.microsoft.com/office/word/2018/wordml/cex" xmlns:w16cid="http://schemas.microsoft.com/office/word/2016/wordml/cid" xmlns:w16="http://schemas.microsoft.com/office/word/2018/wordml" xmlns:w16sdtdh="http://schemas.microsoft.com/office/word/2020/wordml/sdtdatahash" xmlns:w16se="http://schemas.microsoft.com/office/word/2015/wordml/symex" xmlns:wpg="http://schemas.microsoft.com/office/word/2010/wordprocessingGroup" xmlns:wpi="http://schemas.microsoft.com/office/word/2010/wordprocessingInk" xmlns:wne="http://schemas.microsoft.com/office/word/2006/wordml" xmlns:wps="http://schemas.microsoft.com/office/word/2010/wordprocessingShape" mc:Ignorable="w14 w15 w16se w16cid w16 w16cex w16sdtdh wp14">
   <w:p>
     <w:pPr>
       <w:pStyle w:val="Piedepgina"/>
@@ -2880,7 +2935,7 @@
 </file>
 
 <file path=word/footer2.xml><?xml version="1.0" encoding="utf-8"?>
-<w:ftr xmlns:wpc="http://schemas.microsoft.com/office/word/2010/wordprocessingCanvas" xmlns:cx="http://schemas.microsoft.com/office/drawing/2014/chartex" xmlns:cx1="http://schemas.microsoft.com/office/drawing/2015/9/8/chartex" xmlns:cx2="http://schemas.microsoft.com/office/drawing/2015/10/21/chartex" xmlns:cx3="http://schemas.microsoft.com/office/drawing/2016/5/9/chartex" xmlns:cx4="http://schemas.microsoft.com/office/drawing/2016/5/10/chartex" xmlns:cx5="http://schemas.microsoft.com/office/drawing/2016/5/11/chartex" xmlns:cx6="http://schemas.microsoft.com/office/drawing/2016/5/12/chartex" xmlns:cx7="http://schemas.microsoft.com/office/drawing/2016/5/13/chartex" xmlns:cx8="http://schemas.microsoft.com/office/drawing/2016/5/14/chartex" xmlns:mc="http://schemas.openxmlformats.org/markup-compatibility/2006" xmlns:aink="http://schemas.microsoft.com/office/drawing/2016/ink" xmlns:am3d="http://schemas.microsoft.com/office/drawing/2017/model3d" xmlns:o="urn:schemas-microsoft-com:office:office" xmlns:oel="http://schemas.microsoft.com/office/2019/extlst" xmlns:r="http://schemas.openxmlformats.org/officeDocument/2006/relationships" xmlns:m="http://schemas.openxmlformats.org/officeDocument/2006/math" xmlns:v="urn:schemas-microsoft-com:vml" xmlns:wp14="http://schemas.microsoft.com/office/word/2010/wordprocessingDrawing" xmlns:wp="http://schemas.openxmlformats.org/drawingml/2006/wordprocessingDrawing" xmlns:w10="urn:schemas-microsoft-com:office:word" xmlns:w="http://schemas.openxmlformats.org/wordprocessingml/2006/main" xmlns:w14="http://schemas.microsoft.com/office/word/2010/wordml" xmlns:w15="http://schemas.microsoft.com/office/word/2012/wordml" xmlns:w16cex="http://schemas.microsoft.com/office/word/2018/wordml/cex" xmlns:w16cid="http://schemas.microsoft.com/office/word/2016/wordml/cid" xmlns:w16="http://schemas.microsoft.com/office/word/2018/wordml" xmlns:w16du="http://schemas.microsoft.com/office/word/2023/wordml/word16du" xmlns:w16sdtdh="http://schemas.microsoft.com/office/word/2020/wordml/sdtdatahash" xmlns:w16se="http://schemas.microsoft.com/office/word/2015/wordml/symex" xmlns:wpg="http://schemas.microsoft.com/office/word/2010/wordprocessingGroup" xmlns:wpi="http://schemas.microsoft.com/office/word/2010/wordprocessingInk" xmlns:wne="http://schemas.microsoft.com/office/word/2006/wordml" xmlns:wps="http://schemas.microsoft.com/office/word/2010/wordprocessingShape" mc:Ignorable="w14 w15 w16se w16cid w16 w16cex w16sdtdh w16du wp14">
+<w:ftr xmlns:wpc="http://schemas.microsoft.com/office/word/2010/wordprocessingCanvas" xmlns:cx="http://schemas.microsoft.com/office/drawing/2014/chartex" xmlns:cx1="http://schemas.microsoft.com/office/drawing/2015/9/8/chartex" xmlns:cx2="http://schemas.microsoft.com/office/drawing/2015/10/21/chartex" xmlns:cx3="http://schemas.microsoft.com/office/drawing/2016/5/9/chartex" xmlns:cx4="http://schemas.microsoft.com/office/drawing/2016/5/10/chartex" xmlns:cx5="http://schemas.microsoft.com/office/drawing/2016/5/11/chartex" xmlns:cx6="http://schemas.microsoft.com/office/drawing/2016/5/12/chartex" xmlns:cx7="http://schemas.microsoft.com/office/drawing/2016/5/13/chartex" xmlns:cx8="http://schemas.microsoft.com/office/drawing/2016/5/14/chartex" xmlns:mc="http://schemas.openxmlformats.org/markup-compatibility/2006" xmlns:aink="http://schemas.microsoft.com/office/drawing/2016/ink" xmlns:am3d="http://schemas.microsoft.com/office/drawing/2017/model3d" xmlns:o="urn:schemas-microsoft-com:office:office" xmlns:r="http://schemas.openxmlformats.org/officeDocument/2006/relationships" xmlns:m="http://schemas.openxmlformats.org/officeDocument/2006/math" xmlns:v="urn:schemas-microsoft-com:vml" xmlns:wp14="http://schemas.microsoft.com/office/word/2010/wordprocessingDrawing" xmlns:wp="http://schemas.openxmlformats.org/drawingml/2006/wordprocessingDrawing" xmlns:w10="urn:schemas-microsoft-com:office:word" xmlns:w="http://schemas.openxmlformats.org/wordprocessingml/2006/main" xmlns:w14="http://schemas.microsoft.com/office/word/2010/wordml" xmlns:w15="http://schemas.microsoft.com/office/word/2012/wordml" xmlns:w16cex="http://schemas.microsoft.com/office/word/2018/wordml/cex" xmlns:w16cid="http://schemas.microsoft.com/office/word/2016/wordml/cid" xmlns:w16="http://schemas.microsoft.com/office/word/2018/wordml" xmlns:w16sdtdh="http://schemas.microsoft.com/office/word/2020/wordml/sdtdatahash" xmlns:w16se="http://schemas.microsoft.com/office/word/2015/wordml/symex" xmlns:wpg="http://schemas.microsoft.com/office/word/2010/wordprocessingGroup" xmlns:wpi="http://schemas.microsoft.com/office/word/2010/wordprocessingInk" xmlns:wne="http://schemas.microsoft.com/office/word/2006/wordml" xmlns:wps="http://schemas.microsoft.com/office/word/2010/wordprocessingShape" mc:Ignorable="w14 w15 w16se w16cid w16 w16cex w16sdtdh wp14">
   <w:p>
     <w:pPr>
       <w:pStyle w:val="normal1"/>
@@ -2896,7 +2951,7 @@
         <w:noProof/>
       </w:rPr>
       <w:pict w14:anchorId="11A3F2D7">
-        <v:rect id="Shape 2" o:spid="_x0000_s1028" style="position:absolute;margin-left:477.75pt;margin-top:730.25pt;width:13.25pt;height:13.55pt;z-index:-251661824;visibility:visible;mso-wrap-style:square;mso-wrap-distance-left:0;mso-wrap-distance-top:0;mso-wrap-distance-right:0;mso-wrap-distance-bottom:0;mso-position-horizontal:absolute;mso-position-horizontal-relative:text;mso-position-vertical:absolute;mso-position-vertical-relative:text;v-text-anchor:top" o:gfxdata="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" filled="f" stroked="f" strokeweight="0">
+        <v:rect id="Shape 2" o:spid="_x0000_s2052" style="position:absolute;margin-left:477.75pt;margin-top:730.25pt;width:13.25pt;height:13.55pt;z-index:-251661824;visibility:visible;mso-wrap-style:square;mso-wrap-distance-left:0;mso-wrap-distance-top:0;mso-wrap-distance-right:0;mso-wrap-distance-bottom:0;mso-position-horizontal:absolute;mso-position-horizontal-relative:text;mso-position-vertical:absolute;mso-position-vertical-relative:text;v-text-anchor:top" o:gfxdata="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" filled="f" stroked="f" strokeweight="0">
           <v:textbox inset="0,0,0,0">
             <w:txbxContent>
               <w:p>
@@ -2923,7 +2978,7 @@
 </file>
 
 <file path=word/footer3.xml><?xml version="1.0" encoding="utf-8"?>
-<w:ftr xmlns:wpc="http://schemas.microsoft.com/office/word/2010/wordprocessingCanvas" xmlns:cx="http://schemas.microsoft.com/office/drawing/2014/chartex" xmlns:cx1="http://schemas.microsoft.com/office/drawing/2015/9/8/chartex" xmlns:cx2="http://schemas.microsoft.com/office/drawing/2015/10/21/chartex" xmlns:cx3="http://schemas.microsoft.com/office/drawing/2016/5/9/chartex" xmlns:cx4="http://schemas.microsoft.com/office/drawing/2016/5/10/chartex" xmlns:cx5="http://schemas.microsoft.com/office/drawing/2016/5/11/chartex" xmlns:cx6="http://schemas.microsoft.com/office/drawing/2016/5/12/chartex" xmlns:cx7="http://schemas.microsoft.com/office/drawing/2016/5/13/chartex" xmlns:cx8="http://schemas.microsoft.com/office/drawing/2016/5/14/chartex" xmlns:mc="http://schemas.openxmlformats.org/markup-compatibility/2006" xmlns:aink="http://schemas.microsoft.com/office/drawing/2016/ink" xmlns:am3d="http://schemas.microsoft.com/office/drawing/2017/model3d" xmlns:o="urn:schemas-microsoft-com:office:office" xmlns:oel="http://schemas.microsoft.com/office/2019/extlst" xmlns:r="http://schemas.openxmlformats.org/officeDocument/2006/relationships" xmlns:m="http://schemas.openxmlformats.org/officeDocument/2006/math" xmlns:v="urn:schemas-microsoft-com:vml" xmlns:wp14="http://schemas.microsoft.com/office/word/2010/wordprocessingDrawing" xmlns:wp="http://schemas.openxmlformats.org/drawingml/2006/wordprocessingDrawing" xmlns:w10="urn:schemas-microsoft-com:office:word" xmlns:w="http://schemas.openxmlformats.org/wordprocessingml/2006/main" xmlns:w14="http://schemas.microsoft.com/office/word/2010/wordml" xmlns:w15="http://schemas.microsoft.com/office/word/2012/wordml" xmlns:w16cex="http://schemas.microsoft.com/office/word/2018/wordml/cex" xmlns:w16cid="http://schemas.microsoft.com/office/word/2016/wordml/cid" xmlns:w16="http://schemas.microsoft.com/office/word/2018/wordml" xmlns:w16du="http://schemas.microsoft.com/office/word/2023/wordml/word16du" xmlns:w16sdtdh="http://schemas.microsoft.com/office/word/2020/wordml/sdtdatahash" xmlns:w16se="http://schemas.microsoft.com/office/word/2015/wordml/symex" xmlns:wpg="http://schemas.microsoft.com/office/word/2010/wordprocessingGroup" xmlns:wpi="http://schemas.microsoft.com/office/word/2010/wordprocessingInk" xmlns:wne="http://schemas.microsoft.com/office/word/2006/wordml" xmlns:wps="http://schemas.microsoft.com/office/word/2010/wordprocessingShape" mc:Ignorable="w14 w15 w16se w16cid w16 w16cex w16sdtdh w16du wp14">
+<w:ftr xmlns:wpc="http://schemas.microsoft.com/office/word/2010/wordprocessingCanvas" xmlns:cx="http://schemas.microsoft.com/office/drawing/2014/chartex" xmlns:cx1="http://schemas.microsoft.com/office/drawing/2015/9/8/chartex" xmlns:cx2="http://schemas.microsoft.com/office/drawing/2015/10/21/chartex" xmlns:cx3="http://schemas.microsoft.com/office/drawing/2016/5/9/chartex" xmlns:cx4="http://schemas.microsoft.com/office/drawing/2016/5/10/chartex" xmlns:cx5="http://schemas.microsoft.com/office/drawing/2016/5/11/chartex" xmlns:cx6="http://schemas.microsoft.com/office/drawing/2016/5/12/chartex" xmlns:cx7="http://schemas.microsoft.com/office/drawing/2016/5/13/chartex" xmlns:cx8="http://schemas.microsoft.com/office/drawing/2016/5/14/chartex" xmlns:mc="http://schemas.openxmlformats.org/markup-compatibility/2006" xmlns:aink="http://schemas.microsoft.com/office/drawing/2016/ink" xmlns:am3d="http://schemas.microsoft.com/office/drawing/2017/model3d" xmlns:o="urn:schemas-microsoft-com:office:office" xmlns:r="http://schemas.openxmlformats.org/officeDocument/2006/relationships" xmlns:m="http://schemas.openxmlformats.org/officeDocument/2006/math" xmlns:v="urn:schemas-microsoft-com:vml" xmlns:wp14="http://schemas.microsoft.com/office/word/2010/wordprocessingDrawing" xmlns:wp="http://schemas.openxmlformats.org/drawingml/2006/wordprocessingDrawing" xmlns:w10="urn:schemas-microsoft-com:office:word" xmlns:w="http://schemas.openxmlformats.org/wordprocessingml/2006/main" xmlns:w14="http://schemas.microsoft.com/office/word/2010/wordml" xmlns:w15="http://schemas.microsoft.com/office/word/2012/wordml" xmlns:w16cex="http://schemas.microsoft.com/office/word/2018/wordml/cex" xmlns:w16cid="http://schemas.microsoft.com/office/word/2016/wordml/cid" xmlns:w16="http://schemas.microsoft.com/office/word/2018/wordml" xmlns:w16sdtdh="http://schemas.microsoft.com/office/word/2020/wordml/sdtdatahash" xmlns:w16se="http://schemas.microsoft.com/office/word/2015/wordml/symex" xmlns:wpg="http://schemas.microsoft.com/office/word/2010/wordprocessingGroup" xmlns:wpi="http://schemas.microsoft.com/office/word/2010/wordprocessingInk" xmlns:wne="http://schemas.microsoft.com/office/word/2006/wordml" xmlns:wps="http://schemas.microsoft.com/office/word/2010/wordprocessingShape" mc:Ignorable="w14 w15 w16se w16cid w16 w16cex w16sdtdh wp14">
   <w:p>
     <w:pPr>
       <w:pStyle w:val="normal1"/>
@@ -2939,7 +2994,7 @@
         <w:noProof/>
       </w:rPr>
       <w:pict w14:anchorId="325845B9">
-        <v:rect id="_x0000_s1027" style="position:absolute;margin-left:477.75pt;margin-top:730.25pt;width:13.25pt;height:13.55pt;z-index:-251660800;visibility:visible;mso-wrap-style:square;mso-wrap-distance-left:0;mso-wrap-distance-top:0;mso-wrap-distance-right:0;mso-wrap-distance-bottom:0;mso-position-horizontal:absolute;mso-position-horizontal-relative:text;mso-position-vertical:absolute;mso-position-vertical-relative:text;v-text-anchor:top" o:gfxdata="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" filled="f" stroked="f" strokeweight="0">
+        <v:rect id="_x0000_s2051" style="position:absolute;margin-left:477.75pt;margin-top:730.25pt;width:13.25pt;height:13.55pt;z-index:-251660800;visibility:visible;mso-wrap-style:square;mso-wrap-distance-left:0;mso-wrap-distance-top:0;mso-wrap-distance-right:0;mso-wrap-distance-bottom:0;mso-position-horizontal:absolute;mso-position-horizontal-relative:text;mso-position-vertical:absolute;mso-position-vertical-relative:text;v-text-anchor:top" o:gfxdata="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" filled="f" stroked="f" strokeweight="0">
           <v:textbox inset="0,0,0,0">
             <w:txbxContent>
               <w:p>
@@ -2966,7 +3021,7 @@
 </file>
 
 <file path=word/footer4.xml><?xml version="1.0" encoding="utf-8"?>
-<w:ftr xmlns:wpc="http://schemas.microsoft.com/office/word/2010/wordprocessingCanvas" xmlns:cx="http://schemas.microsoft.com/office/drawing/2014/chartex" xmlns:cx1="http://schemas.microsoft.com/office/drawing/2015/9/8/chartex" xmlns:cx2="http://schemas.microsoft.com/office/drawing/2015/10/21/chartex" xmlns:cx3="http://schemas.microsoft.com/office/drawing/2016/5/9/chartex" xmlns:cx4="http://schemas.microsoft.com/office/drawing/2016/5/10/chartex" xmlns:cx5="http://schemas.microsoft.com/office/drawing/2016/5/11/chartex" xmlns:cx6="http://schemas.microsoft.com/office/drawing/2016/5/12/chartex" xmlns:cx7="http://schemas.microsoft.com/office/drawing/2016/5/13/chartex" xmlns:cx8="http://schemas.microsoft.com/office/drawing/2016/5/14/chartex" xmlns:mc="http://schemas.openxmlformats.org/markup-compatibility/2006" xmlns:aink="http://schemas.microsoft.com/office/drawing/2016/ink" xmlns:am3d="http://schemas.microsoft.com/office/drawing/2017/model3d" xmlns:o="urn:schemas-microsoft-com:office:office" xmlns:oel="http://schemas.microsoft.com/office/2019/extlst" xmlns:r="http://schemas.openxmlformats.org/officeDocument/2006/relationships" xmlns:m="http://schemas.openxmlformats.org/officeDocument/2006/math" xmlns:v="urn:schemas-microsoft-com:vml" xmlns:wp14="http://schemas.microsoft.com/office/word/2010/wordprocessingDrawing" xmlns:wp="http://schemas.openxmlformats.org/drawingml/2006/wordprocessingDrawing" xmlns:w10="urn:schemas-microsoft-com:office:word" xmlns:w="http://schemas.openxmlformats.org/wordprocessingml/2006/main" xmlns:w14="http://schemas.microsoft.com/office/word/2010/wordml" xmlns:w15="http://schemas.microsoft.com/office/word/2012/wordml" xmlns:w16cex="http://schemas.microsoft.com/office/word/2018/wordml/cex" xmlns:w16cid="http://schemas.microsoft.com/office/word/2016/wordml/cid" xmlns:w16="http://schemas.microsoft.com/office/word/2018/wordml" xmlns:w16du="http://schemas.microsoft.com/office/word/2023/wordml/word16du" xmlns:w16sdtdh="http://schemas.microsoft.com/office/word/2020/wordml/sdtdatahash" xmlns:w16se="http://schemas.microsoft.com/office/word/2015/wordml/symex" xmlns:wpg="http://schemas.microsoft.com/office/word/2010/wordprocessingGroup" xmlns:wpi="http://schemas.microsoft.com/office/word/2010/wordprocessingInk" xmlns:wne="http://schemas.microsoft.com/office/word/2006/wordml" xmlns:wps="http://schemas.microsoft.com/office/word/2010/wordprocessingShape" mc:Ignorable="w14 w15 w16se w16cid w16 w16cex w16sdtdh w16du wp14">
+<w:ftr xmlns:wpc="http://schemas.microsoft.com/office/word/2010/wordprocessingCanvas" xmlns:cx="http://schemas.microsoft.com/office/drawing/2014/chartex" xmlns:cx1="http://schemas.microsoft.com/office/drawing/2015/9/8/chartex" xmlns:cx2="http://schemas.microsoft.com/office/drawing/2015/10/21/chartex" xmlns:cx3="http://schemas.microsoft.com/office/drawing/2016/5/9/chartex" xmlns:cx4="http://schemas.microsoft.com/office/drawing/2016/5/10/chartex" xmlns:cx5="http://schemas.microsoft.com/office/drawing/2016/5/11/chartex" xmlns:cx6="http://schemas.microsoft.com/office/drawing/2016/5/12/chartex" xmlns:cx7="http://schemas.microsoft.com/office/drawing/2016/5/13/chartex" xmlns:cx8="http://schemas.microsoft.com/office/drawing/2016/5/14/chartex" xmlns:mc="http://schemas.openxmlformats.org/markup-compatibility/2006" xmlns:aink="http://schemas.microsoft.com/office/drawing/2016/ink" xmlns:am3d="http://schemas.microsoft.com/office/drawing/2017/model3d" xmlns:o="urn:schemas-microsoft-com:office:office" xmlns:r="http://schemas.openxmlformats.org/officeDocument/2006/relationships" xmlns:m="http://schemas.openxmlformats.org/officeDocument/2006/math" xmlns:v="urn:schemas-microsoft-com:vml" xmlns:wp14="http://schemas.microsoft.com/office/word/2010/wordprocessingDrawing" xmlns:wp="http://schemas.openxmlformats.org/drawingml/2006/wordprocessingDrawing" xmlns:w10="urn:schemas-microsoft-com:office:word" xmlns:w="http://schemas.openxmlformats.org/wordprocessingml/2006/main" xmlns:w14="http://schemas.microsoft.com/office/word/2010/wordml" xmlns:w15="http://schemas.microsoft.com/office/word/2012/wordml" xmlns:w16cex="http://schemas.microsoft.com/office/word/2018/wordml/cex" xmlns:w16cid="http://schemas.microsoft.com/office/word/2016/wordml/cid" xmlns:w16="http://schemas.microsoft.com/office/word/2018/wordml" xmlns:w16sdtdh="http://schemas.microsoft.com/office/word/2020/wordml/sdtdatahash" xmlns:w16se="http://schemas.microsoft.com/office/word/2015/wordml/symex" xmlns:wpg="http://schemas.microsoft.com/office/word/2010/wordprocessingGroup" xmlns:wpi="http://schemas.microsoft.com/office/word/2010/wordprocessingInk" xmlns:wne="http://schemas.microsoft.com/office/word/2006/wordml" xmlns:wps="http://schemas.microsoft.com/office/word/2010/wordprocessingShape" mc:Ignorable="w14 w15 w16se w16cid w16 w16cex w16sdtdh wp14">
   <w:p>
     <w:pPr>
       <w:pStyle w:val="normal1"/>
@@ -2982,7 +3037,7 @@
         <w:noProof/>
       </w:rPr>
       <w:pict w14:anchorId="420D5777">
-        <v:rect id="Shape 1" o:spid="_x0000_s1026" style="position:absolute;margin-left:477.75pt;margin-top:730.25pt;width:13.25pt;height:13.55pt;z-index:-251653632;visibility:visible;mso-wrap-style:square;mso-wrap-distance-left:0;mso-wrap-distance-top:0;mso-wrap-distance-right:0;mso-wrap-distance-bottom:0;mso-position-horizontal:absolute;mso-position-horizontal-relative:text;mso-position-vertical:absolute;mso-position-vertical-relative:text;v-text-anchor:top" o:gfxdata="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" filled="f" stroked="f" strokeweight="0">
+        <v:rect id="Shape 1" o:spid="_x0000_s2050" style="position:absolute;margin-left:477.75pt;margin-top:730.25pt;width:13.25pt;height:13.55pt;z-index:-251653632;visibility:visible;mso-wrap-style:square;mso-wrap-distance-left:0;mso-wrap-distance-top:0;mso-wrap-distance-right:0;mso-wrap-distance-bottom:0;mso-position-horizontal:absolute;mso-position-horizontal-relative:text;mso-position-vertical:absolute;mso-position-vertical-relative:text;v-text-anchor:top" o:gfxdata="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" filled="f" stroked="f" strokeweight="0">
           <v:textbox inset="0,0,0,0">
             <w:txbxContent>
               <w:p>
@@ -3009,7 +3064,7 @@
 </file>
 
 <file path=word/footer5.xml><?xml version="1.0" encoding="utf-8"?>
-<w:ftr xmlns:wpc="http://schemas.microsoft.com/office/word/2010/wordprocessingCanvas" xmlns:cx="http://schemas.microsoft.com/office/drawing/2014/chartex" xmlns:cx1="http://schemas.microsoft.com/office/drawing/2015/9/8/chartex" xmlns:cx2="http://schemas.microsoft.com/office/drawing/2015/10/21/chartex" xmlns:cx3="http://schemas.microsoft.com/office/drawing/2016/5/9/chartex" xmlns:cx4="http://schemas.microsoft.com/office/drawing/2016/5/10/chartex" xmlns:cx5="http://schemas.microsoft.com/office/drawing/2016/5/11/chartex" xmlns:cx6="http://schemas.microsoft.com/office/drawing/2016/5/12/chartex" xmlns:cx7="http://schemas.microsoft.com/office/drawing/2016/5/13/chartex" xmlns:cx8="http://schemas.microsoft.com/office/drawing/2016/5/14/chartex" xmlns:mc="http://schemas.openxmlformats.org/markup-compatibility/2006" xmlns:aink="http://schemas.microsoft.com/office/drawing/2016/ink" xmlns:am3d="http://schemas.microsoft.com/office/drawing/2017/model3d" xmlns:o="urn:schemas-microsoft-com:office:office" xmlns:oel="http://schemas.microsoft.com/office/2019/extlst" xmlns:r="http://schemas.openxmlformats.org/officeDocument/2006/relationships" xmlns:m="http://schemas.openxmlformats.org/officeDocument/2006/math" xmlns:v="urn:schemas-microsoft-com:vml" xmlns:wp14="http://schemas.microsoft.com/office/word/2010/wordprocessingDrawing" xmlns:wp="http://schemas.openxmlformats.org/drawingml/2006/wordprocessingDrawing" xmlns:w10="urn:schemas-microsoft-com:office:word" xmlns:w="http://schemas.openxmlformats.org/wordprocessingml/2006/main" xmlns:w14="http://schemas.microsoft.com/office/word/2010/wordml" xmlns:w15="http://schemas.microsoft.com/office/word/2012/wordml" xmlns:w16cex="http://schemas.microsoft.com/office/word/2018/wordml/cex" xmlns:w16cid="http://schemas.microsoft.com/office/word/2016/wordml/cid" xmlns:w16="http://schemas.microsoft.com/office/word/2018/wordml" xmlns:w16du="http://schemas.microsoft.com/office/word/2023/wordml/word16du" xmlns:w16sdtdh="http://schemas.microsoft.com/office/word/2020/wordml/sdtdatahash" xmlns:w16se="http://schemas.microsoft.com/office/word/2015/wordml/symex" xmlns:wpg="http://schemas.microsoft.com/office/word/2010/wordprocessingGroup" xmlns:wpi="http://schemas.microsoft.com/office/word/2010/wordprocessingInk" xmlns:wne="http://schemas.microsoft.com/office/word/2006/wordml" xmlns:wps="http://schemas.microsoft.com/office/word/2010/wordprocessingShape" mc:Ignorable="w14 w15 w16se w16cid w16 w16cex w16sdtdh w16du wp14">
+<w:ftr xmlns:wpc="http://schemas.microsoft.com/office/word/2010/wordprocessingCanvas" xmlns:cx="http://schemas.microsoft.com/office/drawing/2014/chartex" xmlns:cx1="http://schemas.microsoft.com/office/drawing/2015/9/8/chartex" xmlns:cx2="http://schemas.microsoft.com/office/drawing/2015/10/21/chartex" xmlns:cx3="http://schemas.microsoft.com/office/drawing/2016/5/9/chartex" xmlns:cx4="http://schemas.microsoft.com/office/drawing/2016/5/10/chartex" xmlns:cx5="http://schemas.microsoft.com/office/drawing/2016/5/11/chartex" xmlns:cx6="http://schemas.microsoft.com/office/drawing/2016/5/12/chartex" xmlns:cx7="http://schemas.microsoft.com/office/drawing/2016/5/13/chartex" xmlns:cx8="http://schemas.microsoft.com/office/drawing/2016/5/14/chartex" xmlns:mc="http://schemas.openxmlformats.org/markup-compatibility/2006" xmlns:aink="http://schemas.microsoft.com/office/drawing/2016/ink" xmlns:am3d="http://schemas.microsoft.com/office/drawing/2017/model3d" xmlns:o="urn:schemas-microsoft-com:office:office" xmlns:r="http://schemas.openxmlformats.org/officeDocument/2006/relationships" xmlns:m="http://schemas.openxmlformats.org/officeDocument/2006/math" xmlns:v="urn:schemas-microsoft-com:vml" xmlns:wp14="http://schemas.microsoft.com/office/word/2010/wordprocessingDrawing" xmlns:wp="http://schemas.openxmlformats.org/drawingml/2006/wordprocessingDrawing" xmlns:w10="urn:schemas-microsoft-com:office:word" xmlns:w="http://schemas.openxmlformats.org/wordprocessingml/2006/main" xmlns:w14="http://schemas.microsoft.com/office/word/2010/wordml" xmlns:w15="http://schemas.microsoft.com/office/word/2012/wordml" xmlns:w16cex="http://schemas.microsoft.com/office/word/2018/wordml/cex" xmlns:w16cid="http://schemas.microsoft.com/office/word/2016/wordml/cid" xmlns:w16="http://schemas.microsoft.com/office/word/2018/wordml" xmlns:w16sdtdh="http://schemas.microsoft.com/office/word/2020/wordml/sdtdatahash" xmlns:w16se="http://schemas.microsoft.com/office/word/2015/wordml/symex" xmlns:wpg="http://schemas.microsoft.com/office/word/2010/wordprocessingGroup" xmlns:wpi="http://schemas.microsoft.com/office/word/2010/wordprocessingInk" xmlns:wne="http://schemas.microsoft.com/office/word/2006/wordml" xmlns:wps="http://schemas.microsoft.com/office/word/2010/wordprocessingShape" mc:Ignorable="w14 w15 w16se w16cid w16 w16cex w16sdtdh wp14">
   <w:p>
     <w:pPr>
       <w:pStyle w:val="normal1"/>
@@ -3019,7 +3074,7 @@
 </file>
 
 <file path=word/footer6.xml><?xml version="1.0" encoding="utf-8"?>
-<w:ftr xmlns:wpc="http://schemas.microsoft.com/office/word/2010/wordprocessingCanvas" xmlns:cx="http://schemas.microsoft.com/office/drawing/2014/chartex" xmlns:cx1="http://schemas.microsoft.com/office/drawing/2015/9/8/chartex" xmlns:cx2="http://schemas.microsoft.com/office/drawing/2015/10/21/chartex" xmlns:cx3="http://schemas.microsoft.com/office/drawing/2016/5/9/chartex" xmlns:cx4="http://schemas.microsoft.com/office/drawing/2016/5/10/chartex" xmlns:cx5="http://schemas.microsoft.com/office/drawing/2016/5/11/chartex" xmlns:cx6="http://schemas.microsoft.com/office/drawing/2016/5/12/chartex" xmlns:cx7="http://schemas.microsoft.com/office/drawing/2016/5/13/chartex" xmlns:cx8="http://schemas.microsoft.com/office/drawing/2016/5/14/chartex" xmlns:mc="http://schemas.openxmlformats.org/markup-compatibility/2006" xmlns:aink="http://schemas.microsoft.com/office/drawing/2016/ink" xmlns:am3d="http://schemas.microsoft.com/office/drawing/2017/model3d" xmlns:o="urn:schemas-microsoft-com:office:office" xmlns:oel="http://schemas.microsoft.com/office/2019/extlst" xmlns:r="http://schemas.openxmlformats.org/officeDocument/2006/relationships" xmlns:m="http://schemas.openxmlformats.org/officeDocument/2006/math" xmlns:v="urn:schemas-microsoft-com:vml" xmlns:wp14="http://schemas.microsoft.com/office/word/2010/wordprocessingDrawing" xmlns:wp="http://schemas.openxmlformats.org/drawingml/2006/wordprocessingDrawing" xmlns:w10="urn:schemas-microsoft-com:office:word" xmlns:w="http://schemas.openxmlformats.org/wordprocessingml/2006/main" xmlns:w14="http://schemas.microsoft.com/office/word/2010/wordml" xmlns:w15="http://schemas.microsoft.com/office/word/2012/wordml" xmlns:w16cex="http://schemas.microsoft.com/office/word/2018/wordml/cex" xmlns:w16cid="http://schemas.microsoft.com/office/word/2016/wordml/cid" xmlns:w16="http://schemas.microsoft.com/office/word/2018/wordml" xmlns:w16du="http://schemas.microsoft.com/office/word/2023/wordml/word16du" xmlns:w16sdtdh="http://schemas.microsoft.com/office/word/2020/wordml/sdtdatahash" xmlns:w16se="http://schemas.microsoft.com/office/word/2015/wordml/symex" xmlns:wpg="http://schemas.microsoft.com/office/word/2010/wordprocessingGroup" xmlns:wpi="http://schemas.microsoft.com/office/word/2010/wordprocessingInk" xmlns:wne="http://schemas.microsoft.com/office/word/2006/wordml" xmlns:wps="http://schemas.microsoft.com/office/word/2010/wordprocessingShape" mc:Ignorable="w14 w15 w16se w16cid w16 w16cex w16sdtdh w16du wp14">
+<w:ftr xmlns:wpc="http://schemas.microsoft.com/office/word/2010/wordprocessingCanvas" xmlns:cx="http://schemas.microsoft.com/office/drawing/2014/chartex" xmlns:cx1="http://schemas.microsoft.com/office/drawing/2015/9/8/chartex" xmlns:cx2="http://schemas.microsoft.com/office/drawing/2015/10/21/chartex" xmlns:cx3="http://schemas.microsoft.com/office/drawing/2016/5/9/chartex" xmlns:cx4="http://schemas.microsoft.com/office/drawing/2016/5/10/chartex" xmlns:cx5="http://schemas.microsoft.com/office/drawing/2016/5/11/chartex" xmlns:cx6="http://schemas.microsoft.com/office/drawing/2016/5/12/chartex" xmlns:cx7="http://schemas.microsoft.com/office/drawing/2016/5/13/chartex" xmlns:cx8="http://schemas.microsoft.com/office/drawing/2016/5/14/chartex" xmlns:mc="http://schemas.openxmlformats.org/markup-compatibility/2006" xmlns:aink="http://schemas.microsoft.com/office/drawing/2016/ink" xmlns:am3d="http://schemas.microsoft.com/office/drawing/2017/model3d" xmlns:o="urn:schemas-microsoft-com:office:office" xmlns:r="http://schemas.openxmlformats.org/officeDocument/2006/relationships" xmlns:m="http://schemas.openxmlformats.org/officeDocument/2006/math" xmlns:v="urn:schemas-microsoft-com:vml" xmlns:wp14="http://schemas.microsoft.com/office/word/2010/wordprocessingDrawing" xmlns:wp="http://schemas.openxmlformats.org/drawingml/2006/wordprocessingDrawing" xmlns:w10="urn:schemas-microsoft-com:office:word" xmlns:w="http://schemas.openxmlformats.org/wordprocessingml/2006/main" xmlns:w14="http://schemas.microsoft.com/office/word/2010/wordml" xmlns:w15="http://schemas.microsoft.com/office/word/2012/wordml" xmlns:w16cex="http://schemas.microsoft.com/office/word/2018/wordml/cex" xmlns:w16cid="http://schemas.microsoft.com/office/word/2016/wordml/cid" xmlns:w16="http://schemas.microsoft.com/office/word/2018/wordml" xmlns:w16sdtdh="http://schemas.microsoft.com/office/word/2020/wordml/sdtdatahash" xmlns:w16se="http://schemas.microsoft.com/office/word/2015/wordml/symex" xmlns:wpg="http://schemas.microsoft.com/office/word/2010/wordprocessingGroup" xmlns:wpi="http://schemas.microsoft.com/office/word/2010/wordprocessingInk" xmlns:wne="http://schemas.microsoft.com/office/word/2006/wordml" xmlns:wps="http://schemas.microsoft.com/office/word/2010/wordprocessingShape" mc:Ignorable="w14 w15 w16se w16cid w16 w16cex w16sdtdh wp14">
   <w:p>
     <w:pPr>
       <w:pStyle w:val="normal1"/>
@@ -3035,7 +3090,7 @@
         <w:noProof/>
       </w:rPr>
       <w:pict w14:anchorId="10E86257">
-        <v:rect id="Shape 3" o:spid="_x0000_s1025" style="position:absolute;margin-left:472.35pt;margin-top:730.25pt;width:18.55pt;height:13.55pt;z-index:-251663872;visibility:visible;mso-wrap-style:square;mso-wrap-distance-left:0;mso-wrap-distance-top:0;mso-wrap-distance-right:0;mso-wrap-distance-bottom:0;mso-position-horizontal:absolute;mso-position-horizontal-relative:text;mso-position-vertical:absolute;mso-position-vertical-relative:text;v-text-anchor:top" o:gfxdata="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" filled="f" stroked="f" strokeweight="0">
+        <v:rect id="Shape 3" o:spid="_x0000_s2049" style="position:absolute;margin-left:472.35pt;margin-top:730.25pt;width:18.55pt;height:13.55pt;z-index:-251663872;visibility:visible;mso-wrap-style:square;mso-wrap-distance-left:0;mso-wrap-distance-top:0;mso-wrap-distance-right:0;mso-wrap-distance-bottom:0;mso-position-horizontal:absolute;mso-position-horizontal-relative:text;mso-position-vertical:absolute;mso-position-vertical-relative:text;v-text-anchor:top" o:gfxdata="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" filled="f" stroked="f" strokeweight="0">
           <v:textbox inset="0,0,0,0">
             <w:txbxContent>
               <w:p>
@@ -3062,7 +3117,7 @@
 </file>
 
 <file path=word/footer7.xml><?xml version="1.0" encoding="utf-8"?>
-<w:ftr xmlns:wpc="http://schemas.microsoft.com/office/word/2010/wordprocessingCanvas" xmlns:cx="http://schemas.microsoft.com/office/drawing/2014/chartex" xmlns:cx1="http://schemas.microsoft.com/office/drawing/2015/9/8/chartex" xmlns:cx2="http://schemas.microsoft.com/office/drawing/2015/10/21/chartex" xmlns:cx3="http://schemas.microsoft.com/office/drawing/2016/5/9/chartex" xmlns:cx4="http://schemas.microsoft.com/office/drawing/2016/5/10/chartex" xmlns:cx5="http://schemas.microsoft.com/office/drawing/2016/5/11/chartex" xmlns:cx6="http://schemas.microsoft.com/office/drawing/2016/5/12/chartex" xmlns:cx7="http://schemas.microsoft.com/office/drawing/2016/5/13/chartex" xmlns:cx8="http://schemas.microsoft.com/office/drawing/2016/5/14/chartex" xmlns:mc="http://schemas.openxmlformats.org/markup-compatibility/2006" xmlns:aink="http://schemas.microsoft.com/office/drawing/2016/ink" xmlns:am3d="http://schemas.microsoft.com/office/drawing/2017/model3d" xmlns:o="urn:schemas-microsoft-com:office:office" xmlns:oel="http://schemas.microsoft.com/office/2019/extlst" xmlns:r="http://schemas.openxmlformats.org/officeDocument/2006/relationships" xmlns:m="http://schemas.openxmlformats.org/officeDocument/2006/math" xmlns:v="urn:schemas-microsoft-com:vml" xmlns:wp14="http://schemas.microsoft.com/office/word/2010/wordprocessingDrawing" xmlns:wp="http://schemas.openxmlformats.org/drawingml/2006/wordprocessingDrawing" xmlns:w10="urn:schemas-microsoft-com:office:word" xmlns:w="http://schemas.openxmlformats.org/wordprocessingml/2006/main" xmlns:w14="http://schemas.microsoft.com/office/word/2010/wordml" xmlns:w15="http://schemas.microsoft.com/office/word/2012/wordml" xmlns:w16cex="http://schemas.microsoft.com/office/word/2018/wordml/cex" xmlns:w16cid="http://schemas.microsoft.com/office/word/2016/wordml/cid" xmlns:w16="http://schemas.microsoft.com/office/word/2018/wordml" xmlns:w16du="http://schemas.microsoft.com/office/word/2023/wordml/word16du" xmlns:w16sdtdh="http://schemas.microsoft.com/office/word/2020/wordml/sdtdatahash" xmlns:w16se="http://schemas.microsoft.com/office/word/2015/wordml/symex" xmlns:wpg="http://schemas.microsoft.com/office/word/2010/wordprocessingGroup" xmlns:wpi="http://schemas.microsoft.com/office/word/2010/wordprocessingInk" xmlns:wne="http://schemas.microsoft.com/office/word/2006/wordml" xmlns:wps="http://schemas.microsoft.com/office/word/2010/wordprocessingShape" mc:Ignorable="w14 w15 w16se w16cid w16 w16cex w16sdtdh w16du wp14">
+<w:ftr xmlns:wpc="http://schemas.microsoft.com/office/word/2010/wordprocessingCanvas" xmlns:cx="http://schemas.microsoft.com/office/drawing/2014/chartex" xmlns:cx1="http://schemas.microsoft.com/office/drawing/2015/9/8/chartex" xmlns:cx2="http://schemas.microsoft.com/office/drawing/2015/10/21/chartex" xmlns:cx3="http://schemas.microsoft.com/office/drawing/2016/5/9/chartex" xmlns:cx4="http://schemas.microsoft.com/office/drawing/2016/5/10/chartex" xmlns:cx5="http://schemas.microsoft.com/office/drawing/2016/5/11/chartex" xmlns:cx6="http://schemas.microsoft.com/office/drawing/2016/5/12/chartex" xmlns:cx7="http://schemas.microsoft.com/office/drawing/2016/5/13/chartex" xmlns:cx8="http://schemas.microsoft.com/office/drawing/2016/5/14/chartex" xmlns:mc="http://schemas.openxmlformats.org/markup-compatibility/2006" xmlns:aink="http://schemas.microsoft.com/office/drawing/2016/ink" xmlns:am3d="http://schemas.microsoft.com/office/drawing/2017/model3d" xmlns:o="urn:schemas-microsoft-com:office:office" xmlns:r="http://schemas.openxmlformats.org/officeDocument/2006/relationships" xmlns:m="http://schemas.openxmlformats.org/officeDocument/2006/math" xmlns:v="urn:schemas-microsoft-com:vml" xmlns:wp14="http://schemas.microsoft.com/office/word/2010/wordprocessingDrawing" xmlns:wp="http://schemas.openxmlformats.org/drawingml/2006/wordprocessingDrawing" xmlns:w10="urn:schemas-microsoft-com:office:word" xmlns:w="http://schemas.openxmlformats.org/wordprocessingml/2006/main" xmlns:w14="http://schemas.microsoft.com/office/word/2010/wordml" xmlns:w15="http://schemas.microsoft.com/office/word/2012/wordml" xmlns:w16cex="http://schemas.microsoft.com/office/word/2018/wordml/cex" xmlns:w16cid="http://schemas.microsoft.com/office/word/2016/wordml/cid" xmlns:w16="http://schemas.microsoft.com/office/word/2018/wordml" xmlns:w16sdtdh="http://schemas.microsoft.com/office/word/2020/wordml/sdtdatahash" xmlns:w16se="http://schemas.microsoft.com/office/word/2015/wordml/symex" xmlns:wpg="http://schemas.microsoft.com/office/word/2010/wordprocessingGroup" xmlns:wpi="http://schemas.microsoft.com/office/word/2010/wordprocessingInk" xmlns:wne="http://schemas.microsoft.com/office/word/2006/wordml" xmlns:wps="http://schemas.microsoft.com/office/word/2010/wordprocessingShape" mc:Ignorable="w14 w15 w16se w16cid w16 w16cex w16sdtdh wp14">
   <w:p>
     <w:pPr>
       <w:pStyle w:val="normal1"/>
@@ -3072,7 +3127,7 @@
 </file>
 
 <file path=word/footnotes.xml><?xml version="1.0" encoding="utf-8"?>
-<w:footnotes xmlns:wpc="http://schemas.microsoft.com/office/word/2010/wordprocessingCanvas" xmlns:cx="http://schemas.microsoft.com/office/drawing/2014/chartex" xmlns:cx1="http://schemas.microsoft.com/office/drawing/2015/9/8/chartex" xmlns:cx2="http://schemas.microsoft.com/office/drawing/2015/10/21/chartex" xmlns:cx3="http://schemas.microsoft.com/office/drawing/2016/5/9/chartex" xmlns:cx4="http://schemas.microsoft.com/office/drawing/2016/5/10/chartex" xmlns:cx5="http://schemas.microsoft.com/office/drawing/2016/5/11/chartex" xmlns:cx6="http://schemas.microsoft.com/office/drawing/2016/5/12/chartex" xmlns:cx7="http://schemas.microsoft.com/office/drawing/2016/5/13/chartex" xmlns:cx8="http://schemas.microsoft.com/office/drawing/2016/5/14/chartex" xmlns:mc="http://schemas.openxmlformats.org/markup-compatibility/2006" xmlns:aink="http://schemas.microsoft.com/office/drawing/2016/ink" xmlns:am3d="http://schemas.microsoft.com/office/drawing/2017/model3d" xmlns:o="urn:schemas-microsoft-com:office:office" xmlns:oel="http://schemas.microsoft.com/office/2019/extlst" xmlns:r="http://schemas.openxmlformats.org/officeDocument/2006/relationships" xmlns:m="http://schemas.openxmlformats.org/officeDocument/2006/math" xmlns:v="urn:schemas-microsoft-com:vml" xmlns:wp14="http://schemas.microsoft.com/office/word/2010/wordprocessingDrawing" xmlns:wp="http://schemas.openxmlformats.org/drawingml/2006/wordprocessingDrawing" xmlns:w10="urn:schemas-microsoft-com:office:word" xmlns:w="http://schemas.openxmlformats.org/wordprocessingml/2006/main" xmlns:w14="http://schemas.microsoft.com/office/word/2010/wordml" xmlns:w15="http://schemas.microsoft.com/office/word/2012/wordml" xmlns:w16cex="http://schemas.microsoft.com/office/word/2018/wordml/cex" xmlns:w16cid="http://schemas.microsoft.com/office/word/2016/wordml/cid" xmlns:w16="http://schemas.microsoft.com/office/word/2018/wordml" xmlns:w16du="http://schemas.microsoft.com/office/word/2023/wordml/word16du" xmlns:w16sdtdh="http://schemas.microsoft.com/office/word/2020/wordml/sdtdatahash" xmlns:w16se="http://schemas.microsoft.com/office/word/2015/wordml/symex" xmlns:wpg="http://schemas.microsoft.com/office/word/2010/wordprocessingGroup" xmlns:wpi="http://schemas.microsoft.com/office/word/2010/wordprocessingInk" xmlns:wne="http://schemas.microsoft.com/office/word/2006/wordml" xmlns:wps="http://schemas.microsoft.com/office/word/2010/wordprocessingShape" mc:Ignorable="w14 w15 w16se w16cid w16 w16cex w16sdtdh w16du wp14">
+<w:footnotes xmlns:wpc="http://schemas.microsoft.com/office/word/2010/wordprocessingCanvas" xmlns:cx="http://schemas.microsoft.com/office/drawing/2014/chartex" xmlns:cx1="http://schemas.microsoft.com/office/drawing/2015/9/8/chartex" xmlns:cx2="http://schemas.microsoft.com/office/drawing/2015/10/21/chartex" xmlns:cx3="http://schemas.microsoft.com/office/drawing/2016/5/9/chartex" xmlns:cx4="http://schemas.microsoft.com/office/drawing/2016/5/10/chartex" xmlns:cx5="http://schemas.microsoft.com/office/drawing/2016/5/11/chartex" xmlns:cx6="http://schemas.microsoft.com/office/drawing/2016/5/12/chartex" xmlns:cx7="http://schemas.microsoft.com/office/drawing/2016/5/13/chartex" xmlns:cx8="http://schemas.microsoft.com/office/drawing/2016/5/14/chartex" xmlns:mc="http://schemas.openxmlformats.org/markup-compatibility/2006" xmlns:aink="http://schemas.microsoft.com/office/drawing/2016/ink" xmlns:am3d="http://schemas.microsoft.com/office/drawing/2017/model3d" xmlns:o="urn:schemas-microsoft-com:office:office" xmlns:r="http://schemas.openxmlformats.org/officeDocument/2006/relationships" xmlns:m="http://schemas.openxmlformats.org/officeDocument/2006/math" xmlns:v="urn:schemas-microsoft-com:vml" xmlns:wp14="http://schemas.microsoft.com/office/word/2010/wordprocessingDrawing" xmlns:wp="http://schemas.openxmlformats.org/drawingml/2006/wordprocessingDrawing" xmlns:w10="urn:schemas-microsoft-com:office:word" xmlns:w="http://schemas.openxmlformats.org/wordprocessingml/2006/main" xmlns:w14="http://schemas.microsoft.com/office/word/2010/wordml" xmlns:w15="http://schemas.microsoft.com/office/word/2012/wordml" xmlns:w16cex="http://schemas.microsoft.com/office/word/2018/wordml/cex" xmlns:w16cid="http://schemas.microsoft.com/office/word/2016/wordml/cid" xmlns:w16="http://schemas.microsoft.com/office/word/2018/wordml" xmlns:w16sdtdh="http://schemas.microsoft.com/office/word/2020/wordml/sdtdatahash" xmlns:w16se="http://schemas.microsoft.com/office/word/2015/wordml/symex" xmlns:wpg="http://schemas.microsoft.com/office/word/2010/wordprocessingGroup" xmlns:wpi="http://schemas.microsoft.com/office/word/2010/wordprocessingInk" xmlns:wne="http://schemas.microsoft.com/office/word/2006/wordml" xmlns:wps="http://schemas.microsoft.com/office/word/2010/wordprocessingShape" mc:Ignorable="w14 w15 w16se w16cid w16 w16cex w16sdtdh wp14">
   <w:footnote w:type="separator" w:id="-1">
     <w:p>
       <w:r>
@@ -3091,7 +3146,7 @@
 </file>
 
 <file path=word/header1.xml><?xml version="1.0" encoding="utf-8"?>
-<w:hdr xmlns:wpc="http://schemas.microsoft.com/office/word/2010/wordprocessingCanvas" xmlns:cx="http://schemas.microsoft.com/office/drawing/2014/chartex" xmlns:cx1="http://schemas.microsoft.com/office/drawing/2015/9/8/chartex" xmlns:cx2="http://schemas.microsoft.com/office/drawing/2015/10/21/chartex" xmlns:cx3="http://schemas.microsoft.com/office/drawing/2016/5/9/chartex" xmlns:cx4="http://schemas.microsoft.com/office/drawing/2016/5/10/chartex" xmlns:cx5="http://schemas.microsoft.com/office/drawing/2016/5/11/chartex" xmlns:cx6="http://schemas.microsoft.com/office/drawing/2016/5/12/chartex" xmlns:cx7="http://schemas.microsoft.com/office/drawing/2016/5/13/chartex" xmlns:cx8="http://schemas.microsoft.com/office/drawing/2016/5/14/chartex" xmlns:mc="http://schemas.openxmlformats.org/markup-compatibility/2006" xmlns:aink="http://schemas.microsoft.com/office/drawing/2016/ink" xmlns:am3d="http://schemas.microsoft.com/office/drawing/2017/model3d" xmlns:o="urn:schemas-microsoft-com:office:office" xmlns:oel="http://schemas.microsoft.com/office/2019/extlst" xmlns:r="http://schemas.openxmlformats.org/officeDocument/2006/relationships" xmlns:m="http://schemas.openxmlformats.org/officeDocument/2006/math" xmlns:v="urn:schemas-microsoft-com:vml" xmlns:wp14="http://schemas.microsoft.com/office/word/2010/wordprocessingDrawing" xmlns:wp="http://schemas.openxmlformats.org/drawingml/2006/wordprocessingDrawing" xmlns:w10="urn:schemas-microsoft-com:office:word" xmlns:w="http://schemas.openxmlformats.org/wordprocessingml/2006/main" xmlns:w14="http://schemas.microsoft.com/office/word/2010/wordml" xmlns:w15="http://schemas.microsoft.com/office/word/2012/wordml" xmlns:w16cex="http://schemas.microsoft.com/office/word/2018/wordml/cex" xmlns:w16cid="http://schemas.microsoft.com/office/word/2016/wordml/cid" xmlns:w16="http://schemas.microsoft.com/office/word/2018/wordml" xmlns:w16du="http://schemas.microsoft.com/office/word/2023/wordml/word16du" xmlns:w16sdtdh="http://schemas.microsoft.com/office/word/2020/wordml/sdtdatahash" xmlns:w16se="http://schemas.microsoft.com/office/word/2015/wordml/symex" xmlns:wpg="http://schemas.microsoft.com/office/word/2010/wordprocessingGroup" xmlns:wpi="http://schemas.microsoft.com/office/word/2010/wordprocessingInk" xmlns:wne="http://schemas.microsoft.com/office/word/2006/wordml" xmlns:wps="http://schemas.microsoft.com/office/word/2010/wordprocessingShape" mc:Ignorable="w14 w15 w16se w16cid w16 w16cex w16sdtdh w16du wp14">
+<w:hdr xmlns:wpc="http://schemas.microsoft.com/office/word/2010/wordprocessingCanvas" xmlns:cx="http://schemas.microsoft.com/office/drawing/2014/chartex" xmlns:cx1="http://schemas.microsoft.com/office/drawing/2015/9/8/chartex" xmlns:cx2="http://schemas.microsoft.com/office/drawing/2015/10/21/chartex" xmlns:cx3="http://schemas.microsoft.com/office/drawing/2016/5/9/chartex" xmlns:cx4="http://schemas.microsoft.com/office/drawing/2016/5/10/chartex" xmlns:cx5="http://schemas.microsoft.com/office/drawing/2016/5/11/chartex" xmlns:cx6="http://schemas.microsoft.com/office/drawing/2016/5/12/chartex" xmlns:cx7="http://schemas.microsoft.com/office/drawing/2016/5/13/chartex" xmlns:cx8="http://schemas.microsoft.com/office/drawing/2016/5/14/chartex" xmlns:mc="http://schemas.openxmlformats.org/markup-compatibility/2006" xmlns:aink="http://schemas.microsoft.com/office/drawing/2016/ink" xmlns:am3d="http://schemas.microsoft.com/office/drawing/2017/model3d" xmlns:o="urn:schemas-microsoft-com:office:office" xmlns:r="http://schemas.openxmlformats.org/officeDocument/2006/relationships" xmlns:m="http://schemas.openxmlformats.org/officeDocument/2006/math" xmlns:v="urn:schemas-microsoft-com:vml" xmlns:wp14="http://schemas.microsoft.com/office/word/2010/wordprocessingDrawing" xmlns:wp="http://schemas.openxmlformats.org/drawingml/2006/wordprocessingDrawing" xmlns:w10="urn:schemas-microsoft-com:office:word" xmlns:w="http://schemas.openxmlformats.org/wordprocessingml/2006/main" xmlns:w14="http://schemas.microsoft.com/office/word/2010/wordml" xmlns:w15="http://schemas.microsoft.com/office/word/2012/wordml" xmlns:w16cex="http://schemas.microsoft.com/office/word/2018/wordml/cex" xmlns:w16cid="http://schemas.microsoft.com/office/word/2016/wordml/cid" xmlns:w16="http://schemas.microsoft.com/office/word/2018/wordml" xmlns:w16sdtdh="http://schemas.microsoft.com/office/word/2020/wordml/sdtdatahash" xmlns:w16se="http://schemas.microsoft.com/office/word/2015/wordml/symex" xmlns:wpg="http://schemas.microsoft.com/office/word/2010/wordprocessingGroup" xmlns:wpi="http://schemas.microsoft.com/office/word/2010/wordprocessingInk" xmlns:wne="http://schemas.microsoft.com/office/word/2006/wordml" xmlns:wps="http://schemas.microsoft.com/office/word/2010/wordprocessingShape" mc:Ignorable="w14 w15 w16se w16cid w16 w16cex w16sdtdh wp14">
   <w:p>
     <w:pPr>
       <w:pStyle w:val="Encabezado"/>
@@ -3101,7 +3156,7 @@
 </file>
 
 <file path=word/header2.xml><?xml version="1.0" encoding="utf-8"?>
-<w:hdr xmlns:wpc="http://schemas.microsoft.com/office/word/2010/wordprocessingCanvas" xmlns:cx="http://schemas.microsoft.com/office/drawing/2014/chartex" xmlns:cx1="http://schemas.microsoft.com/office/drawing/2015/9/8/chartex" xmlns:cx2="http://schemas.microsoft.com/office/drawing/2015/10/21/chartex" xmlns:cx3="http://schemas.microsoft.com/office/drawing/2016/5/9/chartex" xmlns:cx4="http://schemas.microsoft.com/office/drawing/2016/5/10/chartex" xmlns:cx5="http://schemas.microsoft.com/office/drawing/2016/5/11/chartex" xmlns:cx6="http://schemas.microsoft.com/office/drawing/2016/5/12/chartex" xmlns:cx7="http://schemas.microsoft.com/office/drawing/2016/5/13/chartex" xmlns:cx8="http://schemas.microsoft.com/office/drawing/2016/5/14/chartex" xmlns:mc="http://schemas.openxmlformats.org/markup-compatibility/2006" xmlns:aink="http://schemas.microsoft.com/office/drawing/2016/ink" xmlns:am3d="http://schemas.microsoft.com/office/drawing/2017/model3d" xmlns:o="urn:schemas-microsoft-com:office:office" xmlns:oel="http://schemas.microsoft.com/office/2019/extlst" xmlns:r="http://schemas.openxmlformats.org/officeDocument/2006/relationships" xmlns:m="http://schemas.openxmlformats.org/officeDocument/2006/math" xmlns:v="urn:schemas-microsoft-com:vml" xmlns:wp14="http://schemas.microsoft.com/office/word/2010/wordprocessingDrawing" xmlns:wp="http://schemas.openxmlformats.org/drawingml/2006/wordprocessingDrawing" xmlns:w10="urn:schemas-microsoft-com:office:word" xmlns:w="http://schemas.openxmlformats.org/wordprocessingml/2006/main" xmlns:w14="http://schemas.microsoft.com/office/word/2010/wordml" xmlns:w15="http://schemas.microsoft.com/office/word/2012/wordml" xmlns:w16cex="http://schemas.microsoft.com/office/word/2018/wordml/cex" xmlns:w16cid="http://schemas.microsoft.com/office/word/2016/wordml/cid" xmlns:w16="http://schemas.microsoft.com/office/word/2018/wordml" xmlns:w16du="http://schemas.microsoft.com/office/word/2023/wordml/word16du" xmlns:w16sdtdh="http://schemas.microsoft.com/office/word/2020/wordml/sdtdatahash" xmlns:w16se="http://schemas.microsoft.com/office/word/2015/wordml/symex" xmlns:wpg="http://schemas.microsoft.com/office/word/2010/wordprocessingGroup" xmlns:wpi="http://schemas.microsoft.com/office/word/2010/wordprocessingInk" xmlns:wne="http://schemas.microsoft.com/office/word/2006/wordml" xmlns:wps="http://schemas.microsoft.com/office/word/2010/wordprocessingShape" mc:Ignorable="w14 w15 w16se w16cid w16 w16cex w16sdtdh w16du wp14">
+<w:hdr xmlns:wpc="http://schemas.microsoft.com/office/word/2010/wordprocessingCanvas" xmlns:cx="http://schemas.microsoft.com/office/drawing/2014/chartex" xmlns:cx1="http://schemas.microsoft.com/office/drawing/2015/9/8/chartex" xmlns:cx2="http://schemas.microsoft.com/office/drawing/2015/10/21/chartex" xmlns:cx3="http://schemas.microsoft.com/office/drawing/2016/5/9/chartex" xmlns:cx4="http://schemas.microsoft.com/office/drawing/2016/5/10/chartex" xmlns:cx5="http://schemas.microsoft.com/office/drawing/2016/5/11/chartex" xmlns:cx6="http://schemas.microsoft.com/office/drawing/2016/5/12/chartex" xmlns:cx7="http://schemas.microsoft.com/office/drawing/2016/5/13/chartex" xmlns:cx8="http://schemas.microsoft.com/office/drawing/2016/5/14/chartex" xmlns:mc="http://schemas.openxmlformats.org/markup-compatibility/2006" xmlns:aink="http://schemas.microsoft.com/office/drawing/2016/ink" xmlns:am3d="http://schemas.microsoft.com/office/drawing/2017/model3d" xmlns:o="urn:schemas-microsoft-com:office:office" xmlns:r="http://schemas.openxmlformats.org/officeDocument/2006/relationships" xmlns:m="http://schemas.openxmlformats.org/officeDocument/2006/math" xmlns:v="urn:schemas-microsoft-com:vml" xmlns:wp14="http://schemas.microsoft.com/office/word/2010/wordprocessingDrawing" xmlns:wp="http://schemas.openxmlformats.org/drawingml/2006/wordprocessingDrawing" xmlns:w10="urn:schemas-microsoft-com:office:word" xmlns:w="http://schemas.openxmlformats.org/wordprocessingml/2006/main" xmlns:w14="http://schemas.microsoft.com/office/word/2010/wordml" xmlns:w15="http://schemas.microsoft.com/office/word/2012/wordml" xmlns:w16cex="http://schemas.microsoft.com/office/word/2018/wordml/cex" xmlns:w16cid="http://schemas.microsoft.com/office/word/2016/wordml/cid" xmlns:w16="http://schemas.microsoft.com/office/word/2018/wordml" xmlns:w16sdtdh="http://schemas.microsoft.com/office/word/2020/wordml/sdtdatahash" xmlns:w16se="http://schemas.microsoft.com/office/word/2015/wordml/symex" xmlns:wpg="http://schemas.microsoft.com/office/word/2010/wordprocessingGroup" xmlns:wpi="http://schemas.microsoft.com/office/word/2010/wordprocessingInk" xmlns:wne="http://schemas.microsoft.com/office/word/2006/wordml" xmlns:wps="http://schemas.microsoft.com/office/word/2010/wordprocessingShape" mc:Ignorable="w14 w15 w16se w16cid w16 w16cex w16sdtdh wp14">
   <w:p>
     <w:pPr>
       <w:pStyle w:val="normal1"/>
@@ -3224,7 +3279,7 @@
 </file>
 
 <file path=word/header3.xml><?xml version="1.0" encoding="utf-8"?>
-<w:hdr xmlns:wpc="http://schemas.microsoft.com/office/word/2010/wordprocessingCanvas" xmlns:cx="http://schemas.microsoft.com/office/drawing/2014/chartex" xmlns:cx1="http://schemas.microsoft.com/office/drawing/2015/9/8/chartex" xmlns:cx2="http://schemas.microsoft.com/office/drawing/2015/10/21/chartex" xmlns:cx3="http://schemas.microsoft.com/office/drawing/2016/5/9/chartex" xmlns:cx4="http://schemas.microsoft.com/office/drawing/2016/5/10/chartex" xmlns:cx5="http://schemas.microsoft.com/office/drawing/2016/5/11/chartex" xmlns:cx6="http://schemas.microsoft.com/office/drawing/2016/5/12/chartex" xmlns:cx7="http://schemas.microsoft.com/office/drawing/2016/5/13/chartex" xmlns:cx8="http://schemas.microsoft.com/office/drawing/2016/5/14/chartex" xmlns:mc="http://schemas.openxmlformats.org/markup-compatibility/2006" xmlns:aink="http://schemas.microsoft.com/office/drawing/2016/ink" xmlns:am3d="http://schemas.microsoft.com/office/drawing/2017/model3d" xmlns:o="urn:schemas-microsoft-com:office:office" xmlns:oel="http://schemas.microsoft.com/office/2019/extlst" xmlns:r="http://schemas.openxmlformats.org/officeDocument/2006/relationships" xmlns:m="http://schemas.openxmlformats.org/officeDocument/2006/math" xmlns:v="urn:schemas-microsoft-com:vml" xmlns:wp14="http://schemas.microsoft.com/office/word/2010/wordprocessingDrawing" xmlns:wp="http://schemas.openxmlformats.org/drawingml/2006/wordprocessingDrawing" xmlns:w10="urn:schemas-microsoft-com:office:word" xmlns:w="http://schemas.openxmlformats.org/wordprocessingml/2006/main" xmlns:w14="http://schemas.microsoft.com/office/word/2010/wordml" xmlns:w15="http://schemas.microsoft.com/office/word/2012/wordml" xmlns:w16cex="http://schemas.microsoft.com/office/word/2018/wordml/cex" xmlns:w16cid="http://schemas.microsoft.com/office/word/2016/wordml/cid" xmlns:w16="http://schemas.microsoft.com/office/word/2018/wordml" xmlns:w16du="http://schemas.microsoft.com/office/word/2023/wordml/word16du" xmlns:w16sdtdh="http://schemas.microsoft.com/office/word/2020/wordml/sdtdatahash" xmlns:w16se="http://schemas.microsoft.com/office/word/2015/wordml/symex" xmlns:wpg="http://schemas.microsoft.com/office/word/2010/wordprocessingGroup" xmlns:wpi="http://schemas.microsoft.com/office/word/2010/wordprocessingInk" xmlns:wne="http://schemas.microsoft.com/office/word/2006/wordml" xmlns:wps="http://schemas.microsoft.com/office/word/2010/wordprocessingShape" mc:Ignorable="w14 w15 w16se w16cid w16 w16cex w16sdtdh w16du wp14">
+<w:hdr xmlns:wpc="http://schemas.microsoft.com/office/word/2010/wordprocessingCanvas" xmlns:cx="http://schemas.microsoft.com/office/drawing/2014/chartex" xmlns:cx1="http://schemas.microsoft.com/office/drawing/2015/9/8/chartex" xmlns:cx2="http://schemas.microsoft.com/office/drawing/2015/10/21/chartex" xmlns:cx3="http://schemas.microsoft.com/office/drawing/2016/5/9/chartex" xmlns:cx4="http://schemas.microsoft.com/office/drawing/2016/5/10/chartex" xmlns:cx5="http://schemas.microsoft.com/office/drawing/2016/5/11/chartex" xmlns:cx6="http://schemas.microsoft.com/office/drawing/2016/5/12/chartex" xmlns:cx7="http://schemas.microsoft.com/office/drawing/2016/5/13/chartex" xmlns:cx8="http://schemas.microsoft.com/office/drawing/2016/5/14/chartex" xmlns:mc="http://schemas.openxmlformats.org/markup-compatibility/2006" xmlns:aink="http://schemas.microsoft.com/office/drawing/2016/ink" xmlns:am3d="http://schemas.microsoft.com/office/drawing/2017/model3d" xmlns:o="urn:schemas-microsoft-com:office:office" xmlns:r="http://schemas.openxmlformats.org/officeDocument/2006/relationships" xmlns:m="http://schemas.openxmlformats.org/officeDocument/2006/math" xmlns:v="urn:schemas-microsoft-com:vml" xmlns:wp14="http://schemas.microsoft.com/office/word/2010/wordprocessingDrawing" xmlns:wp="http://schemas.openxmlformats.org/drawingml/2006/wordprocessingDrawing" xmlns:w10="urn:schemas-microsoft-com:office:word" xmlns:w="http://schemas.openxmlformats.org/wordprocessingml/2006/main" xmlns:w14="http://schemas.microsoft.com/office/word/2010/wordml" xmlns:w15="http://schemas.microsoft.com/office/word/2012/wordml" xmlns:w16cex="http://schemas.microsoft.com/office/word/2018/wordml/cex" xmlns:w16cid="http://schemas.microsoft.com/office/word/2016/wordml/cid" xmlns:w16="http://schemas.microsoft.com/office/word/2018/wordml" xmlns:w16sdtdh="http://schemas.microsoft.com/office/word/2020/wordml/sdtdatahash" xmlns:w16se="http://schemas.microsoft.com/office/word/2015/wordml/symex" xmlns:wpg="http://schemas.microsoft.com/office/word/2010/wordprocessingGroup" xmlns:wpi="http://schemas.microsoft.com/office/word/2010/wordprocessingInk" xmlns:wne="http://schemas.microsoft.com/office/word/2006/wordml" xmlns:wps="http://schemas.microsoft.com/office/word/2010/wordprocessingShape" mc:Ignorable="w14 w15 w16se w16cid w16 w16cex w16sdtdh wp14">
   <w:p>
     <w:pPr>
       <w:pStyle w:val="normal1"/>
@@ -3347,7 +3402,7 @@
 </file>
 
 <file path=word/header4.xml><?xml version="1.0" encoding="utf-8"?>
-<w:hdr xmlns:wpc="http://schemas.microsoft.com/office/word/2010/wordprocessingCanvas" xmlns:cx="http://schemas.microsoft.com/office/drawing/2014/chartex" xmlns:cx1="http://schemas.microsoft.com/office/drawing/2015/9/8/chartex" xmlns:cx2="http://schemas.microsoft.com/office/drawing/2015/10/21/chartex" xmlns:cx3="http://schemas.microsoft.com/office/drawing/2016/5/9/chartex" xmlns:cx4="http://schemas.microsoft.com/office/drawing/2016/5/10/chartex" xmlns:cx5="http://schemas.microsoft.com/office/drawing/2016/5/11/chartex" xmlns:cx6="http://schemas.microsoft.com/office/drawing/2016/5/12/chartex" xmlns:cx7="http://schemas.microsoft.com/office/drawing/2016/5/13/chartex" xmlns:cx8="http://schemas.microsoft.com/office/drawing/2016/5/14/chartex" xmlns:mc="http://schemas.openxmlformats.org/markup-compatibility/2006" xmlns:aink="http://schemas.microsoft.com/office/drawing/2016/ink" xmlns:am3d="http://schemas.microsoft.com/office/drawing/2017/model3d" xmlns:o="urn:schemas-microsoft-com:office:office" xmlns:oel="http://schemas.microsoft.com/office/2019/extlst" xmlns:r="http://schemas.openxmlformats.org/officeDocument/2006/relationships" xmlns:m="http://schemas.openxmlformats.org/officeDocument/2006/math" xmlns:v="urn:schemas-microsoft-com:vml" xmlns:wp14="http://schemas.microsoft.com/office/word/2010/wordprocessingDrawing" xmlns:wp="http://schemas.openxmlformats.org/drawingml/2006/wordprocessingDrawing" xmlns:w10="urn:schemas-microsoft-com:office:word" xmlns:w="http://schemas.openxmlformats.org/wordprocessingml/2006/main" xmlns:w14="http://schemas.microsoft.com/office/word/2010/wordml" xmlns:w15="http://schemas.microsoft.com/office/word/2012/wordml" xmlns:w16cex="http://schemas.microsoft.com/office/word/2018/wordml/cex" xmlns:w16cid="http://schemas.microsoft.com/office/word/2016/wordml/cid" xmlns:w16="http://schemas.microsoft.com/office/word/2018/wordml" xmlns:w16du="http://schemas.microsoft.com/office/word/2023/wordml/word16du" xmlns:w16sdtdh="http://schemas.microsoft.com/office/word/2020/wordml/sdtdatahash" xmlns:w16se="http://schemas.microsoft.com/office/word/2015/wordml/symex" xmlns:wpg="http://schemas.microsoft.com/office/word/2010/wordprocessingGroup" xmlns:wpi="http://schemas.microsoft.com/office/word/2010/wordprocessingInk" xmlns:wne="http://schemas.microsoft.com/office/word/2006/wordml" xmlns:wps="http://schemas.microsoft.com/office/word/2010/wordprocessingShape" mc:Ignorable="w14 w15 w16se w16cid w16 w16cex w16sdtdh w16du wp14">
+<w:hdr xmlns:wpc="http://schemas.microsoft.com/office/word/2010/wordprocessingCanvas" xmlns:cx="http://schemas.microsoft.com/office/drawing/2014/chartex" xmlns:cx1="http://schemas.microsoft.com/office/drawing/2015/9/8/chartex" xmlns:cx2="http://schemas.microsoft.com/office/drawing/2015/10/21/chartex" xmlns:cx3="http://schemas.microsoft.com/office/drawing/2016/5/9/chartex" xmlns:cx4="http://schemas.microsoft.com/office/drawing/2016/5/10/chartex" xmlns:cx5="http://schemas.microsoft.com/office/drawing/2016/5/11/chartex" xmlns:cx6="http://schemas.microsoft.com/office/drawing/2016/5/12/chartex" xmlns:cx7="http://schemas.microsoft.com/office/drawing/2016/5/13/chartex" xmlns:cx8="http://schemas.microsoft.com/office/drawing/2016/5/14/chartex" xmlns:mc="http://schemas.openxmlformats.org/markup-compatibility/2006" xmlns:aink="http://schemas.microsoft.com/office/drawing/2016/ink" xmlns:am3d="http://schemas.microsoft.com/office/drawing/2017/model3d" xmlns:o="urn:schemas-microsoft-com:office:office" xmlns:r="http://schemas.openxmlformats.org/officeDocument/2006/relationships" xmlns:m="http://schemas.openxmlformats.org/officeDocument/2006/math" xmlns:v="urn:schemas-microsoft-com:vml" xmlns:wp14="http://schemas.microsoft.com/office/word/2010/wordprocessingDrawing" xmlns:wp="http://schemas.openxmlformats.org/drawingml/2006/wordprocessingDrawing" xmlns:w10="urn:schemas-microsoft-com:office:word" xmlns:w="http://schemas.openxmlformats.org/wordprocessingml/2006/main" xmlns:w14="http://schemas.microsoft.com/office/word/2010/wordml" xmlns:w15="http://schemas.microsoft.com/office/word/2012/wordml" xmlns:w16cex="http://schemas.microsoft.com/office/word/2018/wordml/cex" xmlns:w16cid="http://schemas.microsoft.com/office/word/2016/wordml/cid" xmlns:w16="http://schemas.microsoft.com/office/word/2018/wordml" xmlns:w16sdtdh="http://schemas.microsoft.com/office/word/2020/wordml/sdtdatahash" xmlns:w16se="http://schemas.microsoft.com/office/word/2015/wordml/symex" xmlns:wpg="http://schemas.microsoft.com/office/word/2010/wordprocessingGroup" xmlns:wpi="http://schemas.microsoft.com/office/word/2010/wordprocessingInk" xmlns:wne="http://schemas.microsoft.com/office/word/2006/wordml" xmlns:wps="http://schemas.microsoft.com/office/word/2010/wordprocessingShape" mc:Ignorable="w14 w15 w16se w16cid w16 w16cex w16sdtdh wp14">
   <w:p>
     <w:pPr>
       <w:pStyle w:val="normal1"/>
@@ -3470,7 +3525,7 @@
 </file>
 
 <file path=word/header5.xml><?xml version="1.0" encoding="utf-8"?>
-<w:hdr xmlns:wpc="http://schemas.microsoft.com/office/word/2010/wordprocessingCanvas" xmlns:cx="http://schemas.microsoft.com/office/drawing/2014/chartex" xmlns:cx1="http://schemas.microsoft.com/office/drawing/2015/9/8/chartex" xmlns:cx2="http://schemas.microsoft.com/office/drawing/2015/10/21/chartex" xmlns:cx3="http://schemas.microsoft.com/office/drawing/2016/5/9/chartex" xmlns:cx4="http://schemas.microsoft.com/office/drawing/2016/5/10/chartex" xmlns:cx5="http://schemas.microsoft.com/office/drawing/2016/5/11/chartex" xmlns:cx6="http://schemas.microsoft.com/office/drawing/2016/5/12/chartex" xmlns:cx7="http://schemas.microsoft.com/office/drawing/2016/5/13/chartex" xmlns:cx8="http://schemas.microsoft.com/office/drawing/2016/5/14/chartex" xmlns:mc="http://schemas.openxmlformats.org/markup-compatibility/2006" xmlns:aink="http://schemas.microsoft.com/office/drawing/2016/ink" xmlns:am3d="http://schemas.microsoft.com/office/drawing/2017/model3d" xmlns:o="urn:schemas-microsoft-com:office:office" xmlns:oel="http://schemas.microsoft.com/office/2019/extlst" xmlns:r="http://schemas.openxmlformats.org/officeDocument/2006/relationships" xmlns:m="http://schemas.openxmlformats.org/officeDocument/2006/math" xmlns:v="urn:schemas-microsoft-com:vml" xmlns:wp14="http://schemas.microsoft.com/office/word/2010/wordprocessingDrawing" xmlns:wp="http://schemas.openxmlformats.org/drawingml/2006/wordprocessingDrawing" xmlns:w10="urn:schemas-microsoft-com:office:word" xmlns:w="http://schemas.openxmlformats.org/wordprocessingml/2006/main" xmlns:w14="http://schemas.microsoft.com/office/word/2010/wordml" xmlns:w15="http://schemas.microsoft.com/office/word/2012/wordml" xmlns:w16cex="http://schemas.microsoft.com/office/word/2018/wordml/cex" xmlns:w16cid="http://schemas.microsoft.com/office/word/2016/wordml/cid" xmlns:w16="http://schemas.microsoft.com/office/word/2018/wordml" xmlns:w16du="http://schemas.microsoft.com/office/word/2023/wordml/word16du" xmlns:w16sdtdh="http://schemas.microsoft.com/office/word/2020/wordml/sdtdatahash" xmlns:w16se="http://schemas.microsoft.com/office/word/2015/wordml/symex" xmlns:wpg="http://schemas.microsoft.com/office/word/2010/wordprocessingGroup" xmlns:wpi="http://schemas.microsoft.com/office/word/2010/wordprocessingInk" xmlns:wne="http://schemas.microsoft.com/office/word/2006/wordml" xmlns:wps="http://schemas.microsoft.com/office/word/2010/wordprocessingShape" mc:Ignorable="w14 w15 w16se w16cid w16 w16cex w16sdtdh w16du wp14">
+<w:hdr xmlns:wpc="http://schemas.microsoft.com/office/word/2010/wordprocessingCanvas" xmlns:cx="http://schemas.microsoft.com/office/drawing/2014/chartex" xmlns:cx1="http://schemas.microsoft.com/office/drawing/2015/9/8/chartex" xmlns:cx2="http://schemas.microsoft.com/office/drawing/2015/10/21/chartex" xmlns:cx3="http://schemas.microsoft.com/office/drawing/2016/5/9/chartex" xmlns:cx4="http://schemas.microsoft.com/office/drawing/2016/5/10/chartex" xmlns:cx5="http://schemas.microsoft.com/office/drawing/2016/5/11/chartex" xmlns:cx6="http://schemas.microsoft.com/office/drawing/2016/5/12/chartex" xmlns:cx7="http://schemas.microsoft.com/office/drawing/2016/5/13/chartex" xmlns:cx8="http://schemas.microsoft.com/office/drawing/2016/5/14/chartex" xmlns:mc="http://schemas.openxmlformats.org/markup-compatibility/2006" xmlns:aink="http://schemas.microsoft.com/office/drawing/2016/ink" xmlns:am3d="http://schemas.microsoft.com/office/drawing/2017/model3d" xmlns:o="urn:schemas-microsoft-com:office:office" xmlns:r="http://schemas.openxmlformats.org/officeDocument/2006/relationships" xmlns:m="http://schemas.openxmlformats.org/officeDocument/2006/math" xmlns:v="urn:schemas-microsoft-com:vml" xmlns:wp14="http://schemas.microsoft.com/office/word/2010/wordprocessingDrawing" xmlns:wp="http://schemas.openxmlformats.org/drawingml/2006/wordprocessingDrawing" xmlns:w10="urn:schemas-microsoft-com:office:word" xmlns:w="http://schemas.openxmlformats.org/wordprocessingml/2006/main" xmlns:w14="http://schemas.microsoft.com/office/word/2010/wordml" xmlns:w15="http://schemas.microsoft.com/office/word/2012/wordml" xmlns:w16cex="http://schemas.microsoft.com/office/word/2018/wordml/cex" xmlns:w16cid="http://schemas.microsoft.com/office/word/2016/wordml/cid" xmlns:w16="http://schemas.microsoft.com/office/word/2018/wordml" xmlns:w16sdtdh="http://schemas.microsoft.com/office/word/2020/wordml/sdtdatahash" xmlns:w16se="http://schemas.microsoft.com/office/word/2015/wordml/symex" xmlns:wpg="http://schemas.microsoft.com/office/word/2010/wordprocessingGroup" xmlns:wpi="http://schemas.microsoft.com/office/word/2010/wordprocessingInk" xmlns:wne="http://schemas.microsoft.com/office/word/2006/wordml" xmlns:wps="http://schemas.microsoft.com/office/word/2010/wordprocessingShape" mc:Ignorable="w14 w15 w16se w16cid w16 w16cex w16sdtdh wp14">
   <w:p>
     <w:pPr>
       <w:pStyle w:val="normal1"/>
@@ -3480,7 +3535,7 @@
 </file>
 
 <file path=word/header6.xml><?xml version="1.0" encoding="utf-8"?>
-<w:hdr xmlns:wpc="http://schemas.microsoft.com/office/word/2010/wordprocessingCanvas" xmlns:cx="http://schemas.microsoft.com/office/drawing/2014/chartex" xmlns:cx1="http://schemas.microsoft.com/office/drawing/2015/9/8/chartex" xmlns:cx2="http://schemas.microsoft.com/office/drawing/2015/10/21/chartex" xmlns:cx3="http://schemas.microsoft.com/office/drawing/2016/5/9/chartex" xmlns:cx4="http://schemas.microsoft.com/office/drawing/2016/5/10/chartex" xmlns:cx5="http://schemas.microsoft.com/office/drawing/2016/5/11/chartex" xmlns:cx6="http://schemas.microsoft.com/office/drawing/2016/5/12/chartex" xmlns:cx7="http://schemas.microsoft.com/office/drawing/2016/5/13/chartex" xmlns:cx8="http://schemas.microsoft.com/office/drawing/2016/5/14/chartex" xmlns:mc="http://schemas.openxmlformats.org/markup-compatibility/2006" xmlns:aink="http://schemas.microsoft.com/office/drawing/2016/ink" xmlns:am3d="http://schemas.microsoft.com/office/drawing/2017/model3d" xmlns:o="urn:schemas-microsoft-com:office:office" xmlns:oel="http://schemas.microsoft.com/office/2019/extlst" xmlns:r="http://schemas.openxmlformats.org/officeDocument/2006/relationships" xmlns:m="http://schemas.openxmlformats.org/officeDocument/2006/math" xmlns:v="urn:schemas-microsoft-com:vml" xmlns:wp14="http://schemas.microsoft.com/office/word/2010/wordprocessingDrawing" xmlns:wp="http://schemas.openxmlformats.org/drawingml/2006/wordprocessingDrawing" xmlns:w10="urn:schemas-microsoft-com:office:word" xmlns:w="http://schemas.openxmlformats.org/wordprocessingml/2006/main" xmlns:w14="http://schemas.microsoft.com/office/word/2010/wordml" xmlns:w15="http://schemas.microsoft.com/office/word/2012/wordml" xmlns:w16cex="http://schemas.microsoft.com/office/word/2018/wordml/cex" xmlns:w16cid="http://schemas.microsoft.com/office/word/2016/wordml/cid" xmlns:w16="http://schemas.microsoft.com/office/word/2018/wordml" xmlns:w16du="http://schemas.microsoft.com/office/word/2023/wordml/word16du" xmlns:w16sdtdh="http://schemas.microsoft.com/office/word/2020/wordml/sdtdatahash" xmlns:w16se="http://schemas.microsoft.com/office/word/2015/wordml/symex" xmlns:wpg="http://schemas.microsoft.com/office/word/2010/wordprocessingGroup" xmlns:wpi="http://schemas.microsoft.com/office/word/2010/wordprocessingInk" xmlns:wne="http://schemas.microsoft.com/office/word/2006/wordml" xmlns:wps="http://schemas.microsoft.com/office/word/2010/wordprocessingShape" mc:Ignorable="w14 w15 w16se w16cid w16 w16cex w16sdtdh w16du wp14">
+<w:hdr xmlns:wpc="http://schemas.microsoft.com/office/word/2010/wordprocessingCanvas" xmlns:cx="http://schemas.microsoft.com/office/drawing/2014/chartex" xmlns:cx1="http://schemas.microsoft.com/office/drawing/2015/9/8/chartex" xmlns:cx2="http://schemas.microsoft.com/office/drawing/2015/10/21/chartex" xmlns:cx3="http://schemas.microsoft.com/office/drawing/2016/5/9/chartex" xmlns:cx4="http://schemas.microsoft.com/office/drawing/2016/5/10/chartex" xmlns:cx5="http://schemas.microsoft.com/office/drawing/2016/5/11/chartex" xmlns:cx6="http://schemas.microsoft.com/office/drawing/2016/5/12/chartex" xmlns:cx7="http://schemas.microsoft.com/office/drawing/2016/5/13/chartex" xmlns:cx8="http://schemas.microsoft.com/office/drawing/2016/5/14/chartex" xmlns:mc="http://schemas.openxmlformats.org/markup-compatibility/2006" xmlns:aink="http://schemas.microsoft.com/office/drawing/2016/ink" xmlns:am3d="http://schemas.microsoft.com/office/drawing/2017/model3d" xmlns:o="urn:schemas-microsoft-com:office:office" xmlns:r="http://schemas.openxmlformats.org/officeDocument/2006/relationships" xmlns:m="http://schemas.openxmlformats.org/officeDocument/2006/math" xmlns:v="urn:schemas-microsoft-com:vml" xmlns:wp14="http://schemas.microsoft.com/office/word/2010/wordprocessingDrawing" xmlns:wp="http://schemas.openxmlformats.org/drawingml/2006/wordprocessingDrawing" xmlns:w10="urn:schemas-microsoft-com:office:word" xmlns:w="http://schemas.openxmlformats.org/wordprocessingml/2006/main" xmlns:w14="http://schemas.microsoft.com/office/word/2010/wordml" xmlns:w15="http://schemas.microsoft.com/office/word/2012/wordml" xmlns:w16cex="http://schemas.microsoft.com/office/word/2018/wordml/cex" xmlns:w16cid="http://schemas.microsoft.com/office/word/2016/wordml/cid" xmlns:w16="http://schemas.microsoft.com/office/word/2018/wordml" xmlns:w16sdtdh="http://schemas.microsoft.com/office/word/2020/wordml/sdtdatahash" xmlns:w16se="http://schemas.microsoft.com/office/word/2015/wordml/symex" xmlns:wpg="http://schemas.microsoft.com/office/word/2010/wordprocessingGroup" xmlns:wpi="http://schemas.microsoft.com/office/word/2010/wordprocessingInk" xmlns:wne="http://schemas.microsoft.com/office/word/2006/wordml" xmlns:wps="http://schemas.microsoft.com/office/word/2010/wordprocessingShape" mc:Ignorable="w14 w15 w16se w16cid w16 w16cex w16sdtdh wp14">
   <w:p>
     <w:pPr>
       <w:pStyle w:val="normal1"/>
@@ -3549,7 +3604,7 @@
 </file>
 
 <file path=word/header7.xml><?xml version="1.0" encoding="utf-8"?>
-<w:hdr xmlns:wpc="http://schemas.microsoft.com/office/word/2010/wordprocessingCanvas" xmlns:cx="http://schemas.microsoft.com/office/drawing/2014/chartex" xmlns:cx1="http://schemas.microsoft.com/office/drawing/2015/9/8/chartex" xmlns:cx2="http://schemas.microsoft.com/office/drawing/2015/10/21/chartex" xmlns:cx3="http://schemas.microsoft.com/office/drawing/2016/5/9/chartex" xmlns:cx4="http://schemas.microsoft.com/office/drawing/2016/5/10/chartex" xmlns:cx5="http://schemas.microsoft.com/office/drawing/2016/5/11/chartex" xmlns:cx6="http://schemas.microsoft.com/office/drawing/2016/5/12/chartex" xmlns:cx7="http://schemas.microsoft.com/office/drawing/2016/5/13/chartex" xmlns:cx8="http://schemas.microsoft.com/office/drawing/2016/5/14/chartex" xmlns:mc="http://schemas.openxmlformats.org/markup-compatibility/2006" xmlns:aink="http://schemas.microsoft.com/office/drawing/2016/ink" xmlns:am3d="http://schemas.microsoft.com/office/drawing/2017/model3d" xmlns:o="urn:schemas-microsoft-com:office:office" xmlns:oel="http://schemas.microsoft.com/office/2019/extlst" xmlns:r="http://schemas.openxmlformats.org/officeDocument/2006/relationships" xmlns:m="http://schemas.openxmlformats.org/officeDocument/2006/math" xmlns:v="urn:schemas-microsoft-com:vml" xmlns:wp14="http://schemas.microsoft.com/office/word/2010/wordprocessingDrawing" xmlns:wp="http://schemas.openxmlformats.org/drawingml/2006/wordprocessingDrawing" xmlns:w10="urn:schemas-microsoft-com:office:word" xmlns:w="http://schemas.openxmlformats.org/wordprocessingml/2006/main" xmlns:w14="http://schemas.microsoft.com/office/word/2010/wordml" xmlns:w15="http://schemas.microsoft.com/office/word/2012/wordml" xmlns:w16cex="http://schemas.microsoft.com/office/word/2018/wordml/cex" xmlns:w16cid="http://schemas.microsoft.com/office/word/2016/wordml/cid" xmlns:w16="http://schemas.microsoft.com/office/word/2018/wordml" xmlns:w16du="http://schemas.microsoft.com/office/word/2023/wordml/word16du" xmlns:w16sdtdh="http://schemas.microsoft.com/office/word/2020/wordml/sdtdatahash" xmlns:w16se="http://schemas.microsoft.com/office/word/2015/wordml/symex" xmlns:wpg="http://schemas.microsoft.com/office/word/2010/wordprocessingGroup" xmlns:wpi="http://schemas.microsoft.com/office/word/2010/wordprocessingInk" xmlns:wne="http://schemas.microsoft.com/office/word/2006/wordml" xmlns:wps="http://schemas.microsoft.com/office/word/2010/wordprocessingShape" mc:Ignorable="w14 w15 w16se w16cid w16 w16cex w16sdtdh w16du wp14">
+<w:hdr xmlns:wpc="http://schemas.microsoft.com/office/word/2010/wordprocessingCanvas" xmlns:cx="http://schemas.microsoft.com/office/drawing/2014/chartex" xmlns:cx1="http://schemas.microsoft.com/office/drawing/2015/9/8/chartex" xmlns:cx2="http://schemas.microsoft.com/office/drawing/2015/10/21/chartex" xmlns:cx3="http://schemas.microsoft.com/office/drawing/2016/5/9/chartex" xmlns:cx4="http://schemas.microsoft.com/office/drawing/2016/5/10/chartex" xmlns:cx5="http://schemas.microsoft.com/office/drawing/2016/5/11/chartex" xmlns:cx6="http://schemas.microsoft.com/office/drawing/2016/5/12/chartex" xmlns:cx7="http://schemas.microsoft.com/office/drawing/2016/5/13/chartex" xmlns:cx8="http://schemas.microsoft.com/office/drawing/2016/5/14/chartex" xmlns:mc="http://schemas.openxmlformats.org/markup-compatibility/2006" xmlns:aink="http://schemas.microsoft.com/office/drawing/2016/ink" xmlns:am3d="http://schemas.microsoft.com/office/drawing/2017/model3d" xmlns:o="urn:schemas-microsoft-com:office:office" xmlns:r="http://schemas.openxmlformats.org/officeDocument/2006/relationships" xmlns:m="http://schemas.openxmlformats.org/officeDocument/2006/math" xmlns:v="urn:schemas-microsoft-com:vml" xmlns:wp14="http://schemas.microsoft.com/office/word/2010/wordprocessingDrawing" xmlns:wp="http://schemas.openxmlformats.org/drawingml/2006/wordprocessingDrawing" xmlns:w10="urn:schemas-microsoft-com:office:word" xmlns:w="http://schemas.openxmlformats.org/wordprocessingml/2006/main" xmlns:w14="http://schemas.microsoft.com/office/word/2010/wordml" xmlns:w15="http://schemas.microsoft.com/office/word/2012/wordml" xmlns:w16cex="http://schemas.microsoft.com/office/word/2018/wordml/cex" xmlns:w16cid="http://schemas.microsoft.com/office/word/2016/wordml/cid" xmlns:w16="http://schemas.microsoft.com/office/word/2018/wordml" xmlns:w16sdtdh="http://schemas.microsoft.com/office/word/2020/wordml/sdtdatahash" xmlns:w16se="http://schemas.microsoft.com/office/word/2015/wordml/symex" xmlns:wpg="http://schemas.microsoft.com/office/word/2010/wordprocessingGroup" xmlns:wpi="http://schemas.microsoft.com/office/word/2010/wordprocessingInk" xmlns:wne="http://schemas.microsoft.com/office/word/2006/wordml" xmlns:wps="http://schemas.microsoft.com/office/word/2010/wordprocessingShape" mc:Ignorable="w14 w15 w16se w16cid w16 w16cex w16sdtdh wp14">
   <w:p>
     <w:pPr>
       <w:pStyle w:val="normal1"/>
@@ -3559,7 +3614,7 @@
 </file>
 
 <file path=word/numbering.xml><?xml version="1.0" encoding="utf-8"?>
-<w:numbering xmlns:wpc="http://schemas.microsoft.com/office/word/2010/wordprocessingCanvas" xmlns:cx="http://schemas.microsoft.com/office/drawing/2014/chartex" xmlns:cx1="http://schemas.microsoft.com/office/drawing/2015/9/8/chartex" xmlns:cx2="http://schemas.microsoft.com/office/drawing/2015/10/21/chartex" xmlns:cx3="http://schemas.microsoft.com/office/drawing/2016/5/9/chartex" xmlns:cx4="http://schemas.microsoft.com/office/drawing/2016/5/10/chartex" xmlns:cx5="http://schemas.microsoft.com/office/drawing/2016/5/11/chartex" xmlns:cx6="http://schemas.microsoft.com/office/drawing/2016/5/12/chartex" xmlns:cx7="http://schemas.microsoft.com/office/drawing/2016/5/13/chartex" xmlns:cx8="http://schemas.microsoft.com/office/drawing/2016/5/14/chartex" xmlns:mc="http://schemas.openxmlformats.org/markup-compatibility/2006" xmlns:aink="http://schemas.microsoft.com/office/drawing/2016/ink" xmlns:am3d="http://schemas.microsoft.com/office/drawing/2017/model3d" xmlns:o="urn:schemas-microsoft-com:office:office" xmlns:oel="http://schemas.microsoft.com/office/2019/extlst" xmlns:r="http://schemas.openxmlformats.org/officeDocument/2006/relationships" xmlns:m="http://schemas.openxmlformats.org/officeDocument/2006/math" xmlns:v="urn:schemas-microsoft-com:vml" xmlns:wp14="http://schemas.microsoft.com/office/word/2010/wordprocessingDrawing" xmlns:wp="http://schemas.openxmlformats.org/drawingml/2006/wordprocessingDrawing" xmlns:w10="urn:schemas-microsoft-com:office:word" xmlns:w="http://schemas.openxmlformats.org/wordprocessingml/2006/main" xmlns:w14="http://schemas.microsoft.com/office/word/2010/wordml" xmlns:w15="http://schemas.microsoft.com/office/word/2012/wordml" xmlns:w16cex="http://schemas.microsoft.com/office/word/2018/wordml/cex" xmlns:w16cid="http://schemas.microsoft.com/office/word/2016/wordml/cid" xmlns:w16="http://schemas.microsoft.com/office/word/2018/wordml" xmlns:w16du="http://schemas.microsoft.com/office/word/2023/wordml/word16du" xmlns:w16sdtdh="http://schemas.microsoft.com/office/word/2020/wordml/sdtdatahash" xmlns:w16se="http://schemas.microsoft.com/office/word/2015/wordml/symex" xmlns:wpg="http://schemas.microsoft.com/office/word/2010/wordprocessingGroup" xmlns:wpi="http://schemas.microsoft.com/office/word/2010/wordprocessingInk" xmlns:wne="http://schemas.microsoft.com/office/word/2006/wordml" xmlns:wps="http://schemas.microsoft.com/office/word/2010/wordprocessingShape" mc:Ignorable="w14 w15 w16se w16cid w16 w16cex w16sdtdh w16du wp14">
+<w:numbering xmlns:wpc="http://schemas.microsoft.com/office/word/2010/wordprocessingCanvas" xmlns:cx="http://schemas.microsoft.com/office/drawing/2014/chartex" xmlns:cx1="http://schemas.microsoft.com/office/drawing/2015/9/8/chartex" xmlns:cx2="http://schemas.microsoft.com/office/drawing/2015/10/21/chartex" xmlns:cx3="http://schemas.microsoft.com/office/drawing/2016/5/9/chartex" xmlns:cx4="http://schemas.microsoft.com/office/drawing/2016/5/10/chartex" xmlns:cx5="http://schemas.microsoft.com/office/drawing/2016/5/11/chartex" xmlns:cx6="http://schemas.microsoft.com/office/drawing/2016/5/12/chartex" xmlns:cx7="http://schemas.microsoft.com/office/drawing/2016/5/13/chartex" xmlns:cx8="http://schemas.microsoft.com/office/drawing/2016/5/14/chartex" xmlns:mc="http://schemas.openxmlformats.org/markup-compatibility/2006" xmlns:aink="http://schemas.microsoft.com/office/drawing/2016/ink" xmlns:am3d="http://schemas.microsoft.com/office/drawing/2017/model3d" xmlns:o="urn:schemas-microsoft-com:office:office" xmlns:r="http://schemas.openxmlformats.org/officeDocument/2006/relationships" xmlns:m="http://schemas.openxmlformats.org/officeDocument/2006/math" xmlns:v="urn:schemas-microsoft-com:vml" xmlns:wp14="http://schemas.microsoft.com/office/word/2010/wordprocessingDrawing" xmlns:wp="http://schemas.openxmlformats.org/drawingml/2006/wordprocessingDrawing" xmlns:w10="urn:schemas-microsoft-com:office:word" xmlns:w="http://schemas.openxmlformats.org/wordprocessingml/2006/main" xmlns:w14="http://schemas.microsoft.com/office/word/2010/wordml" xmlns:w15="http://schemas.microsoft.com/office/word/2012/wordml" xmlns:w16cex="http://schemas.microsoft.com/office/word/2018/wordml/cex" xmlns:w16cid="http://schemas.microsoft.com/office/word/2016/wordml/cid" xmlns:w16="http://schemas.microsoft.com/office/word/2018/wordml" xmlns:w16sdtdh="http://schemas.microsoft.com/office/word/2020/wordml/sdtdatahash" xmlns:w16se="http://schemas.microsoft.com/office/word/2015/wordml/symex" xmlns:wpg="http://schemas.microsoft.com/office/word/2010/wordprocessingGroup" xmlns:wpi="http://schemas.microsoft.com/office/word/2010/wordprocessingInk" xmlns:wne="http://schemas.microsoft.com/office/word/2006/wordml" xmlns:wps="http://schemas.microsoft.com/office/word/2010/wordprocessingShape" mc:Ignorable="w14 w15 w16se w16cid w16 w16cex w16sdtdh wp14">
   <w:abstractNum w:abstractNumId="0" w15:restartNumberingAfterBreak="0">
     <w:nsid w:val="082656B4"/>
     <w:multiLevelType w:val="multilevel"/>
@@ -3821,17 +3876,17 @@
       </w:rPr>
     </w:lvl>
   </w:abstractNum>
-  <w:num w:numId="1" w16cid:durableId="1708489374">
+  <w:num w:numId="1">
     <w:abstractNumId w:val="1"/>
   </w:num>
-  <w:num w:numId="2" w16cid:durableId="1874657823">
+  <w:num w:numId="2">
     <w:abstractNumId w:val="0"/>
   </w:num>
 </w:numbering>
 </file>
 
 <file path=word/styles.xml><?xml version="1.0" encoding="utf-8"?>
-<w:styles xmlns:mc="http://schemas.openxmlformats.org/markup-compatibility/2006" xmlns:r="http://schemas.openxmlformats.org/officeDocument/2006/relationships" xmlns:w="http://schemas.openxmlformats.org/wordprocessingml/2006/main" xmlns:w14="http://schemas.microsoft.com/office/word/2010/wordml" xmlns:w15="http://schemas.microsoft.com/office/word/2012/wordml" xmlns:w16cex="http://schemas.microsoft.com/office/word/2018/wordml/cex" xmlns:w16cid="http://schemas.microsoft.com/office/word/2016/wordml/cid" xmlns:w16="http://schemas.microsoft.com/office/word/2018/wordml" xmlns:w16du="http://schemas.microsoft.com/office/word/2023/wordml/word16du" xmlns:w16sdtdh="http://schemas.microsoft.com/office/word/2020/wordml/sdtdatahash" xmlns:w16se="http://schemas.microsoft.com/office/word/2015/wordml/symex" mc:Ignorable="w14 w15 w16se w16cid w16 w16cex w16sdtdh w16du">
+<w:styles xmlns:mc="http://schemas.openxmlformats.org/markup-compatibility/2006" xmlns:r="http://schemas.openxmlformats.org/officeDocument/2006/relationships" xmlns:w="http://schemas.openxmlformats.org/wordprocessingml/2006/main" xmlns:w14="http://schemas.microsoft.com/office/word/2010/wordml" xmlns:w15="http://schemas.microsoft.com/office/word/2012/wordml" xmlns:w16cex="http://schemas.microsoft.com/office/word/2018/wordml/cex" xmlns:w16cid="http://schemas.microsoft.com/office/word/2016/wordml/cid" xmlns:w16="http://schemas.microsoft.com/office/word/2018/wordml" xmlns:w16sdtdh="http://schemas.microsoft.com/office/word/2020/wordml/sdtdatahash" xmlns:w16se="http://schemas.microsoft.com/office/word/2015/wordml/symex" mc:Ignorable="w14 w15 w16se w16cid w16 w16cex w16sdtdh">
   <w:docDefaults>
     <w:rPrDefault>
       <w:rPr>

</xml_diff>

<commit_message>
Kevin Imanol Godoy Romo Aport
</commit_message>
<xml_diff>
--- a/Compuertas_ThirdTeam.docx
+++ b/Compuertas_ThirdTeam.docx
@@ -1,6 +1,6 @@
 
 <file path=word/document.xml><?xml version="1.0" encoding="utf-8"?>
-<w:document xmlns:wpc="http://schemas.microsoft.com/office/word/2010/wordprocessingCanvas" xmlns:cx="http://schemas.microsoft.com/office/drawing/2014/chartex" xmlns:cx1="http://schemas.microsoft.com/office/drawing/2015/9/8/chartex" xmlns:cx2="http://schemas.microsoft.com/office/drawing/2015/10/21/chartex" xmlns:cx3="http://schemas.microsoft.com/office/drawing/2016/5/9/chartex" xmlns:cx4="http://schemas.microsoft.com/office/drawing/2016/5/10/chartex" xmlns:cx5="http://schemas.microsoft.com/office/drawing/2016/5/11/chartex" xmlns:cx6="http://schemas.microsoft.com/office/drawing/2016/5/12/chartex" xmlns:cx7="http://schemas.microsoft.com/office/drawing/2016/5/13/chartex" xmlns:cx8="http://schemas.microsoft.com/office/drawing/2016/5/14/chartex" xmlns:mc="http://schemas.openxmlformats.org/markup-compatibility/2006" xmlns:aink="http://schemas.microsoft.com/office/drawing/2016/ink" xmlns:am3d="http://schemas.microsoft.com/office/drawing/2017/model3d" xmlns:o="urn:schemas-microsoft-com:office:office" xmlns:r="http://schemas.openxmlformats.org/officeDocument/2006/relationships" xmlns:m="http://schemas.openxmlformats.org/officeDocument/2006/math" xmlns:v="urn:schemas-microsoft-com:vml" xmlns:wp14="http://schemas.microsoft.com/office/word/2010/wordprocessingDrawing" xmlns:wp="http://schemas.openxmlformats.org/drawingml/2006/wordprocessingDrawing" xmlns:w10="urn:schemas-microsoft-com:office:word" xmlns:w="http://schemas.openxmlformats.org/wordprocessingml/2006/main" xmlns:w14="http://schemas.microsoft.com/office/word/2010/wordml" xmlns:w15="http://schemas.microsoft.com/office/word/2012/wordml" xmlns:w16cex="http://schemas.microsoft.com/office/word/2018/wordml/cex" xmlns:w16cid="http://schemas.microsoft.com/office/word/2016/wordml/cid" xmlns:w16="http://schemas.microsoft.com/office/word/2018/wordml" xmlns:w16sdtdh="http://schemas.microsoft.com/office/word/2020/wordml/sdtdatahash" xmlns:w16se="http://schemas.microsoft.com/office/word/2015/wordml/symex" xmlns:wpg="http://schemas.microsoft.com/office/word/2010/wordprocessingGroup" xmlns:wpi="http://schemas.microsoft.com/office/word/2010/wordprocessingInk" xmlns:wne="http://schemas.microsoft.com/office/word/2006/wordml" xmlns:wps="http://schemas.microsoft.com/office/word/2010/wordprocessingShape" mc:Ignorable="w14 w15 w16se w16cid w16 w16cex w16sdtdh wp14">
+<w:document xmlns:wpc="http://schemas.microsoft.com/office/word/2010/wordprocessingCanvas" xmlns:cx="http://schemas.microsoft.com/office/drawing/2014/chartex" xmlns:mc="http://schemas.openxmlformats.org/markup-compatibility/2006" xmlns:o="urn:schemas-microsoft-com:office:office" xmlns:r="http://schemas.openxmlformats.org/officeDocument/2006/relationships" xmlns:m="http://schemas.openxmlformats.org/officeDocument/2006/math" xmlns:v="urn:schemas-microsoft-com:vml" xmlns:wp14="http://schemas.microsoft.com/office/word/2010/wordprocessingDrawing" xmlns:wp="http://schemas.openxmlformats.org/drawingml/2006/wordprocessingDrawing" xmlns:w10="urn:schemas-microsoft-com:office:word" xmlns:w="http://schemas.openxmlformats.org/wordprocessingml/2006/main" xmlns:w14="http://schemas.microsoft.com/office/word/2010/wordml" xmlns:w15="http://schemas.microsoft.com/office/word/2012/wordml" xmlns:w16se="http://schemas.microsoft.com/office/word/2015/wordml/symex" xmlns:wpg="http://schemas.microsoft.com/office/word/2010/wordprocessingGroup" xmlns:wpi="http://schemas.microsoft.com/office/word/2010/wordprocessingInk" xmlns:wne="http://schemas.microsoft.com/office/word/2006/wordml" xmlns:wps="http://schemas.microsoft.com/office/word/2010/wordprocessingShape" mc:Ignorable="w14 w15 w16se wp14">
   <w:body>
     <w:p>
       <w:pPr>
@@ -141,6 +141,7 @@
           <w:color w:val="000000"/>
           <w:sz w:val="20"/>
           <w:szCs w:val="20"/>
+          <w:lang w:val="es-MX" w:eastAsia="es-MX" w:bidi="ar-SA"/>
         </w:rPr>
         <w:drawing>
           <wp:anchor distT="0" distB="0" distL="0" distR="0" simplePos="0" relativeHeight="32" behindDoc="0" locked="0" layoutInCell="1" allowOverlap="1" wp14:anchorId="46577844" wp14:editId="24AD9CA0">
@@ -582,7 +583,6 @@
           <w:lang w:val="es-MX"/>
         </w:rPr>
         <w:tab/>
-        <w:t xml:space="preserve">Creano </w:t>
       </w:r>
       <w:proofErr w:type="spellStart"/>
       <w:r>
@@ -592,6 +592,26 @@
           <w:szCs w:val="24"/>
           <w:lang w:val="es-MX"/>
         </w:rPr>
+        <w:t>Creano</w:t>
+      </w:r>
+      <w:proofErr w:type="spellEnd"/>
+      <w:r>
+        <w:rPr>
+          <w:b/>
+          <w:sz w:val="24"/>
+          <w:szCs w:val="24"/>
+          <w:lang w:val="es-MX"/>
+        </w:rPr>
+        <w:t xml:space="preserve"> </w:t>
+      </w:r>
+      <w:proofErr w:type="spellStart"/>
+      <w:r>
+        <w:rPr>
+          <w:b/>
+          <w:sz w:val="24"/>
+          <w:szCs w:val="24"/>
+          <w:lang w:val="es-MX"/>
+        </w:rPr>
         <w:t>Rodriguez</w:t>
       </w:r>
       <w:proofErr w:type="spellEnd"/>
@@ -662,16 +682,7 @@
           <w:lang w:val="es-MX"/>
         </w:rPr>
         <w:tab/>
-        <w:t xml:space="preserve">Duran Tapia Diego </w:t>
-      </w:r>
-      <w:r>
-        <w:rPr>
-          <w:b/>
-          <w:sz w:val="24"/>
-          <w:szCs w:val="24"/>
-          <w:lang w:val="es-MX"/>
-        </w:rPr>
-        <w:t>Alejandro</w:t>
+        <w:t>Duran Tapia Diego Alejandro</w:t>
       </w:r>
     </w:p>
     <w:p>
@@ -887,14 +898,7 @@
           <w:sz w:val="24"/>
           <w:szCs w:val="24"/>
         </w:rPr>
-        <w:t xml:space="preserve">Our team did a practice where we used programming logic to solve a problem where we need to create an </w:t>
-      </w:r>
-      <w:r>
-        <w:rPr>
-          <w:sz w:val="24"/>
-          <w:szCs w:val="24"/>
-        </w:rPr>
-        <w:t>algorithm that allows the user to enter two numeric values and display the truth table or logic gate. This code is only intended to only insert 0 and 1.</w:t>
+        <w:t>Our team did a practice where we used programming logic to solve a problem where we need to create an algorithm that allows the user to enter two numeric values and display the truth table or logic gate. This code is only intended to only insert 0 and 1.</w:t>
       </w:r>
     </w:p>
     <w:p>
@@ -1055,14 +1059,23 @@
           <w:sz w:val="24"/>
           <w:szCs w:val="24"/>
         </w:rPr>
-        <w:t>For this part of the development we create an algorithm that allows the user insert two numeric values and shows its logic gate, this depends on the users decision, if the option is 1, will shows the OR logic gate, if is 2, will shows the AND logic gate, a</w:t>
-      </w:r>
-      <w:r>
-        <w:rPr>
-          <w:sz w:val="24"/>
-          <w:szCs w:val="24"/>
-        </w:rPr>
-        <w:t>nd if it is 3, will shows the XOR logic gate.</w:t>
+        <w:t xml:space="preserve">For this part of the development we create an algorithm that allows the user insert two numeric values and shows its logic gate, this depends on the </w:t>
+      </w:r>
+      <w:proofErr w:type="gramStart"/>
+      <w:r>
+        <w:rPr>
+          <w:sz w:val="24"/>
+          <w:szCs w:val="24"/>
+        </w:rPr>
+        <w:t>users</w:t>
+      </w:r>
+      <w:proofErr w:type="gramEnd"/>
+      <w:r>
+        <w:rPr>
+          <w:sz w:val="24"/>
+          <w:szCs w:val="24"/>
+        </w:rPr>
+        <w:t xml:space="preserve"> decision, if the option is 1, will shows the OR logic gate, if is 2, will shows the AND logic gate, and if it is 3, will shows the XOR logic gate.</w:t>
       </w:r>
     </w:p>
     <w:p>
@@ -1217,6 +1230,7 @@
       <w:r>
         <w:rPr>
           <w:noProof/>
+          <w:lang w:val="es-MX" w:eastAsia="es-MX" w:bidi="ar-SA"/>
         </w:rPr>
         <w:lastRenderedPageBreak/>
         <w:drawing>
@@ -1329,6 +1343,7 @@
           <w:noProof/>
           <w:sz w:val="24"/>
           <w:szCs w:val="24"/>
+          <w:lang w:val="es-MX" w:eastAsia="es-MX" w:bidi="ar-SA"/>
         </w:rPr>
         <w:drawing>
           <wp:anchor distT="114300" distB="114300" distL="114300" distR="114300" simplePos="0" relativeHeight="31" behindDoc="0" locked="0" layoutInCell="0" allowOverlap="1" wp14:anchorId="2C92404C" wp14:editId="01B97908">
@@ -1433,7 +1448,23 @@
           <w:sz w:val="24"/>
           <w:szCs w:val="24"/>
         </w:rPr>
-        <w:t>In the terminal of the IDE, we can see the result, where shows the logic gate of the users option</w:t>
+        <w:t xml:space="preserve">In the terminal of the IDE, we can see the result, where shows the logic gate of the </w:t>
+      </w:r>
+      <w:proofErr w:type="gramStart"/>
+      <w:r>
+        <w:rPr>
+          <w:sz w:val="24"/>
+          <w:szCs w:val="24"/>
+        </w:rPr>
+        <w:t>users</w:t>
+      </w:r>
+      <w:proofErr w:type="gramEnd"/>
+      <w:r>
+        <w:rPr>
+          <w:sz w:val="24"/>
+          <w:szCs w:val="24"/>
+        </w:rPr>
+        <w:t xml:space="preserve"> option</w:t>
       </w:r>
     </w:p>
     <w:p>
@@ -1498,6 +1529,7 @@
       <w:r>
         <w:rPr>
           <w:noProof/>
+          <w:lang w:val="es-MX" w:eastAsia="es-MX" w:bidi="ar-SA"/>
         </w:rPr>
         <w:drawing>
           <wp:inline distT="0" distB="0" distL="0" distR="0" wp14:anchorId="4364DE14" wp14:editId="0FA88BA0">
@@ -1550,6 +1582,7 @@
       <w:r>
         <w:rPr>
           <w:noProof/>
+          <w:lang w:val="es-MX" w:eastAsia="es-MX" w:bidi="ar-SA"/>
         </w:rPr>
         <w:drawing>
           <wp:inline distT="0" distB="0" distL="0" distR="0" wp14:anchorId="500121E3" wp14:editId="567DD41C">
@@ -1602,6 +1635,7 @@
       <w:r>
         <w:rPr>
           <w:noProof/>
+          <w:lang w:val="es-MX" w:eastAsia="es-MX" w:bidi="ar-SA"/>
         </w:rPr>
         <w:drawing>
           <wp:inline distT="0" distB="0" distL="0" distR="0" wp14:anchorId="343F1D6D" wp14:editId="74589D9C">
@@ -1654,6 +1688,7 @@
       <w:r>
         <w:rPr>
           <w:noProof/>
+          <w:lang w:val="es-MX" w:eastAsia="es-MX" w:bidi="ar-SA"/>
         </w:rPr>
         <w:drawing>
           <wp:inline distT="0" distB="0" distL="0" distR="0" wp14:anchorId="06A360A9" wp14:editId="44BFF7F4">
@@ -1736,6 +1771,7 @@
       <w:r>
         <w:rPr>
           <w:noProof/>
+          <w:lang w:val="es-MX" w:eastAsia="es-MX" w:bidi="ar-SA"/>
         </w:rPr>
         <w:drawing>
           <wp:inline distT="0" distB="0" distL="0" distR="0" wp14:anchorId="13982D33" wp14:editId="500AC409">
@@ -1789,6 +1825,7 @@
       <w:r>
         <w:rPr>
           <w:noProof/>
+          <w:lang w:val="es-MX" w:eastAsia="es-MX" w:bidi="ar-SA"/>
         </w:rPr>
         <w:drawing>
           <wp:inline distT="0" distB="0" distL="0" distR="0" wp14:anchorId="480F6430" wp14:editId="118353E4">
@@ -1842,6 +1879,7 @@
       <w:r>
         <w:rPr>
           <w:noProof/>
+          <w:lang w:val="es-MX" w:eastAsia="es-MX" w:bidi="ar-SA"/>
         </w:rPr>
         <w:drawing>
           <wp:inline distT="0" distB="0" distL="0" distR="0" wp14:anchorId="76360C1F" wp14:editId="127BE73E">
@@ -1895,6 +1933,7 @@
       <w:r>
         <w:rPr>
           <w:noProof/>
+          <w:lang w:val="es-MX" w:eastAsia="es-MX" w:bidi="ar-SA"/>
         </w:rPr>
         <w:lastRenderedPageBreak/>
         <w:drawing>
@@ -1979,6 +2018,7 @@
       <w:r>
         <w:rPr>
           <w:noProof/>
+          <w:lang w:val="es-MX" w:eastAsia="es-MX" w:bidi="ar-SA"/>
         </w:rPr>
         <w:drawing>
           <wp:inline distT="0" distB="0" distL="0" distR="0" wp14:anchorId="48C3FDD9" wp14:editId="21EE3EE8">
@@ -2032,6 +2072,7 @@
       <w:r>
         <w:rPr>
           <w:noProof/>
+          <w:lang w:val="es-MX" w:eastAsia="es-MX" w:bidi="ar-SA"/>
         </w:rPr>
         <w:drawing>
           <wp:inline distT="0" distB="0" distL="0" distR="0" wp14:anchorId="4BF01249" wp14:editId="53FA69B6">
@@ -2085,6 +2126,7 @@
       <w:r>
         <w:rPr>
           <w:noProof/>
+          <w:lang w:val="es-MX" w:eastAsia="es-MX" w:bidi="ar-SA"/>
         </w:rPr>
         <w:drawing>
           <wp:inline distT="0" distB="0" distL="0" distR="0" wp14:anchorId="48B65A3C" wp14:editId="16B097F3">
@@ -2138,6 +2180,7 @@
       <w:r>
         <w:rPr>
           <w:noProof/>
+          <w:lang w:val="es-MX" w:eastAsia="es-MX" w:bidi="ar-SA"/>
         </w:rPr>
         <w:drawing>
           <wp:inline distT="0" distB="0" distL="0" distR="0" wp14:anchorId="0FC20B30" wp14:editId="2233F5F9">
@@ -2231,14 +2274,7 @@
           <w:sz w:val="24"/>
           <w:szCs w:val="24"/>
         </w:rPr>
-        <w:t xml:space="preserve">In this team work, we didn't have any problem with the development, we </w:t>
-      </w:r>
-      <w:r>
-        <w:rPr>
-          <w:sz w:val="24"/>
-          <w:szCs w:val="24"/>
-        </w:rPr>
-        <w:t>helped each other with the logic and we finished the program so fast.</w:t>
+        <w:t>In this team work, we didn't have any problem with the development, we helped each other with the logic and we finished the program so fast.</w:t>
       </w:r>
     </w:p>
     <w:p>
@@ -2288,12 +2324,21 @@
           <w:szCs w:val="24"/>
         </w:rPr>
       </w:pPr>
-      <w:r>
-        <w:rPr>
-          <w:sz w:val="24"/>
-          <w:szCs w:val="24"/>
-        </w:rPr>
-        <w:t xml:space="preserve">Donnovan´s Conclusion: </w:t>
+      <w:proofErr w:type="spellStart"/>
+      <w:r>
+        <w:rPr>
+          <w:sz w:val="24"/>
+          <w:szCs w:val="24"/>
+        </w:rPr>
+        <w:t>Donnovan´s</w:t>
+      </w:r>
+      <w:proofErr w:type="spellEnd"/>
+      <w:r>
+        <w:rPr>
+          <w:sz w:val="24"/>
+          <w:szCs w:val="24"/>
+        </w:rPr>
+        <w:t xml:space="preserve"> Conclusion: </w:t>
       </w:r>
       <w:r>
         <w:rPr>
@@ -2303,6 +2348,7 @@
         <w:t xml:space="preserve">This </w:t>
       </w:r>
       <w:proofErr w:type="spellStart"/>
+      <w:proofErr w:type="gramStart"/>
       <w:r>
         <w:rPr>
           <w:sz w:val="24"/>
@@ -2311,6 +2357,7 @@
         <w:t>activity,in</w:t>
       </w:r>
       <w:proofErr w:type="spellEnd"/>
+      <w:proofErr w:type="gramEnd"/>
       <w:r>
         <w:rPr>
           <w:sz w:val="24"/>
@@ -2441,6 +2488,31 @@
         </w:rPr>
         <w:t xml:space="preserve">Kevin´s Conclusion: </w:t>
       </w:r>
+      <w:r>
+        <w:rPr>
+          <w:sz w:val="24"/>
+          <w:szCs w:val="24"/>
+        </w:rPr>
+        <w:t xml:space="preserve">This activity was a challenge, especially with the C programming language, which was new for me. At first, I felt a bit lost, but I tried my best to understand it and help my team. It was a great experience that allowed me to practice more and, despite the difficulties, I'm happy with </w:t>
+      </w:r>
+      <w:proofErr w:type="spellStart"/>
+      <w:r>
+        <w:rPr>
+          <w:sz w:val="24"/>
+          <w:szCs w:val="24"/>
+        </w:rPr>
+        <w:t>they</w:t>
+      </w:r>
+      <w:proofErr w:type="spellEnd"/>
+      <w:r>
+        <w:rPr>
+          <w:sz w:val="24"/>
+          <w:szCs w:val="24"/>
+        </w:rPr>
+        <w:t xml:space="preserve"> goal they we did.</w:t>
+      </w:r>
+      <w:bookmarkStart w:id="0" w:name="_GoBack"/>
+      <w:bookmarkEnd w:id="0"/>
     </w:p>
     <w:p>
       <w:pPr>
@@ -2477,45 +2549,45 @@
           <w:sz w:val="24"/>
           <w:szCs w:val="24"/>
         </w:rPr>
-        <w:t>For me, this activity was a good chance to learn more. At the beginning I made some mistakes but I tried again until I understood the code. This made me feel better and more interested. I think this practice is useful because it helps me to connect the theory with real examples and now I feel confident to keep learning C programming.</w:t>
-      </w:r>
-    </w:p>
-    <w:p>
-      <w:pPr>
-        <w:pStyle w:val="normal1"/>
-        <w:jc w:val="both"/>
-        <w:rPr>
-          <w:sz w:val="24"/>
-          <w:szCs w:val="24"/>
-        </w:rPr>
-      </w:pPr>
-    </w:p>
-    <w:p>
-      <w:pPr>
-        <w:pStyle w:val="normal1"/>
-        <w:jc w:val="both"/>
-        <w:rPr>
-          <w:sz w:val="24"/>
-          <w:szCs w:val="24"/>
-        </w:rPr>
-      </w:pPr>
+        <w:t xml:space="preserve">For me, this activity was a good chance to learn more. At the beginning I made some mistakes but I tried again until I understood the code. This made me feel better and more interested. I </w:t>
+      </w:r>
       <w:r>
         <w:rPr>
           <w:sz w:val="24"/>
           <w:szCs w:val="24"/>
         </w:rPr>
         <w:lastRenderedPageBreak/>
-        <w:t>Angel´s Conclusion</w:t>
-      </w:r>
-      <w:r>
-        <w:rPr>
-          <w:sz w:val="24"/>
-          <w:szCs w:val="24"/>
-        </w:rPr>
-        <w:t xml:space="preserve">: </w:t>
-      </w:r>
-      <w:bookmarkStart w:id="0" w:name="docs-internal-guid-5b4097fd-7fff-2fc9-aa"/>
-      <w:bookmarkEnd w:id="0"/>
+        <w:t>think this practice is useful because it helps me to connect the theory with real examples and now I feel confident to keep learning C programming.</w:t>
+      </w:r>
+    </w:p>
+    <w:p>
+      <w:pPr>
+        <w:pStyle w:val="normal1"/>
+        <w:jc w:val="both"/>
+        <w:rPr>
+          <w:sz w:val="24"/>
+          <w:szCs w:val="24"/>
+        </w:rPr>
+      </w:pPr>
+    </w:p>
+    <w:p>
+      <w:pPr>
+        <w:pStyle w:val="normal1"/>
+        <w:jc w:val="both"/>
+        <w:rPr>
+          <w:sz w:val="24"/>
+          <w:szCs w:val="24"/>
+        </w:rPr>
+      </w:pPr>
+      <w:r>
+        <w:rPr>
+          <w:sz w:val="24"/>
+          <w:szCs w:val="24"/>
+        </w:rPr>
+        <w:t xml:space="preserve">Angel´s Conclusion: </w:t>
+      </w:r>
+      <w:bookmarkStart w:id="1" w:name="docs-internal-guid-5b4097fd-7fff-2fc9-aa"/>
+      <w:bookmarkEnd w:id="1"/>
       <w:r>
         <w:rPr>
           <w:rFonts w:ascii="Calibri;sans-serif" w:hAnsi="Calibri;sans-serif"/>
@@ -2906,7 +2978,7 @@
 </file>
 
 <file path=word/endnotes.xml><?xml version="1.0" encoding="utf-8"?>
-<w:endnotes xmlns:wpc="http://schemas.microsoft.com/office/word/2010/wordprocessingCanvas" xmlns:cx="http://schemas.microsoft.com/office/drawing/2014/chartex" xmlns:cx1="http://schemas.microsoft.com/office/drawing/2015/9/8/chartex" xmlns:cx2="http://schemas.microsoft.com/office/drawing/2015/10/21/chartex" xmlns:cx3="http://schemas.microsoft.com/office/drawing/2016/5/9/chartex" xmlns:cx4="http://schemas.microsoft.com/office/drawing/2016/5/10/chartex" xmlns:cx5="http://schemas.microsoft.com/office/drawing/2016/5/11/chartex" xmlns:cx6="http://schemas.microsoft.com/office/drawing/2016/5/12/chartex" xmlns:cx7="http://schemas.microsoft.com/office/drawing/2016/5/13/chartex" xmlns:cx8="http://schemas.microsoft.com/office/drawing/2016/5/14/chartex" xmlns:mc="http://schemas.openxmlformats.org/markup-compatibility/2006" xmlns:aink="http://schemas.microsoft.com/office/drawing/2016/ink" xmlns:am3d="http://schemas.microsoft.com/office/drawing/2017/model3d" xmlns:o="urn:schemas-microsoft-com:office:office" xmlns:r="http://schemas.openxmlformats.org/officeDocument/2006/relationships" xmlns:m="http://schemas.openxmlformats.org/officeDocument/2006/math" xmlns:v="urn:schemas-microsoft-com:vml" xmlns:wp14="http://schemas.microsoft.com/office/word/2010/wordprocessingDrawing" xmlns:wp="http://schemas.openxmlformats.org/drawingml/2006/wordprocessingDrawing" xmlns:w10="urn:schemas-microsoft-com:office:word" xmlns:w="http://schemas.openxmlformats.org/wordprocessingml/2006/main" xmlns:w14="http://schemas.microsoft.com/office/word/2010/wordml" xmlns:w15="http://schemas.microsoft.com/office/word/2012/wordml" xmlns:w16cex="http://schemas.microsoft.com/office/word/2018/wordml/cex" xmlns:w16cid="http://schemas.microsoft.com/office/word/2016/wordml/cid" xmlns:w16="http://schemas.microsoft.com/office/word/2018/wordml" xmlns:w16sdtdh="http://schemas.microsoft.com/office/word/2020/wordml/sdtdatahash" xmlns:w16se="http://schemas.microsoft.com/office/word/2015/wordml/symex" xmlns:wpg="http://schemas.microsoft.com/office/word/2010/wordprocessingGroup" xmlns:wpi="http://schemas.microsoft.com/office/word/2010/wordprocessingInk" xmlns:wne="http://schemas.microsoft.com/office/word/2006/wordml" xmlns:wps="http://schemas.microsoft.com/office/word/2010/wordprocessingShape" mc:Ignorable="w14 w15 w16se w16cid w16 w16cex w16sdtdh wp14">
+<w:endnotes xmlns:wpc="http://schemas.microsoft.com/office/word/2010/wordprocessingCanvas" xmlns:cx="http://schemas.microsoft.com/office/drawing/2014/chartex" xmlns:mc="http://schemas.openxmlformats.org/markup-compatibility/2006" xmlns:o="urn:schemas-microsoft-com:office:office" xmlns:r="http://schemas.openxmlformats.org/officeDocument/2006/relationships" xmlns:m="http://schemas.openxmlformats.org/officeDocument/2006/math" xmlns:v="urn:schemas-microsoft-com:vml" xmlns:wp14="http://schemas.microsoft.com/office/word/2010/wordprocessingDrawing" xmlns:wp="http://schemas.openxmlformats.org/drawingml/2006/wordprocessingDrawing" xmlns:w10="urn:schemas-microsoft-com:office:word" xmlns:w="http://schemas.openxmlformats.org/wordprocessingml/2006/main" xmlns:w14="http://schemas.microsoft.com/office/word/2010/wordml" xmlns:w15="http://schemas.microsoft.com/office/word/2012/wordml" xmlns:w16se="http://schemas.microsoft.com/office/word/2015/wordml/symex" xmlns:wpg="http://schemas.microsoft.com/office/word/2010/wordprocessingGroup" xmlns:wpi="http://schemas.microsoft.com/office/word/2010/wordprocessingInk" xmlns:wne="http://schemas.microsoft.com/office/word/2006/wordml" xmlns:wps="http://schemas.microsoft.com/office/word/2010/wordprocessingShape" mc:Ignorable="w14 w15 w16se wp14">
   <w:endnote w:type="separator" w:id="-1">
     <w:p>
       <w:r>
@@ -2925,7 +2997,7 @@
 </file>
 
 <file path=word/footer1.xml><?xml version="1.0" encoding="utf-8"?>
-<w:ftr xmlns:wpc="http://schemas.microsoft.com/office/word/2010/wordprocessingCanvas" xmlns:cx="http://schemas.microsoft.com/office/drawing/2014/chartex" xmlns:cx1="http://schemas.microsoft.com/office/drawing/2015/9/8/chartex" xmlns:cx2="http://schemas.microsoft.com/office/drawing/2015/10/21/chartex" xmlns:cx3="http://schemas.microsoft.com/office/drawing/2016/5/9/chartex" xmlns:cx4="http://schemas.microsoft.com/office/drawing/2016/5/10/chartex" xmlns:cx5="http://schemas.microsoft.com/office/drawing/2016/5/11/chartex" xmlns:cx6="http://schemas.microsoft.com/office/drawing/2016/5/12/chartex" xmlns:cx7="http://schemas.microsoft.com/office/drawing/2016/5/13/chartex" xmlns:cx8="http://schemas.microsoft.com/office/drawing/2016/5/14/chartex" xmlns:mc="http://schemas.openxmlformats.org/markup-compatibility/2006" xmlns:aink="http://schemas.microsoft.com/office/drawing/2016/ink" xmlns:am3d="http://schemas.microsoft.com/office/drawing/2017/model3d" xmlns:o="urn:schemas-microsoft-com:office:office" xmlns:r="http://schemas.openxmlformats.org/officeDocument/2006/relationships" xmlns:m="http://schemas.openxmlformats.org/officeDocument/2006/math" xmlns:v="urn:schemas-microsoft-com:vml" xmlns:wp14="http://schemas.microsoft.com/office/word/2010/wordprocessingDrawing" xmlns:wp="http://schemas.openxmlformats.org/drawingml/2006/wordprocessingDrawing" xmlns:w10="urn:schemas-microsoft-com:office:word" xmlns:w="http://schemas.openxmlformats.org/wordprocessingml/2006/main" xmlns:w14="http://schemas.microsoft.com/office/word/2010/wordml" xmlns:w15="http://schemas.microsoft.com/office/word/2012/wordml" xmlns:w16cex="http://schemas.microsoft.com/office/word/2018/wordml/cex" xmlns:w16cid="http://schemas.microsoft.com/office/word/2016/wordml/cid" xmlns:w16="http://schemas.microsoft.com/office/word/2018/wordml" xmlns:w16sdtdh="http://schemas.microsoft.com/office/word/2020/wordml/sdtdatahash" xmlns:w16se="http://schemas.microsoft.com/office/word/2015/wordml/symex" xmlns:wpg="http://schemas.microsoft.com/office/word/2010/wordprocessingGroup" xmlns:wpi="http://schemas.microsoft.com/office/word/2010/wordprocessingInk" xmlns:wne="http://schemas.microsoft.com/office/word/2006/wordml" xmlns:wps="http://schemas.microsoft.com/office/word/2010/wordprocessingShape" mc:Ignorable="w14 w15 w16se w16cid w16 w16cex w16sdtdh wp14">
+<w:ftr xmlns:wpc="http://schemas.microsoft.com/office/word/2010/wordprocessingCanvas" xmlns:cx="http://schemas.microsoft.com/office/drawing/2014/chartex" xmlns:mc="http://schemas.openxmlformats.org/markup-compatibility/2006" xmlns:o="urn:schemas-microsoft-com:office:office" xmlns:r="http://schemas.openxmlformats.org/officeDocument/2006/relationships" xmlns:m="http://schemas.openxmlformats.org/officeDocument/2006/math" xmlns:v="urn:schemas-microsoft-com:vml" xmlns:wp14="http://schemas.microsoft.com/office/word/2010/wordprocessingDrawing" xmlns:wp="http://schemas.openxmlformats.org/drawingml/2006/wordprocessingDrawing" xmlns:w10="urn:schemas-microsoft-com:office:word" xmlns:w="http://schemas.openxmlformats.org/wordprocessingml/2006/main" xmlns:w14="http://schemas.microsoft.com/office/word/2010/wordml" xmlns:w15="http://schemas.microsoft.com/office/word/2012/wordml" xmlns:w16se="http://schemas.microsoft.com/office/word/2015/wordml/symex" xmlns:wpg="http://schemas.microsoft.com/office/word/2010/wordprocessingGroup" xmlns:wpi="http://schemas.microsoft.com/office/word/2010/wordprocessingInk" xmlns:wne="http://schemas.microsoft.com/office/word/2006/wordml" xmlns:wps="http://schemas.microsoft.com/office/word/2010/wordprocessingShape" mc:Ignorable="w14 w15 w16se wp14">
   <w:p>
     <w:pPr>
       <w:pStyle w:val="Piedepgina"/>
@@ -2935,7 +3007,7 @@
 </file>
 
 <file path=word/footer2.xml><?xml version="1.0" encoding="utf-8"?>
-<w:ftr xmlns:wpc="http://schemas.microsoft.com/office/word/2010/wordprocessingCanvas" xmlns:cx="http://schemas.microsoft.com/office/drawing/2014/chartex" xmlns:cx1="http://schemas.microsoft.com/office/drawing/2015/9/8/chartex" xmlns:cx2="http://schemas.microsoft.com/office/drawing/2015/10/21/chartex" xmlns:cx3="http://schemas.microsoft.com/office/drawing/2016/5/9/chartex" xmlns:cx4="http://schemas.microsoft.com/office/drawing/2016/5/10/chartex" xmlns:cx5="http://schemas.microsoft.com/office/drawing/2016/5/11/chartex" xmlns:cx6="http://schemas.microsoft.com/office/drawing/2016/5/12/chartex" xmlns:cx7="http://schemas.microsoft.com/office/drawing/2016/5/13/chartex" xmlns:cx8="http://schemas.microsoft.com/office/drawing/2016/5/14/chartex" xmlns:mc="http://schemas.openxmlformats.org/markup-compatibility/2006" xmlns:aink="http://schemas.microsoft.com/office/drawing/2016/ink" xmlns:am3d="http://schemas.microsoft.com/office/drawing/2017/model3d" xmlns:o="urn:schemas-microsoft-com:office:office" xmlns:r="http://schemas.openxmlformats.org/officeDocument/2006/relationships" xmlns:m="http://schemas.openxmlformats.org/officeDocument/2006/math" xmlns:v="urn:schemas-microsoft-com:vml" xmlns:wp14="http://schemas.microsoft.com/office/word/2010/wordprocessingDrawing" xmlns:wp="http://schemas.openxmlformats.org/drawingml/2006/wordprocessingDrawing" xmlns:w10="urn:schemas-microsoft-com:office:word" xmlns:w="http://schemas.openxmlformats.org/wordprocessingml/2006/main" xmlns:w14="http://schemas.microsoft.com/office/word/2010/wordml" xmlns:w15="http://schemas.microsoft.com/office/word/2012/wordml" xmlns:w16cex="http://schemas.microsoft.com/office/word/2018/wordml/cex" xmlns:w16cid="http://schemas.microsoft.com/office/word/2016/wordml/cid" xmlns:w16="http://schemas.microsoft.com/office/word/2018/wordml" xmlns:w16sdtdh="http://schemas.microsoft.com/office/word/2020/wordml/sdtdatahash" xmlns:w16se="http://schemas.microsoft.com/office/word/2015/wordml/symex" xmlns:wpg="http://schemas.microsoft.com/office/word/2010/wordprocessingGroup" xmlns:wpi="http://schemas.microsoft.com/office/word/2010/wordprocessingInk" xmlns:wne="http://schemas.microsoft.com/office/word/2006/wordml" xmlns:wps="http://schemas.microsoft.com/office/word/2010/wordprocessingShape" mc:Ignorable="w14 w15 w16se w16cid w16 w16cex w16sdtdh wp14">
+<w:ftr xmlns:wpc="http://schemas.microsoft.com/office/word/2010/wordprocessingCanvas" xmlns:cx="http://schemas.microsoft.com/office/drawing/2014/chartex" xmlns:mc="http://schemas.openxmlformats.org/markup-compatibility/2006" xmlns:o="urn:schemas-microsoft-com:office:office" xmlns:r="http://schemas.openxmlformats.org/officeDocument/2006/relationships" xmlns:m="http://schemas.openxmlformats.org/officeDocument/2006/math" xmlns:v="urn:schemas-microsoft-com:vml" xmlns:wp14="http://schemas.microsoft.com/office/word/2010/wordprocessingDrawing" xmlns:wp="http://schemas.openxmlformats.org/drawingml/2006/wordprocessingDrawing" xmlns:w10="urn:schemas-microsoft-com:office:word" xmlns:w="http://schemas.openxmlformats.org/wordprocessingml/2006/main" xmlns:w14="http://schemas.microsoft.com/office/word/2010/wordml" xmlns:w15="http://schemas.microsoft.com/office/word/2012/wordml" xmlns:w16se="http://schemas.microsoft.com/office/word/2015/wordml/symex" xmlns:wpg="http://schemas.microsoft.com/office/word/2010/wordprocessingGroup" xmlns:wpi="http://schemas.microsoft.com/office/word/2010/wordprocessingInk" xmlns:wne="http://schemas.microsoft.com/office/word/2006/wordml" xmlns:wps="http://schemas.microsoft.com/office/word/2010/wordprocessingShape" mc:Ignorable="w14 w15 w16se wp14">
   <w:p>
     <w:pPr>
       <w:pStyle w:val="normal1"/>
@@ -2978,7 +3050,7 @@
 </file>
 
 <file path=word/footer3.xml><?xml version="1.0" encoding="utf-8"?>
-<w:ftr xmlns:wpc="http://schemas.microsoft.com/office/word/2010/wordprocessingCanvas" xmlns:cx="http://schemas.microsoft.com/office/drawing/2014/chartex" xmlns:cx1="http://schemas.microsoft.com/office/drawing/2015/9/8/chartex" xmlns:cx2="http://schemas.microsoft.com/office/drawing/2015/10/21/chartex" xmlns:cx3="http://schemas.microsoft.com/office/drawing/2016/5/9/chartex" xmlns:cx4="http://schemas.microsoft.com/office/drawing/2016/5/10/chartex" xmlns:cx5="http://schemas.microsoft.com/office/drawing/2016/5/11/chartex" xmlns:cx6="http://schemas.microsoft.com/office/drawing/2016/5/12/chartex" xmlns:cx7="http://schemas.microsoft.com/office/drawing/2016/5/13/chartex" xmlns:cx8="http://schemas.microsoft.com/office/drawing/2016/5/14/chartex" xmlns:mc="http://schemas.openxmlformats.org/markup-compatibility/2006" xmlns:aink="http://schemas.microsoft.com/office/drawing/2016/ink" xmlns:am3d="http://schemas.microsoft.com/office/drawing/2017/model3d" xmlns:o="urn:schemas-microsoft-com:office:office" xmlns:r="http://schemas.openxmlformats.org/officeDocument/2006/relationships" xmlns:m="http://schemas.openxmlformats.org/officeDocument/2006/math" xmlns:v="urn:schemas-microsoft-com:vml" xmlns:wp14="http://schemas.microsoft.com/office/word/2010/wordprocessingDrawing" xmlns:wp="http://schemas.openxmlformats.org/drawingml/2006/wordprocessingDrawing" xmlns:w10="urn:schemas-microsoft-com:office:word" xmlns:w="http://schemas.openxmlformats.org/wordprocessingml/2006/main" xmlns:w14="http://schemas.microsoft.com/office/word/2010/wordml" xmlns:w15="http://schemas.microsoft.com/office/word/2012/wordml" xmlns:w16cex="http://schemas.microsoft.com/office/word/2018/wordml/cex" xmlns:w16cid="http://schemas.microsoft.com/office/word/2016/wordml/cid" xmlns:w16="http://schemas.microsoft.com/office/word/2018/wordml" xmlns:w16sdtdh="http://schemas.microsoft.com/office/word/2020/wordml/sdtdatahash" xmlns:w16se="http://schemas.microsoft.com/office/word/2015/wordml/symex" xmlns:wpg="http://schemas.microsoft.com/office/word/2010/wordprocessingGroup" xmlns:wpi="http://schemas.microsoft.com/office/word/2010/wordprocessingInk" xmlns:wne="http://schemas.microsoft.com/office/word/2006/wordml" xmlns:wps="http://schemas.microsoft.com/office/word/2010/wordprocessingShape" mc:Ignorable="w14 w15 w16se w16cid w16 w16cex w16sdtdh wp14">
+<w:ftr xmlns:wpc="http://schemas.microsoft.com/office/word/2010/wordprocessingCanvas" xmlns:cx="http://schemas.microsoft.com/office/drawing/2014/chartex" xmlns:mc="http://schemas.openxmlformats.org/markup-compatibility/2006" xmlns:o="urn:schemas-microsoft-com:office:office" xmlns:r="http://schemas.openxmlformats.org/officeDocument/2006/relationships" xmlns:m="http://schemas.openxmlformats.org/officeDocument/2006/math" xmlns:v="urn:schemas-microsoft-com:vml" xmlns:wp14="http://schemas.microsoft.com/office/word/2010/wordprocessingDrawing" xmlns:wp="http://schemas.openxmlformats.org/drawingml/2006/wordprocessingDrawing" xmlns:w10="urn:schemas-microsoft-com:office:word" xmlns:w="http://schemas.openxmlformats.org/wordprocessingml/2006/main" xmlns:w14="http://schemas.microsoft.com/office/word/2010/wordml" xmlns:w15="http://schemas.microsoft.com/office/word/2012/wordml" xmlns:w16se="http://schemas.microsoft.com/office/word/2015/wordml/symex" xmlns:wpg="http://schemas.microsoft.com/office/word/2010/wordprocessingGroup" xmlns:wpi="http://schemas.microsoft.com/office/word/2010/wordprocessingInk" xmlns:wne="http://schemas.microsoft.com/office/word/2006/wordml" xmlns:wps="http://schemas.microsoft.com/office/word/2010/wordprocessingShape" mc:Ignorable="w14 w15 w16se wp14">
   <w:p>
     <w:pPr>
       <w:pStyle w:val="normal1"/>
@@ -3021,7 +3093,7 @@
 </file>
 
 <file path=word/footer4.xml><?xml version="1.0" encoding="utf-8"?>
-<w:ftr xmlns:wpc="http://schemas.microsoft.com/office/word/2010/wordprocessingCanvas" xmlns:cx="http://schemas.microsoft.com/office/drawing/2014/chartex" xmlns:cx1="http://schemas.microsoft.com/office/drawing/2015/9/8/chartex" xmlns:cx2="http://schemas.microsoft.com/office/drawing/2015/10/21/chartex" xmlns:cx3="http://schemas.microsoft.com/office/drawing/2016/5/9/chartex" xmlns:cx4="http://schemas.microsoft.com/office/drawing/2016/5/10/chartex" xmlns:cx5="http://schemas.microsoft.com/office/drawing/2016/5/11/chartex" xmlns:cx6="http://schemas.microsoft.com/office/drawing/2016/5/12/chartex" xmlns:cx7="http://schemas.microsoft.com/office/drawing/2016/5/13/chartex" xmlns:cx8="http://schemas.microsoft.com/office/drawing/2016/5/14/chartex" xmlns:mc="http://schemas.openxmlformats.org/markup-compatibility/2006" xmlns:aink="http://schemas.microsoft.com/office/drawing/2016/ink" xmlns:am3d="http://schemas.microsoft.com/office/drawing/2017/model3d" xmlns:o="urn:schemas-microsoft-com:office:office" xmlns:r="http://schemas.openxmlformats.org/officeDocument/2006/relationships" xmlns:m="http://schemas.openxmlformats.org/officeDocument/2006/math" xmlns:v="urn:schemas-microsoft-com:vml" xmlns:wp14="http://schemas.microsoft.com/office/word/2010/wordprocessingDrawing" xmlns:wp="http://schemas.openxmlformats.org/drawingml/2006/wordprocessingDrawing" xmlns:w10="urn:schemas-microsoft-com:office:word" xmlns:w="http://schemas.openxmlformats.org/wordprocessingml/2006/main" xmlns:w14="http://schemas.microsoft.com/office/word/2010/wordml" xmlns:w15="http://schemas.microsoft.com/office/word/2012/wordml" xmlns:w16cex="http://schemas.microsoft.com/office/word/2018/wordml/cex" xmlns:w16cid="http://schemas.microsoft.com/office/word/2016/wordml/cid" xmlns:w16="http://schemas.microsoft.com/office/word/2018/wordml" xmlns:w16sdtdh="http://schemas.microsoft.com/office/word/2020/wordml/sdtdatahash" xmlns:w16se="http://schemas.microsoft.com/office/word/2015/wordml/symex" xmlns:wpg="http://schemas.microsoft.com/office/word/2010/wordprocessingGroup" xmlns:wpi="http://schemas.microsoft.com/office/word/2010/wordprocessingInk" xmlns:wne="http://schemas.microsoft.com/office/word/2006/wordml" xmlns:wps="http://schemas.microsoft.com/office/word/2010/wordprocessingShape" mc:Ignorable="w14 w15 w16se w16cid w16 w16cex w16sdtdh wp14">
+<w:ftr xmlns:wpc="http://schemas.microsoft.com/office/word/2010/wordprocessingCanvas" xmlns:cx="http://schemas.microsoft.com/office/drawing/2014/chartex" xmlns:mc="http://schemas.openxmlformats.org/markup-compatibility/2006" xmlns:o="urn:schemas-microsoft-com:office:office" xmlns:r="http://schemas.openxmlformats.org/officeDocument/2006/relationships" xmlns:m="http://schemas.openxmlformats.org/officeDocument/2006/math" xmlns:v="urn:schemas-microsoft-com:vml" xmlns:wp14="http://schemas.microsoft.com/office/word/2010/wordprocessingDrawing" xmlns:wp="http://schemas.openxmlformats.org/drawingml/2006/wordprocessingDrawing" xmlns:w10="urn:schemas-microsoft-com:office:word" xmlns:w="http://schemas.openxmlformats.org/wordprocessingml/2006/main" xmlns:w14="http://schemas.microsoft.com/office/word/2010/wordml" xmlns:w15="http://schemas.microsoft.com/office/word/2012/wordml" xmlns:w16se="http://schemas.microsoft.com/office/word/2015/wordml/symex" xmlns:wpg="http://schemas.microsoft.com/office/word/2010/wordprocessingGroup" xmlns:wpi="http://schemas.microsoft.com/office/word/2010/wordprocessingInk" xmlns:wne="http://schemas.microsoft.com/office/word/2006/wordml" xmlns:wps="http://schemas.microsoft.com/office/word/2010/wordprocessingShape" mc:Ignorable="w14 w15 w16se wp14">
   <w:p>
     <w:pPr>
       <w:pStyle w:val="normal1"/>
@@ -3064,7 +3136,7 @@
 </file>
 
 <file path=word/footer5.xml><?xml version="1.0" encoding="utf-8"?>
-<w:ftr xmlns:wpc="http://schemas.microsoft.com/office/word/2010/wordprocessingCanvas" xmlns:cx="http://schemas.microsoft.com/office/drawing/2014/chartex" xmlns:cx1="http://schemas.microsoft.com/office/drawing/2015/9/8/chartex" xmlns:cx2="http://schemas.microsoft.com/office/drawing/2015/10/21/chartex" xmlns:cx3="http://schemas.microsoft.com/office/drawing/2016/5/9/chartex" xmlns:cx4="http://schemas.microsoft.com/office/drawing/2016/5/10/chartex" xmlns:cx5="http://schemas.microsoft.com/office/drawing/2016/5/11/chartex" xmlns:cx6="http://schemas.microsoft.com/office/drawing/2016/5/12/chartex" xmlns:cx7="http://schemas.microsoft.com/office/drawing/2016/5/13/chartex" xmlns:cx8="http://schemas.microsoft.com/office/drawing/2016/5/14/chartex" xmlns:mc="http://schemas.openxmlformats.org/markup-compatibility/2006" xmlns:aink="http://schemas.microsoft.com/office/drawing/2016/ink" xmlns:am3d="http://schemas.microsoft.com/office/drawing/2017/model3d" xmlns:o="urn:schemas-microsoft-com:office:office" xmlns:r="http://schemas.openxmlformats.org/officeDocument/2006/relationships" xmlns:m="http://schemas.openxmlformats.org/officeDocument/2006/math" xmlns:v="urn:schemas-microsoft-com:vml" xmlns:wp14="http://schemas.microsoft.com/office/word/2010/wordprocessingDrawing" xmlns:wp="http://schemas.openxmlformats.org/drawingml/2006/wordprocessingDrawing" xmlns:w10="urn:schemas-microsoft-com:office:word" xmlns:w="http://schemas.openxmlformats.org/wordprocessingml/2006/main" xmlns:w14="http://schemas.microsoft.com/office/word/2010/wordml" xmlns:w15="http://schemas.microsoft.com/office/word/2012/wordml" xmlns:w16cex="http://schemas.microsoft.com/office/word/2018/wordml/cex" xmlns:w16cid="http://schemas.microsoft.com/office/word/2016/wordml/cid" xmlns:w16="http://schemas.microsoft.com/office/word/2018/wordml" xmlns:w16sdtdh="http://schemas.microsoft.com/office/word/2020/wordml/sdtdatahash" xmlns:w16se="http://schemas.microsoft.com/office/word/2015/wordml/symex" xmlns:wpg="http://schemas.microsoft.com/office/word/2010/wordprocessingGroup" xmlns:wpi="http://schemas.microsoft.com/office/word/2010/wordprocessingInk" xmlns:wne="http://schemas.microsoft.com/office/word/2006/wordml" xmlns:wps="http://schemas.microsoft.com/office/word/2010/wordprocessingShape" mc:Ignorable="w14 w15 w16se w16cid w16 w16cex w16sdtdh wp14">
+<w:ftr xmlns:wpc="http://schemas.microsoft.com/office/word/2010/wordprocessingCanvas" xmlns:cx="http://schemas.microsoft.com/office/drawing/2014/chartex" xmlns:mc="http://schemas.openxmlformats.org/markup-compatibility/2006" xmlns:o="urn:schemas-microsoft-com:office:office" xmlns:r="http://schemas.openxmlformats.org/officeDocument/2006/relationships" xmlns:m="http://schemas.openxmlformats.org/officeDocument/2006/math" xmlns:v="urn:schemas-microsoft-com:vml" xmlns:wp14="http://schemas.microsoft.com/office/word/2010/wordprocessingDrawing" xmlns:wp="http://schemas.openxmlformats.org/drawingml/2006/wordprocessingDrawing" xmlns:w10="urn:schemas-microsoft-com:office:word" xmlns:w="http://schemas.openxmlformats.org/wordprocessingml/2006/main" xmlns:w14="http://schemas.microsoft.com/office/word/2010/wordml" xmlns:w15="http://schemas.microsoft.com/office/word/2012/wordml" xmlns:w16se="http://schemas.microsoft.com/office/word/2015/wordml/symex" xmlns:wpg="http://schemas.microsoft.com/office/word/2010/wordprocessingGroup" xmlns:wpi="http://schemas.microsoft.com/office/word/2010/wordprocessingInk" xmlns:wne="http://schemas.microsoft.com/office/word/2006/wordml" xmlns:wps="http://schemas.microsoft.com/office/word/2010/wordprocessingShape" mc:Ignorable="w14 w15 w16se wp14">
   <w:p>
     <w:pPr>
       <w:pStyle w:val="normal1"/>
@@ -3074,7 +3146,7 @@
 </file>
 
 <file path=word/footer6.xml><?xml version="1.0" encoding="utf-8"?>
-<w:ftr xmlns:wpc="http://schemas.microsoft.com/office/word/2010/wordprocessingCanvas" xmlns:cx="http://schemas.microsoft.com/office/drawing/2014/chartex" xmlns:cx1="http://schemas.microsoft.com/office/drawing/2015/9/8/chartex" xmlns:cx2="http://schemas.microsoft.com/office/drawing/2015/10/21/chartex" xmlns:cx3="http://schemas.microsoft.com/office/drawing/2016/5/9/chartex" xmlns:cx4="http://schemas.microsoft.com/office/drawing/2016/5/10/chartex" xmlns:cx5="http://schemas.microsoft.com/office/drawing/2016/5/11/chartex" xmlns:cx6="http://schemas.microsoft.com/office/drawing/2016/5/12/chartex" xmlns:cx7="http://schemas.microsoft.com/office/drawing/2016/5/13/chartex" xmlns:cx8="http://schemas.microsoft.com/office/drawing/2016/5/14/chartex" xmlns:mc="http://schemas.openxmlformats.org/markup-compatibility/2006" xmlns:aink="http://schemas.microsoft.com/office/drawing/2016/ink" xmlns:am3d="http://schemas.microsoft.com/office/drawing/2017/model3d" xmlns:o="urn:schemas-microsoft-com:office:office" xmlns:r="http://schemas.openxmlformats.org/officeDocument/2006/relationships" xmlns:m="http://schemas.openxmlformats.org/officeDocument/2006/math" xmlns:v="urn:schemas-microsoft-com:vml" xmlns:wp14="http://schemas.microsoft.com/office/word/2010/wordprocessingDrawing" xmlns:wp="http://schemas.openxmlformats.org/drawingml/2006/wordprocessingDrawing" xmlns:w10="urn:schemas-microsoft-com:office:word" xmlns:w="http://schemas.openxmlformats.org/wordprocessingml/2006/main" xmlns:w14="http://schemas.microsoft.com/office/word/2010/wordml" xmlns:w15="http://schemas.microsoft.com/office/word/2012/wordml" xmlns:w16cex="http://schemas.microsoft.com/office/word/2018/wordml/cex" xmlns:w16cid="http://schemas.microsoft.com/office/word/2016/wordml/cid" xmlns:w16="http://schemas.microsoft.com/office/word/2018/wordml" xmlns:w16sdtdh="http://schemas.microsoft.com/office/word/2020/wordml/sdtdatahash" xmlns:w16se="http://schemas.microsoft.com/office/word/2015/wordml/symex" xmlns:wpg="http://schemas.microsoft.com/office/word/2010/wordprocessingGroup" xmlns:wpi="http://schemas.microsoft.com/office/word/2010/wordprocessingInk" xmlns:wne="http://schemas.microsoft.com/office/word/2006/wordml" xmlns:wps="http://schemas.microsoft.com/office/word/2010/wordprocessingShape" mc:Ignorable="w14 w15 w16se w16cid w16 w16cex w16sdtdh wp14">
+<w:ftr xmlns:wpc="http://schemas.microsoft.com/office/word/2010/wordprocessingCanvas" xmlns:cx="http://schemas.microsoft.com/office/drawing/2014/chartex" xmlns:mc="http://schemas.openxmlformats.org/markup-compatibility/2006" xmlns:o="urn:schemas-microsoft-com:office:office" xmlns:r="http://schemas.openxmlformats.org/officeDocument/2006/relationships" xmlns:m="http://schemas.openxmlformats.org/officeDocument/2006/math" xmlns:v="urn:schemas-microsoft-com:vml" xmlns:wp14="http://schemas.microsoft.com/office/word/2010/wordprocessingDrawing" xmlns:wp="http://schemas.openxmlformats.org/drawingml/2006/wordprocessingDrawing" xmlns:w10="urn:schemas-microsoft-com:office:word" xmlns:w="http://schemas.openxmlformats.org/wordprocessingml/2006/main" xmlns:w14="http://schemas.microsoft.com/office/word/2010/wordml" xmlns:w15="http://schemas.microsoft.com/office/word/2012/wordml" xmlns:w16se="http://schemas.microsoft.com/office/word/2015/wordml/symex" xmlns:wpg="http://schemas.microsoft.com/office/word/2010/wordprocessingGroup" xmlns:wpi="http://schemas.microsoft.com/office/word/2010/wordprocessingInk" xmlns:wne="http://schemas.microsoft.com/office/word/2006/wordml" xmlns:wps="http://schemas.microsoft.com/office/word/2010/wordprocessingShape" mc:Ignorable="w14 w15 w16se wp14">
   <w:p>
     <w:pPr>
       <w:pStyle w:val="normal1"/>
@@ -3117,7 +3189,7 @@
 </file>
 
 <file path=word/footer7.xml><?xml version="1.0" encoding="utf-8"?>
-<w:ftr xmlns:wpc="http://schemas.microsoft.com/office/word/2010/wordprocessingCanvas" xmlns:cx="http://schemas.microsoft.com/office/drawing/2014/chartex" xmlns:cx1="http://schemas.microsoft.com/office/drawing/2015/9/8/chartex" xmlns:cx2="http://schemas.microsoft.com/office/drawing/2015/10/21/chartex" xmlns:cx3="http://schemas.microsoft.com/office/drawing/2016/5/9/chartex" xmlns:cx4="http://schemas.microsoft.com/office/drawing/2016/5/10/chartex" xmlns:cx5="http://schemas.microsoft.com/office/drawing/2016/5/11/chartex" xmlns:cx6="http://schemas.microsoft.com/office/drawing/2016/5/12/chartex" xmlns:cx7="http://schemas.microsoft.com/office/drawing/2016/5/13/chartex" xmlns:cx8="http://schemas.microsoft.com/office/drawing/2016/5/14/chartex" xmlns:mc="http://schemas.openxmlformats.org/markup-compatibility/2006" xmlns:aink="http://schemas.microsoft.com/office/drawing/2016/ink" xmlns:am3d="http://schemas.microsoft.com/office/drawing/2017/model3d" xmlns:o="urn:schemas-microsoft-com:office:office" xmlns:r="http://schemas.openxmlformats.org/officeDocument/2006/relationships" xmlns:m="http://schemas.openxmlformats.org/officeDocument/2006/math" xmlns:v="urn:schemas-microsoft-com:vml" xmlns:wp14="http://schemas.microsoft.com/office/word/2010/wordprocessingDrawing" xmlns:wp="http://schemas.openxmlformats.org/drawingml/2006/wordprocessingDrawing" xmlns:w10="urn:schemas-microsoft-com:office:word" xmlns:w="http://schemas.openxmlformats.org/wordprocessingml/2006/main" xmlns:w14="http://schemas.microsoft.com/office/word/2010/wordml" xmlns:w15="http://schemas.microsoft.com/office/word/2012/wordml" xmlns:w16cex="http://schemas.microsoft.com/office/word/2018/wordml/cex" xmlns:w16cid="http://schemas.microsoft.com/office/word/2016/wordml/cid" xmlns:w16="http://schemas.microsoft.com/office/word/2018/wordml" xmlns:w16sdtdh="http://schemas.microsoft.com/office/word/2020/wordml/sdtdatahash" xmlns:w16se="http://schemas.microsoft.com/office/word/2015/wordml/symex" xmlns:wpg="http://schemas.microsoft.com/office/word/2010/wordprocessingGroup" xmlns:wpi="http://schemas.microsoft.com/office/word/2010/wordprocessingInk" xmlns:wne="http://schemas.microsoft.com/office/word/2006/wordml" xmlns:wps="http://schemas.microsoft.com/office/word/2010/wordprocessingShape" mc:Ignorable="w14 w15 w16se w16cid w16 w16cex w16sdtdh wp14">
+<w:ftr xmlns:wpc="http://schemas.microsoft.com/office/word/2010/wordprocessingCanvas" xmlns:cx="http://schemas.microsoft.com/office/drawing/2014/chartex" xmlns:mc="http://schemas.openxmlformats.org/markup-compatibility/2006" xmlns:o="urn:schemas-microsoft-com:office:office" xmlns:r="http://schemas.openxmlformats.org/officeDocument/2006/relationships" xmlns:m="http://schemas.openxmlformats.org/officeDocument/2006/math" xmlns:v="urn:schemas-microsoft-com:vml" xmlns:wp14="http://schemas.microsoft.com/office/word/2010/wordprocessingDrawing" xmlns:wp="http://schemas.openxmlformats.org/drawingml/2006/wordprocessingDrawing" xmlns:w10="urn:schemas-microsoft-com:office:word" xmlns:w="http://schemas.openxmlformats.org/wordprocessingml/2006/main" xmlns:w14="http://schemas.microsoft.com/office/word/2010/wordml" xmlns:w15="http://schemas.microsoft.com/office/word/2012/wordml" xmlns:w16se="http://schemas.microsoft.com/office/word/2015/wordml/symex" xmlns:wpg="http://schemas.microsoft.com/office/word/2010/wordprocessingGroup" xmlns:wpi="http://schemas.microsoft.com/office/word/2010/wordprocessingInk" xmlns:wne="http://schemas.microsoft.com/office/word/2006/wordml" xmlns:wps="http://schemas.microsoft.com/office/word/2010/wordprocessingShape" mc:Ignorable="w14 w15 w16se wp14">
   <w:p>
     <w:pPr>
       <w:pStyle w:val="normal1"/>
@@ -3127,7 +3199,7 @@
 </file>
 
 <file path=word/footnotes.xml><?xml version="1.0" encoding="utf-8"?>
-<w:footnotes xmlns:wpc="http://schemas.microsoft.com/office/word/2010/wordprocessingCanvas" xmlns:cx="http://schemas.microsoft.com/office/drawing/2014/chartex" xmlns:cx1="http://schemas.microsoft.com/office/drawing/2015/9/8/chartex" xmlns:cx2="http://schemas.microsoft.com/office/drawing/2015/10/21/chartex" xmlns:cx3="http://schemas.microsoft.com/office/drawing/2016/5/9/chartex" xmlns:cx4="http://schemas.microsoft.com/office/drawing/2016/5/10/chartex" xmlns:cx5="http://schemas.microsoft.com/office/drawing/2016/5/11/chartex" xmlns:cx6="http://schemas.microsoft.com/office/drawing/2016/5/12/chartex" xmlns:cx7="http://schemas.microsoft.com/office/drawing/2016/5/13/chartex" xmlns:cx8="http://schemas.microsoft.com/office/drawing/2016/5/14/chartex" xmlns:mc="http://schemas.openxmlformats.org/markup-compatibility/2006" xmlns:aink="http://schemas.microsoft.com/office/drawing/2016/ink" xmlns:am3d="http://schemas.microsoft.com/office/drawing/2017/model3d" xmlns:o="urn:schemas-microsoft-com:office:office" xmlns:r="http://schemas.openxmlformats.org/officeDocument/2006/relationships" xmlns:m="http://schemas.openxmlformats.org/officeDocument/2006/math" xmlns:v="urn:schemas-microsoft-com:vml" xmlns:wp14="http://schemas.microsoft.com/office/word/2010/wordprocessingDrawing" xmlns:wp="http://schemas.openxmlformats.org/drawingml/2006/wordprocessingDrawing" xmlns:w10="urn:schemas-microsoft-com:office:word" xmlns:w="http://schemas.openxmlformats.org/wordprocessingml/2006/main" xmlns:w14="http://schemas.microsoft.com/office/word/2010/wordml" xmlns:w15="http://schemas.microsoft.com/office/word/2012/wordml" xmlns:w16cex="http://schemas.microsoft.com/office/word/2018/wordml/cex" xmlns:w16cid="http://schemas.microsoft.com/office/word/2016/wordml/cid" xmlns:w16="http://schemas.microsoft.com/office/word/2018/wordml" xmlns:w16sdtdh="http://schemas.microsoft.com/office/word/2020/wordml/sdtdatahash" xmlns:w16se="http://schemas.microsoft.com/office/word/2015/wordml/symex" xmlns:wpg="http://schemas.microsoft.com/office/word/2010/wordprocessingGroup" xmlns:wpi="http://schemas.microsoft.com/office/word/2010/wordprocessingInk" xmlns:wne="http://schemas.microsoft.com/office/word/2006/wordml" xmlns:wps="http://schemas.microsoft.com/office/word/2010/wordprocessingShape" mc:Ignorable="w14 w15 w16se w16cid w16 w16cex w16sdtdh wp14">
+<w:footnotes xmlns:wpc="http://schemas.microsoft.com/office/word/2010/wordprocessingCanvas" xmlns:cx="http://schemas.microsoft.com/office/drawing/2014/chartex" xmlns:mc="http://schemas.openxmlformats.org/markup-compatibility/2006" xmlns:o="urn:schemas-microsoft-com:office:office" xmlns:r="http://schemas.openxmlformats.org/officeDocument/2006/relationships" xmlns:m="http://schemas.openxmlformats.org/officeDocument/2006/math" xmlns:v="urn:schemas-microsoft-com:vml" xmlns:wp14="http://schemas.microsoft.com/office/word/2010/wordprocessingDrawing" xmlns:wp="http://schemas.openxmlformats.org/drawingml/2006/wordprocessingDrawing" xmlns:w10="urn:schemas-microsoft-com:office:word" xmlns:w="http://schemas.openxmlformats.org/wordprocessingml/2006/main" xmlns:w14="http://schemas.microsoft.com/office/word/2010/wordml" xmlns:w15="http://schemas.microsoft.com/office/word/2012/wordml" xmlns:w16se="http://schemas.microsoft.com/office/word/2015/wordml/symex" xmlns:wpg="http://schemas.microsoft.com/office/word/2010/wordprocessingGroup" xmlns:wpi="http://schemas.microsoft.com/office/word/2010/wordprocessingInk" xmlns:wne="http://schemas.microsoft.com/office/word/2006/wordml" xmlns:wps="http://schemas.microsoft.com/office/word/2010/wordprocessingShape" mc:Ignorable="w14 w15 w16se wp14">
   <w:footnote w:type="separator" w:id="-1">
     <w:p>
       <w:r>
@@ -3146,7 +3218,7 @@
 </file>
 
 <file path=word/header1.xml><?xml version="1.0" encoding="utf-8"?>
-<w:hdr xmlns:wpc="http://schemas.microsoft.com/office/word/2010/wordprocessingCanvas" xmlns:cx="http://schemas.microsoft.com/office/drawing/2014/chartex" xmlns:cx1="http://schemas.microsoft.com/office/drawing/2015/9/8/chartex" xmlns:cx2="http://schemas.microsoft.com/office/drawing/2015/10/21/chartex" xmlns:cx3="http://schemas.microsoft.com/office/drawing/2016/5/9/chartex" xmlns:cx4="http://schemas.microsoft.com/office/drawing/2016/5/10/chartex" xmlns:cx5="http://schemas.microsoft.com/office/drawing/2016/5/11/chartex" xmlns:cx6="http://schemas.microsoft.com/office/drawing/2016/5/12/chartex" xmlns:cx7="http://schemas.microsoft.com/office/drawing/2016/5/13/chartex" xmlns:cx8="http://schemas.microsoft.com/office/drawing/2016/5/14/chartex" xmlns:mc="http://schemas.openxmlformats.org/markup-compatibility/2006" xmlns:aink="http://schemas.microsoft.com/office/drawing/2016/ink" xmlns:am3d="http://schemas.microsoft.com/office/drawing/2017/model3d" xmlns:o="urn:schemas-microsoft-com:office:office" xmlns:r="http://schemas.openxmlformats.org/officeDocument/2006/relationships" xmlns:m="http://schemas.openxmlformats.org/officeDocument/2006/math" xmlns:v="urn:schemas-microsoft-com:vml" xmlns:wp14="http://schemas.microsoft.com/office/word/2010/wordprocessingDrawing" xmlns:wp="http://schemas.openxmlformats.org/drawingml/2006/wordprocessingDrawing" xmlns:w10="urn:schemas-microsoft-com:office:word" xmlns:w="http://schemas.openxmlformats.org/wordprocessingml/2006/main" xmlns:w14="http://schemas.microsoft.com/office/word/2010/wordml" xmlns:w15="http://schemas.microsoft.com/office/word/2012/wordml" xmlns:w16cex="http://schemas.microsoft.com/office/word/2018/wordml/cex" xmlns:w16cid="http://schemas.microsoft.com/office/word/2016/wordml/cid" xmlns:w16="http://schemas.microsoft.com/office/word/2018/wordml" xmlns:w16sdtdh="http://schemas.microsoft.com/office/word/2020/wordml/sdtdatahash" xmlns:w16se="http://schemas.microsoft.com/office/word/2015/wordml/symex" xmlns:wpg="http://schemas.microsoft.com/office/word/2010/wordprocessingGroup" xmlns:wpi="http://schemas.microsoft.com/office/word/2010/wordprocessingInk" xmlns:wne="http://schemas.microsoft.com/office/word/2006/wordml" xmlns:wps="http://schemas.microsoft.com/office/word/2010/wordprocessingShape" mc:Ignorable="w14 w15 w16se w16cid w16 w16cex w16sdtdh wp14">
+<w:hdr xmlns:wpc="http://schemas.microsoft.com/office/word/2010/wordprocessingCanvas" xmlns:cx="http://schemas.microsoft.com/office/drawing/2014/chartex" xmlns:mc="http://schemas.openxmlformats.org/markup-compatibility/2006" xmlns:o="urn:schemas-microsoft-com:office:office" xmlns:r="http://schemas.openxmlformats.org/officeDocument/2006/relationships" xmlns:m="http://schemas.openxmlformats.org/officeDocument/2006/math" xmlns:v="urn:schemas-microsoft-com:vml" xmlns:wp14="http://schemas.microsoft.com/office/word/2010/wordprocessingDrawing" xmlns:wp="http://schemas.openxmlformats.org/drawingml/2006/wordprocessingDrawing" xmlns:w10="urn:schemas-microsoft-com:office:word" xmlns:w="http://schemas.openxmlformats.org/wordprocessingml/2006/main" xmlns:w14="http://schemas.microsoft.com/office/word/2010/wordml" xmlns:w15="http://schemas.microsoft.com/office/word/2012/wordml" xmlns:w16se="http://schemas.microsoft.com/office/word/2015/wordml/symex" xmlns:wpg="http://schemas.microsoft.com/office/word/2010/wordprocessingGroup" xmlns:wpi="http://schemas.microsoft.com/office/word/2010/wordprocessingInk" xmlns:wne="http://schemas.microsoft.com/office/word/2006/wordml" xmlns:wps="http://schemas.microsoft.com/office/word/2010/wordprocessingShape" mc:Ignorable="w14 w15 w16se wp14">
   <w:p>
     <w:pPr>
       <w:pStyle w:val="Encabezado"/>
@@ -3156,7 +3228,7 @@
 </file>
 
 <file path=word/header2.xml><?xml version="1.0" encoding="utf-8"?>
-<w:hdr xmlns:wpc="http://schemas.microsoft.com/office/word/2010/wordprocessingCanvas" xmlns:cx="http://schemas.microsoft.com/office/drawing/2014/chartex" xmlns:cx1="http://schemas.microsoft.com/office/drawing/2015/9/8/chartex" xmlns:cx2="http://schemas.microsoft.com/office/drawing/2015/10/21/chartex" xmlns:cx3="http://schemas.microsoft.com/office/drawing/2016/5/9/chartex" xmlns:cx4="http://schemas.microsoft.com/office/drawing/2016/5/10/chartex" xmlns:cx5="http://schemas.microsoft.com/office/drawing/2016/5/11/chartex" xmlns:cx6="http://schemas.microsoft.com/office/drawing/2016/5/12/chartex" xmlns:cx7="http://schemas.microsoft.com/office/drawing/2016/5/13/chartex" xmlns:cx8="http://schemas.microsoft.com/office/drawing/2016/5/14/chartex" xmlns:mc="http://schemas.openxmlformats.org/markup-compatibility/2006" xmlns:aink="http://schemas.microsoft.com/office/drawing/2016/ink" xmlns:am3d="http://schemas.microsoft.com/office/drawing/2017/model3d" xmlns:o="urn:schemas-microsoft-com:office:office" xmlns:r="http://schemas.openxmlformats.org/officeDocument/2006/relationships" xmlns:m="http://schemas.openxmlformats.org/officeDocument/2006/math" xmlns:v="urn:schemas-microsoft-com:vml" xmlns:wp14="http://schemas.microsoft.com/office/word/2010/wordprocessingDrawing" xmlns:wp="http://schemas.openxmlformats.org/drawingml/2006/wordprocessingDrawing" xmlns:w10="urn:schemas-microsoft-com:office:word" xmlns:w="http://schemas.openxmlformats.org/wordprocessingml/2006/main" xmlns:w14="http://schemas.microsoft.com/office/word/2010/wordml" xmlns:w15="http://schemas.microsoft.com/office/word/2012/wordml" xmlns:w16cex="http://schemas.microsoft.com/office/word/2018/wordml/cex" xmlns:w16cid="http://schemas.microsoft.com/office/word/2016/wordml/cid" xmlns:w16="http://schemas.microsoft.com/office/word/2018/wordml" xmlns:w16sdtdh="http://schemas.microsoft.com/office/word/2020/wordml/sdtdatahash" xmlns:w16se="http://schemas.microsoft.com/office/word/2015/wordml/symex" xmlns:wpg="http://schemas.microsoft.com/office/word/2010/wordprocessingGroup" xmlns:wpi="http://schemas.microsoft.com/office/word/2010/wordprocessingInk" xmlns:wne="http://schemas.microsoft.com/office/word/2006/wordml" xmlns:wps="http://schemas.microsoft.com/office/word/2010/wordprocessingShape" mc:Ignorable="w14 w15 w16se w16cid w16 w16cex w16sdtdh wp14">
+<w:hdr xmlns:wpc="http://schemas.microsoft.com/office/word/2010/wordprocessingCanvas" xmlns:cx="http://schemas.microsoft.com/office/drawing/2014/chartex" xmlns:mc="http://schemas.openxmlformats.org/markup-compatibility/2006" xmlns:o="urn:schemas-microsoft-com:office:office" xmlns:r="http://schemas.openxmlformats.org/officeDocument/2006/relationships" xmlns:m="http://schemas.openxmlformats.org/officeDocument/2006/math" xmlns:v="urn:schemas-microsoft-com:vml" xmlns:wp14="http://schemas.microsoft.com/office/word/2010/wordprocessingDrawing" xmlns:wp="http://schemas.openxmlformats.org/drawingml/2006/wordprocessingDrawing" xmlns:w10="urn:schemas-microsoft-com:office:word" xmlns:w="http://schemas.openxmlformats.org/wordprocessingml/2006/main" xmlns:w14="http://schemas.microsoft.com/office/word/2010/wordml" xmlns:w15="http://schemas.microsoft.com/office/word/2012/wordml" xmlns:w16se="http://schemas.microsoft.com/office/word/2015/wordml/symex" xmlns:wpg="http://schemas.microsoft.com/office/word/2010/wordprocessingGroup" xmlns:wpi="http://schemas.microsoft.com/office/word/2010/wordprocessingInk" xmlns:wne="http://schemas.microsoft.com/office/word/2006/wordml" xmlns:wps="http://schemas.microsoft.com/office/word/2010/wordprocessingShape" mc:Ignorable="w14 w15 w16se wp14">
   <w:p>
     <w:pPr>
       <w:pStyle w:val="normal1"/>
@@ -3173,6 +3245,7 @@
         <w:color w:val="000000"/>
         <w:sz w:val="20"/>
         <w:szCs w:val="20"/>
+        <w:lang w:val="es-MX" w:eastAsia="es-MX" w:bidi="ar-SA"/>
       </w:rPr>
       <w:drawing>
         <wp:anchor distT="0" distB="0" distL="0" distR="0" simplePos="0" relativeHeight="251656704" behindDoc="1" locked="0" layoutInCell="0" allowOverlap="1" wp14:anchorId="06ABF560" wp14:editId="0DF12631">
@@ -3227,6 +3300,7 @@
         <w:color w:val="000000"/>
         <w:sz w:val="20"/>
         <w:szCs w:val="20"/>
+        <w:lang w:val="es-MX" w:eastAsia="es-MX" w:bidi="ar-SA"/>
       </w:rPr>
       <w:drawing>
         <wp:anchor distT="0" distB="0" distL="0" distR="0" simplePos="0" relativeHeight="251658752" behindDoc="1" locked="0" layoutInCell="1" allowOverlap="1" wp14:anchorId="7752CFC2" wp14:editId="3EF93AE4">
@@ -3279,7 +3353,7 @@
 </file>
 
 <file path=word/header3.xml><?xml version="1.0" encoding="utf-8"?>
-<w:hdr xmlns:wpc="http://schemas.microsoft.com/office/word/2010/wordprocessingCanvas" xmlns:cx="http://schemas.microsoft.com/office/drawing/2014/chartex" xmlns:cx1="http://schemas.microsoft.com/office/drawing/2015/9/8/chartex" xmlns:cx2="http://schemas.microsoft.com/office/drawing/2015/10/21/chartex" xmlns:cx3="http://schemas.microsoft.com/office/drawing/2016/5/9/chartex" xmlns:cx4="http://schemas.microsoft.com/office/drawing/2016/5/10/chartex" xmlns:cx5="http://schemas.microsoft.com/office/drawing/2016/5/11/chartex" xmlns:cx6="http://schemas.microsoft.com/office/drawing/2016/5/12/chartex" xmlns:cx7="http://schemas.microsoft.com/office/drawing/2016/5/13/chartex" xmlns:cx8="http://schemas.microsoft.com/office/drawing/2016/5/14/chartex" xmlns:mc="http://schemas.openxmlformats.org/markup-compatibility/2006" xmlns:aink="http://schemas.microsoft.com/office/drawing/2016/ink" xmlns:am3d="http://schemas.microsoft.com/office/drawing/2017/model3d" xmlns:o="urn:schemas-microsoft-com:office:office" xmlns:r="http://schemas.openxmlformats.org/officeDocument/2006/relationships" xmlns:m="http://schemas.openxmlformats.org/officeDocument/2006/math" xmlns:v="urn:schemas-microsoft-com:vml" xmlns:wp14="http://schemas.microsoft.com/office/word/2010/wordprocessingDrawing" xmlns:wp="http://schemas.openxmlformats.org/drawingml/2006/wordprocessingDrawing" xmlns:w10="urn:schemas-microsoft-com:office:word" xmlns:w="http://schemas.openxmlformats.org/wordprocessingml/2006/main" xmlns:w14="http://schemas.microsoft.com/office/word/2010/wordml" xmlns:w15="http://schemas.microsoft.com/office/word/2012/wordml" xmlns:w16cex="http://schemas.microsoft.com/office/word/2018/wordml/cex" xmlns:w16cid="http://schemas.microsoft.com/office/word/2016/wordml/cid" xmlns:w16="http://schemas.microsoft.com/office/word/2018/wordml" xmlns:w16sdtdh="http://schemas.microsoft.com/office/word/2020/wordml/sdtdatahash" xmlns:w16se="http://schemas.microsoft.com/office/word/2015/wordml/symex" xmlns:wpg="http://schemas.microsoft.com/office/word/2010/wordprocessingGroup" xmlns:wpi="http://schemas.microsoft.com/office/word/2010/wordprocessingInk" xmlns:wne="http://schemas.microsoft.com/office/word/2006/wordml" xmlns:wps="http://schemas.microsoft.com/office/word/2010/wordprocessingShape" mc:Ignorable="w14 w15 w16se w16cid w16 w16cex w16sdtdh wp14">
+<w:hdr xmlns:wpc="http://schemas.microsoft.com/office/word/2010/wordprocessingCanvas" xmlns:cx="http://schemas.microsoft.com/office/drawing/2014/chartex" xmlns:mc="http://schemas.openxmlformats.org/markup-compatibility/2006" xmlns:o="urn:schemas-microsoft-com:office:office" xmlns:r="http://schemas.openxmlformats.org/officeDocument/2006/relationships" xmlns:m="http://schemas.openxmlformats.org/officeDocument/2006/math" xmlns:v="urn:schemas-microsoft-com:vml" xmlns:wp14="http://schemas.microsoft.com/office/word/2010/wordprocessingDrawing" xmlns:wp="http://schemas.openxmlformats.org/drawingml/2006/wordprocessingDrawing" xmlns:w10="urn:schemas-microsoft-com:office:word" xmlns:w="http://schemas.openxmlformats.org/wordprocessingml/2006/main" xmlns:w14="http://schemas.microsoft.com/office/word/2010/wordml" xmlns:w15="http://schemas.microsoft.com/office/word/2012/wordml" xmlns:w16se="http://schemas.microsoft.com/office/word/2015/wordml/symex" xmlns:wpg="http://schemas.microsoft.com/office/word/2010/wordprocessingGroup" xmlns:wpi="http://schemas.microsoft.com/office/word/2010/wordprocessingInk" xmlns:wne="http://schemas.microsoft.com/office/word/2006/wordml" xmlns:wps="http://schemas.microsoft.com/office/word/2010/wordprocessingShape" mc:Ignorable="w14 w15 w16se wp14">
   <w:p>
     <w:pPr>
       <w:pStyle w:val="normal1"/>
@@ -3296,6 +3370,7 @@
         <w:color w:val="000000"/>
         <w:sz w:val="20"/>
         <w:szCs w:val="20"/>
+        <w:lang w:val="es-MX" w:eastAsia="es-MX" w:bidi="ar-SA"/>
       </w:rPr>
       <w:drawing>
         <wp:anchor distT="0" distB="0" distL="0" distR="0" simplePos="0" relativeHeight="251657728" behindDoc="1" locked="0" layoutInCell="0" allowOverlap="1" wp14:anchorId="793ED4D6" wp14:editId="7A781E8F">
@@ -3350,6 +3425,7 @@
         <w:color w:val="000000"/>
         <w:sz w:val="20"/>
         <w:szCs w:val="20"/>
+        <w:lang w:val="es-MX" w:eastAsia="es-MX" w:bidi="ar-SA"/>
       </w:rPr>
       <w:drawing>
         <wp:anchor distT="0" distB="0" distL="0" distR="0" simplePos="0" relativeHeight="251659776" behindDoc="1" locked="0" layoutInCell="1" allowOverlap="1" wp14:anchorId="6D3947DC" wp14:editId="4986C320">
@@ -3402,7 +3478,7 @@
 </file>
 
 <file path=word/header4.xml><?xml version="1.0" encoding="utf-8"?>
-<w:hdr xmlns:wpc="http://schemas.microsoft.com/office/word/2010/wordprocessingCanvas" xmlns:cx="http://schemas.microsoft.com/office/drawing/2014/chartex" xmlns:cx1="http://schemas.microsoft.com/office/drawing/2015/9/8/chartex" xmlns:cx2="http://schemas.microsoft.com/office/drawing/2015/10/21/chartex" xmlns:cx3="http://schemas.microsoft.com/office/drawing/2016/5/9/chartex" xmlns:cx4="http://schemas.microsoft.com/office/drawing/2016/5/10/chartex" xmlns:cx5="http://schemas.microsoft.com/office/drawing/2016/5/11/chartex" xmlns:cx6="http://schemas.microsoft.com/office/drawing/2016/5/12/chartex" xmlns:cx7="http://schemas.microsoft.com/office/drawing/2016/5/13/chartex" xmlns:cx8="http://schemas.microsoft.com/office/drawing/2016/5/14/chartex" xmlns:mc="http://schemas.openxmlformats.org/markup-compatibility/2006" xmlns:aink="http://schemas.microsoft.com/office/drawing/2016/ink" xmlns:am3d="http://schemas.microsoft.com/office/drawing/2017/model3d" xmlns:o="urn:schemas-microsoft-com:office:office" xmlns:r="http://schemas.openxmlformats.org/officeDocument/2006/relationships" xmlns:m="http://schemas.openxmlformats.org/officeDocument/2006/math" xmlns:v="urn:schemas-microsoft-com:vml" xmlns:wp14="http://schemas.microsoft.com/office/word/2010/wordprocessingDrawing" xmlns:wp="http://schemas.openxmlformats.org/drawingml/2006/wordprocessingDrawing" xmlns:w10="urn:schemas-microsoft-com:office:word" xmlns:w="http://schemas.openxmlformats.org/wordprocessingml/2006/main" xmlns:w14="http://schemas.microsoft.com/office/word/2010/wordml" xmlns:w15="http://schemas.microsoft.com/office/word/2012/wordml" xmlns:w16cex="http://schemas.microsoft.com/office/word/2018/wordml/cex" xmlns:w16cid="http://schemas.microsoft.com/office/word/2016/wordml/cid" xmlns:w16="http://schemas.microsoft.com/office/word/2018/wordml" xmlns:w16sdtdh="http://schemas.microsoft.com/office/word/2020/wordml/sdtdatahash" xmlns:w16se="http://schemas.microsoft.com/office/word/2015/wordml/symex" xmlns:wpg="http://schemas.microsoft.com/office/word/2010/wordprocessingGroup" xmlns:wpi="http://schemas.microsoft.com/office/word/2010/wordprocessingInk" xmlns:wne="http://schemas.microsoft.com/office/word/2006/wordml" xmlns:wps="http://schemas.microsoft.com/office/word/2010/wordprocessingShape" mc:Ignorable="w14 w15 w16se w16cid w16 w16cex w16sdtdh wp14">
+<w:hdr xmlns:wpc="http://schemas.microsoft.com/office/word/2010/wordprocessingCanvas" xmlns:cx="http://schemas.microsoft.com/office/drawing/2014/chartex" xmlns:mc="http://schemas.openxmlformats.org/markup-compatibility/2006" xmlns:o="urn:schemas-microsoft-com:office:office" xmlns:r="http://schemas.openxmlformats.org/officeDocument/2006/relationships" xmlns:m="http://schemas.openxmlformats.org/officeDocument/2006/math" xmlns:v="urn:schemas-microsoft-com:vml" xmlns:wp14="http://schemas.microsoft.com/office/word/2010/wordprocessingDrawing" xmlns:wp="http://schemas.openxmlformats.org/drawingml/2006/wordprocessingDrawing" xmlns:w10="urn:schemas-microsoft-com:office:word" xmlns:w="http://schemas.openxmlformats.org/wordprocessingml/2006/main" xmlns:w14="http://schemas.microsoft.com/office/word/2010/wordml" xmlns:w15="http://schemas.microsoft.com/office/word/2012/wordml" xmlns:w16se="http://schemas.microsoft.com/office/word/2015/wordml/symex" xmlns:wpg="http://schemas.microsoft.com/office/word/2010/wordprocessingGroup" xmlns:wpi="http://schemas.microsoft.com/office/word/2010/wordprocessingInk" xmlns:wne="http://schemas.microsoft.com/office/word/2006/wordml" xmlns:wps="http://schemas.microsoft.com/office/word/2010/wordprocessingShape" mc:Ignorable="w14 w15 w16se wp14">
   <w:p>
     <w:pPr>
       <w:pStyle w:val="normal1"/>
@@ -3419,6 +3495,7 @@
         <w:color w:val="000000"/>
         <w:sz w:val="20"/>
         <w:szCs w:val="20"/>
+        <w:lang w:val="es-MX" w:eastAsia="es-MX" w:bidi="ar-SA"/>
       </w:rPr>
       <w:drawing>
         <wp:anchor distT="0" distB="0" distL="0" distR="0" simplePos="0" relativeHeight="251660800" behindDoc="1" locked="0" layoutInCell="0" allowOverlap="1" wp14:anchorId="4FE6751D" wp14:editId="5727CC06">
@@ -3473,6 +3550,7 @@
         <w:color w:val="000000"/>
         <w:sz w:val="20"/>
         <w:szCs w:val="20"/>
+        <w:lang w:val="es-MX" w:eastAsia="es-MX" w:bidi="ar-SA"/>
       </w:rPr>
       <w:drawing>
         <wp:anchor distT="0" distB="0" distL="0" distR="0" simplePos="0" relativeHeight="251661824" behindDoc="1" locked="0" layoutInCell="1" allowOverlap="1" wp14:anchorId="2CCAF100" wp14:editId="008C5948">
@@ -3525,7 +3603,7 @@
 </file>
 
 <file path=word/header5.xml><?xml version="1.0" encoding="utf-8"?>
-<w:hdr xmlns:wpc="http://schemas.microsoft.com/office/word/2010/wordprocessingCanvas" xmlns:cx="http://schemas.microsoft.com/office/drawing/2014/chartex" xmlns:cx1="http://schemas.microsoft.com/office/drawing/2015/9/8/chartex" xmlns:cx2="http://schemas.microsoft.com/office/drawing/2015/10/21/chartex" xmlns:cx3="http://schemas.microsoft.com/office/drawing/2016/5/9/chartex" xmlns:cx4="http://schemas.microsoft.com/office/drawing/2016/5/10/chartex" xmlns:cx5="http://schemas.microsoft.com/office/drawing/2016/5/11/chartex" xmlns:cx6="http://schemas.microsoft.com/office/drawing/2016/5/12/chartex" xmlns:cx7="http://schemas.microsoft.com/office/drawing/2016/5/13/chartex" xmlns:cx8="http://schemas.microsoft.com/office/drawing/2016/5/14/chartex" xmlns:mc="http://schemas.openxmlformats.org/markup-compatibility/2006" xmlns:aink="http://schemas.microsoft.com/office/drawing/2016/ink" xmlns:am3d="http://schemas.microsoft.com/office/drawing/2017/model3d" xmlns:o="urn:schemas-microsoft-com:office:office" xmlns:r="http://schemas.openxmlformats.org/officeDocument/2006/relationships" xmlns:m="http://schemas.openxmlformats.org/officeDocument/2006/math" xmlns:v="urn:schemas-microsoft-com:vml" xmlns:wp14="http://schemas.microsoft.com/office/word/2010/wordprocessingDrawing" xmlns:wp="http://schemas.openxmlformats.org/drawingml/2006/wordprocessingDrawing" xmlns:w10="urn:schemas-microsoft-com:office:word" xmlns:w="http://schemas.openxmlformats.org/wordprocessingml/2006/main" xmlns:w14="http://schemas.microsoft.com/office/word/2010/wordml" xmlns:w15="http://schemas.microsoft.com/office/word/2012/wordml" xmlns:w16cex="http://schemas.microsoft.com/office/word/2018/wordml/cex" xmlns:w16cid="http://schemas.microsoft.com/office/word/2016/wordml/cid" xmlns:w16="http://schemas.microsoft.com/office/word/2018/wordml" xmlns:w16sdtdh="http://schemas.microsoft.com/office/word/2020/wordml/sdtdatahash" xmlns:w16se="http://schemas.microsoft.com/office/word/2015/wordml/symex" xmlns:wpg="http://schemas.microsoft.com/office/word/2010/wordprocessingGroup" xmlns:wpi="http://schemas.microsoft.com/office/word/2010/wordprocessingInk" xmlns:wne="http://schemas.microsoft.com/office/word/2006/wordml" xmlns:wps="http://schemas.microsoft.com/office/word/2010/wordprocessingShape" mc:Ignorable="w14 w15 w16se w16cid w16 w16cex w16sdtdh wp14">
+<w:hdr xmlns:wpc="http://schemas.microsoft.com/office/word/2010/wordprocessingCanvas" xmlns:cx="http://schemas.microsoft.com/office/drawing/2014/chartex" xmlns:mc="http://schemas.openxmlformats.org/markup-compatibility/2006" xmlns:o="urn:schemas-microsoft-com:office:office" xmlns:r="http://schemas.openxmlformats.org/officeDocument/2006/relationships" xmlns:m="http://schemas.openxmlformats.org/officeDocument/2006/math" xmlns:v="urn:schemas-microsoft-com:vml" xmlns:wp14="http://schemas.microsoft.com/office/word/2010/wordprocessingDrawing" xmlns:wp="http://schemas.openxmlformats.org/drawingml/2006/wordprocessingDrawing" xmlns:w10="urn:schemas-microsoft-com:office:word" xmlns:w="http://schemas.openxmlformats.org/wordprocessingml/2006/main" xmlns:w14="http://schemas.microsoft.com/office/word/2010/wordml" xmlns:w15="http://schemas.microsoft.com/office/word/2012/wordml" xmlns:w16se="http://schemas.microsoft.com/office/word/2015/wordml/symex" xmlns:wpg="http://schemas.microsoft.com/office/word/2010/wordprocessingGroup" xmlns:wpi="http://schemas.microsoft.com/office/word/2010/wordprocessingInk" xmlns:wne="http://schemas.microsoft.com/office/word/2006/wordml" xmlns:wps="http://schemas.microsoft.com/office/word/2010/wordprocessingShape" mc:Ignorable="w14 w15 w16se wp14">
   <w:p>
     <w:pPr>
       <w:pStyle w:val="normal1"/>
@@ -3535,7 +3613,7 @@
 </file>
 
 <file path=word/header6.xml><?xml version="1.0" encoding="utf-8"?>
-<w:hdr xmlns:wpc="http://schemas.microsoft.com/office/word/2010/wordprocessingCanvas" xmlns:cx="http://schemas.microsoft.com/office/drawing/2014/chartex" xmlns:cx1="http://schemas.microsoft.com/office/drawing/2015/9/8/chartex" xmlns:cx2="http://schemas.microsoft.com/office/drawing/2015/10/21/chartex" xmlns:cx3="http://schemas.microsoft.com/office/drawing/2016/5/9/chartex" xmlns:cx4="http://schemas.microsoft.com/office/drawing/2016/5/10/chartex" xmlns:cx5="http://schemas.microsoft.com/office/drawing/2016/5/11/chartex" xmlns:cx6="http://schemas.microsoft.com/office/drawing/2016/5/12/chartex" xmlns:cx7="http://schemas.microsoft.com/office/drawing/2016/5/13/chartex" xmlns:cx8="http://schemas.microsoft.com/office/drawing/2016/5/14/chartex" xmlns:mc="http://schemas.openxmlformats.org/markup-compatibility/2006" xmlns:aink="http://schemas.microsoft.com/office/drawing/2016/ink" xmlns:am3d="http://schemas.microsoft.com/office/drawing/2017/model3d" xmlns:o="urn:schemas-microsoft-com:office:office" xmlns:r="http://schemas.openxmlformats.org/officeDocument/2006/relationships" xmlns:m="http://schemas.openxmlformats.org/officeDocument/2006/math" xmlns:v="urn:schemas-microsoft-com:vml" xmlns:wp14="http://schemas.microsoft.com/office/word/2010/wordprocessingDrawing" xmlns:wp="http://schemas.openxmlformats.org/drawingml/2006/wordprocessingDrawing" xmlns:w10="urn:schemas-microsoft-com:office:word" xmlns:w="http://schemas.openxmlformats.org/wordprocessingml/2006/main" xmlns:w14="http://schemas.microsoft.com/office/word/2010/wordml" xmlns:w15="http://schemas.microsoft.com/office/word/2012/wordml" xmlns:w16cex="http://schemas.microsoft.com/office/word/2018/wordml/cex" xmlns:w16cid="http://schemas.microsoft.com/office/word/2016/wordml/cid" xmlns:w16="http://schemas.microsoft.com/office/word/2018/wordml" xmlns:w16sdtdh="http://schemas.microsoft.com/office/word/2020/wordml/sdtdatahash" xmlns:w16se="http://schemas.microsoft.com/office/word/2015/wordml/symex" xmlns:wpg="http://schemas.microsoft.com/office/word/2010/wordprocessingGroup" xmlns:wpi="http://schemas.microsoft.com/office/word/2010/wordprocessingInk" xmlns:wne="http://schemas.microsoft.com/office/word/2006/wordml" xmlns:wps="http://schemas.microsoft.com/office/word/2010/wordprocessingShape" mc:Ignorable="w14 w15 w16se w16cid w16 w16cex w16sdtdh wp14">
+<w:hdr xmlns:wpc="http://schemas.microsoft.com/office/word/2010/wordprocessingCanvas" xmlns:cx="http://schemas.microsoft.com/office/drawing/2014/chartex" xmlns:mc="http://schemas.openxmlformats.org/markup-compatibility/2006" xmlns:o="urn:schemas-microsoft-com:office:office" xmlns:r="http://schemas.openxmlformats.org/officeDocument/2006/relationships" xmlns:m="http://schemas.openxmlformats.org/officeDocument/2006/math" xmlns:v="urn:schemas-microsoft-com:vml" xmlns:wp14="http://schemas.microsoft.com/office/word/2010/wordprocessingDrawing" xmlns:wp="http://schemas.openxmlformats.org/drawingml/2006/wordprocessingDrawing" xmlns:w10="urn:schemas-microsoft-com:office:word" xmlns:w="http://schemas.openxmlformats.org/wordprocessingml/2006/main" xmlns:w14="http://schemas.microsoft.com/office/word/2010/wordml" xmlns:w15="http://schemas.microsoft.com/office/word/2012/wordml" xmlns:w16se="http://schemas.microsoft.com/office/word/2015/wordml/symex" xmlns:wpg="http://schemas.microsoft.com/office/word/2010/wordprocessingGroup" xmlns:wpi="http://schemas.microsoft.com/office/word/2010/wordprocessingInk" xmlns:wne="http://schemas.microsoft.com/office/word/2006/wordml" xmlns:wps="http://schemas.microsoft.com/office/word/2010/wordprocessingShape" mc:Ignorable="w14 w15 w16se wp14">
   <w:p>
     <w:pPr>
       <w:pStyle w:val="normal1"/>
@@ -3552,6 +3630,7 @@
         <w:color w:val="000000"/>
         <w:sz w:val="20"/>
         <w:szCs w:val="20"/>
+        <w:lang w:val="es-MX" w:eastAsia="es-MX" w:bidi="ar-SA"/>
       </w:rPr>
       <w:drawing>
         <wp:anchor distT="0" distB="0" distL="0" distR="0" simplePos="0" relativeHeight="251653632" behindDoc="1" locked="0" layoutInCell="0" allowOverlap="1" wp14:anchorId="0B838C9B" wp14:editId="50B5BB9F">
@@ -3604,7 +3683,7 @@
 </file>
 
 <file path=word/header7.xml><?xml version="1.0" encoding="utf-8"?>
-<w:hdr xmlns:wpc="http://schemas.microsoft.com/office/word/2010/wordprocessingCanvas" xmlns:cx="http://schemas.microsoft.com/office/drawing/2014/chartex" xmlns:cx1="http://schemas.microsoft.com/office/drawing/2015/9/8/chartex" xmlns:cx2="http://schemas.microsoft.com/office/drawing/2015/10/21/chartex" xmlns:cx3="http://schemas.microsoft.com/office/drawing/2016/5/9/chartex" xmlns:cx4="http://schemas.microsoft.com/office/drawing/2016/5/10/chartex" xmlns:cx5="http://schemas.microsoft.com/office/drawing/2016/5/11/chartex" xmlns:cx6="http://schemas.microsoft.com/office/drawing/2016/5/12/chartex" xmlns:cx7="http://schemas.microsoft.com/office/drawing/2016/5/13/chartex" xmlns:cx8="http://schemas.microsoft.com/office/drawing/2016/5/14/chartex" xmlns:mc="http://schemas.openxmlformats.org/markup-compatibility/2006" xmlns:aink="http://schemas.microsoft.com/office/drawing/2016/ink" xmlns:am3d="http://schemas.microsoft.com/office/drawing/2017/model3d" xmlns:o="urn:schemas-microsoft-com:office:office" xmlns:r="http://schemas.openxmlformats.org/officeDocument/2006/relationships" xmlns:m="http://schemas.openxmlformats.org/officeDocument/2006/math" xmlns:v="urn:schemas-microsoft-com:vml" xmlns:wp14="http://schemas.microsoft.com/office/word/2010/wordprocessingDrawing" xmlns:wp="http://schemas.openxmlformats.org/drawingml/2006/wordprocessingDrawing" xmlns:w10="urn:schemas-microsoft-com:office:word" xmlns:w="http://schemas.openxmlformats.org/wordprocessingml/2006/main" xmlns:w14="http://schemas.microsoft.com/office/word/2010/wordml" xmlns:w15="http://schemas.microsoft.com/office/word/2012/wordml" xmlns:w16cex="http://schemas.microsoft.com/office/word/2018/wordml/cex" xmlns:w16cid="http://schemas.microsoft.com/office/word/2016/wordml/cid" xmlns:w16="http://schemas.microsoft.com/office/word/2018/wordml" xmlns:w16sdtdh="http://schemas.microsoft.com/office/word/2020/wordml/sdtdatahash" xmlns:w16se="http://schemas.microsoft.com/office/word/2015/wordml/symex" xmlns:wpg="http://schemas.microsoft.com/office/word/2010/wordprocessingGroup" xmlns:wpi="http://schemas.microsoft.com/office/word/2010/wordprocessingInk" xmlns:wne="http://schemas.microsoft.com/office/word/2006/wordml" xmlns:wps="http://schemas.microsoft.com/office/word/2010/wordprocessingShape" mc:Ignorable="w14 w15 w16se w16cid w16 w16cex w16sdtdh wp14">
+<w:hdr xmlns:wpc="http://schemas.microsoft.com/office/word/2010/wordprocessingCanvas" xmlns:cx="http://schemas.microsoft.com/office/drawing/2014/chartex" xmlns:mc="http://schemas.openxmlformats.org/markup-compatibility/2006" xmlns:o="urn:schemas-microsoft-com:office:office" xmlns:r="http://schemas.openxmlformats.org/officeDocument/2006/relationships" xmlns:m="http://schemas.openxmlformats.org/officeDocument/2006/math" xmlns:v="urn:schemas-microsoft-com:vml" xmlns:wp14="http://schemas.microsoft.com/office/word/2010/wordprocessingDrawing" xmlns:wp="http://schemas.openxmlformats.org/drawingml/2006/wordprocessingDrawing" xmlns:w10="urn:schemas-microsoft-com:office:word" xmlns:w="http://schemas.openxmlformats.org/wordprocessingml/2006/main" xmlns:w14="http://schemas.microsoft.com/office/word/2010/wordml" xmlns:w15="http://schemas.microsoft.com/office/word/2012/wordml" xmlns:w16se="http://schemas.microsoft.com/office/word/2015/wordml/symex" xmlns:wpg="http://schemas.microsoft.com/office/word/2010/wordprocessingGroup" xmlns:wpi="http://schemas.microsoft.com/office/word/2010/wordprocessingInk" xmlns:wne="http://schemas.microsoft.com/office/word/2006/wordml" xmlns:wps="http://schemas.microsoft.com/office/word/2010/wordprocessingShape" mc:Ignorable="w14 w15 w16se wp14">
   <w:p>
     <w:pPr>
       <w:pStyle w:val="normal1"/>
@@ -3614,7 +3693,7 @@
 </file>
 
 <file path=word/numbering.xml><?xml version="1.0" encoding="utf-8"?>
-<w:numbering xmlns:wpc="http://schemas.microsoft.com/office/word/2010/wordprocessingCanvas" xmlns:cx="http://schemas.microsoft.com/office/drawing/2014/chartex" xmlns:cx1="http://schemas.microsoft.com/office/drawing/2015/9/8/chartex" xmlns:cx2="http://schemas.microsoft.com/office/drawing/2015/10/21/chartex" xmlns:cx3="http://schemas.microsoft.com/office/drawing/2016/5/9/chartex" xmlns:cx4="http://schemas.microsoft.com/office/drawing/2016/5/10/chartex" xmlns:cx5="http://schemas.microsoft.com/office/drawing/2016/5/11/chartex" xmlns:cx6="http://schemas.microsoft.com/office/drawing/2016/5/12/chartex" xmlns:cx7="http://schemas.microsoft.com/office/drawing/2016/5/13/chartex" xmlns:cx8="http://schemas.microsoft.com/office/drawing/2016/5/14/chartex" xmlns:mc="http://schemas.openxmlformats.org/markup-compatibility/2006" xmlns:aink="http://schemas.microsoft.com/office/drawing/2016/ink" xmlns:am3d="http://schemas.microsoft.com/office/drawing/2017/model3d" xmlns:o="urn:schemas-microsoft-com:office:office" xmlns:r="http://schemas.openxmlformats.org/officeDocument/2006/relationships" xmlns:m="http://schemas.openxmlformats.org/officeDocument/2006/math" xmlns:v="urn:schemas-microsoft-com:vml" xmlns:wp14="http://schemas.microsoft.com/office/word/2010/wordprocessingDrawing" xmlns:wp="http://schemas.openxmlformats.org/drawingml/2006/wordprocessingDrawing" xmlns:w10="urn:schemas-microsoft-com:office:word" xmlns:w="http://schemas.openxmlformats.org/wordprocessingml/2006/main" xmlns:w14="http://schemas.microsoft.com/office/word/2010/wordml" xmlns:w15="http://schemas.microsoft.com/office/word/2012/wordml" xmlns:w16cex="http://schemas.microsoft.com/office/word/2018/wordml/cex" xmlns:w16cid="http://schemas.microsoft.com/office/word/2016/wordml/cid" xmlns:w16="http://schemas.microsoft.com/office/word/2018/wordml" xmlns:w16sdtdh="http://schemas.microsoft.com/office/word/2020/wordml/sdtdatahash" xmlns:w16se="http://schemas.microsoft.com/office/word/2015/wordml/symex" xmlns:wpg="http://schemas.microsoft.com/office/word/2010/wordprocessingGroup" xmlns:wpi="http://schemas.microsoft.com/office/word/2010/wordprocessingInk" xmlns:wne="http://schemas.microsoft.com/office/word/2006/wordml" xmlns:wps="http://schemas.microsoft.com/office/word/2010/wordprocessingShape" mc:Ignorable="w14 w15 w16se w16cid w16 w16cex w16sdtdh wp14">
+<w:numbering xmlns:wpc="http://schemas.microsoft.com/office/word/2010/wordprocessingCanvas" xmlns:cx="http://schemas.microsoft.com/office/drawing/2014/chartex" xmlns:mc="http://schemas.openxmlformats.org/markup-compatibility/2006" xmlns:o="urn:schemas-microsoft-com:office:office" xmlns:r="http://schemas.openxmlformats.org/officeDocument/2006/relationships" xmlns:m="http://schemas.openxmlformats.org/officeDocument/2006/math" xmlns:v="urn:schemas-microsoft-com:vml" xmlns:wp14="http://schemas.microsoft.com/office/word/2010/wordprocessingDrawing" xmlns:wp="http://schemas.openxmlformats.org/drawingml/2006/wordprocessingDrawing" xmlns:w10="urn:schemas-microsoft-com:office:word" xmlns:w="http://schemas.openxmlformats.org/wordprocessingml/2006/main" xmlns:w14="http://schemas.microsoft.com/office/word/2010/wordml" xmlns:w15="http://schemas.microsoft.com/office/word/2012/wordml" xmlns:w16se="http://schemas.microsoft.com/office/word/2015/wordml/symex" xmlns:wpg="http://schemas.microsoft.com/office/word/2010/wordprocessingGroup" xmlns:wpi="http://schemas.microsoft.com/office/word/2010/wordprocessingInk" xmlns:wne="http://schemas.microsoft.com/office/word/2006/wordml" xmlns:wps="http://schemas.microsoft.com/office/word/2010/wordprocessingShape" mc:Ignorable="w14 w15 w16se wp14">
   <w:abstractNum w:abstractNumId="0" w15:restartNumberingAfterBreak="0">
     <w:nsid w:val="082656B4"/>
     <w:multiLevelType w:val="multilevel"/>
@@ -3886,7 +3965,7 @@
 </file>
 
 <file path=word/styles.xml><?xml version="1.0" encoding="utf-8"?>
-<w:styles xmlns:mc="http://schemas.openxmlformats.org/markup-compatibility/2006" xmlns:r="http://schemas.openxmlformats.org/officeDocument/2006/relationships" xmlns:w="http://schemas.openxmlformats.org/wordprocessingml/2006/main" xmlns:w14="http://schemas.microsoft.com/office/word/2010/wordml" xmlns:w15="http://schemas.microsoft.com/office/word/2012/wordml" xmlns:w16cex="http://schemas.microsoft.com/office/word/2018/wordml/cex" xmlns:w16cid="http://schemas.microsoft.com/office/word/2016/wordml/cid" xmlns:w16="http://schemas.microsoft.com/office/word/2018/wordml" xmlns:w16sdtdh="http://schemas.microsoft.com/office/word/2020/wordml/sdtdatahash" xmlns:w16se="http://schemas.microsoft.com/office/word/2015/wordml/symex" mc:Ignorable="w14 w15 w16se w16cid w16 w16cex w16sdtdh">
+<w:styles xmlns:mc="http://schemas.openxmlformats.org/markup-compatibility/2006" xmlns:r="http://schemas.openxmlformats.org/officeDocument/2006/relationships" xmlns:w="http://schemas.openxmlformats.org/wordprocessingml/2006/main" xmlns:w14="http://schemas.microsoft.com/office/word/2010/wordml" xmlns:w15="http://schemas.microsoft.com/office/word/2012/wordml" xmlns:w16se="http://schemas.microsoft.com/office/word/2015/wordml/symex" mc:Ignorable="w14 w15 w16se">
   <w:docDefaults>
     <w:rPrDefault>
       <w:rPr>
@@ -3902,7 +3981,7 @@
       </w:pPr>
     </w:pPrDefault>
   </w:docDefaults>
-  <w:latentStyles w:defLockedState="0" w:defUIPriority="99" w:defSemiHidden="0" w:defUnhideWhenUsed="0" w:defQFormat="0" w:count="376">
+  <w:latentStyles w:defLockedState="0" w:defUIPriority="99" w:defSemiHidden="0" w:defUnhideWhenUsed="0" w:defQFormat="0" w:count="371">
     <w:lsdException w:name="Normal" w:uiPriority="0" w:qFormat="1"/>
     <w:lsdException w:name="heading 1" w:uiPriority="9" w:qFormat="1"/>
     <w:lsdException w:name="heading 2" w:semiHidden="1" w:uiPriority="9" w:unhideWhenUsed="1" w:qFormat="1"/>
@@ -4274,11 +4353,6 @@
     <w:lsdException w:name="List Table 5 Dark Accent 6" w:uiPriority="50"/>
     <w:lsdException w:name="List Table 6 Colorful Accent 6" w:uiPriority="51"/>
     <w:lsdException w:name="List Table 7 Colorful Accent 6" w:uiPriority="52"/>
-    <w:lsdException w:name="Mention" w:semiHidden="1" w:unhideWhenUsed="1"/>
-    <w:lsdException w:name="Smart Hyperlink" w:semiHidden="1" w:unhideWhenUsed="1"/>
-    <w:lsdException w:name="Hashtag" w:semiHidden="1" w:unhideWhenUsed="1"/>
-    <w:lsdException w:name="Unresolved Mention" w:semiHidden="1" w:unhideWhenUsed="1"/>
-    <w:lsdException w:name="Smart Link" w:semiHidden="1" w:unhideWhenUsed="1"/>
   </w:latentStyles>
   <w:style w:type="paragraph" w:default="1" w:styleId="Normal">
     <w:name w:val="Normal"/>

</xml_diff>